<commit_message>
Use Word list bullets only where the CV master template needs them.
Also ignore local download/PEM artifacts, add deploy helper scripts, and clean up unused db.sql.

Co-authored-by: Cursor <cursoragent@cursor.com>
</commit_message>
<xml_diff>
--- a/docs/CV Master Template.docx
+++ b/docs/CV Master Template.docx
@@ -1,47 +1,26 @@
 
 <file path=word/document.xml><?xml version="1.0" encoding="utf-8"?>
-<w:document xmlns:wpc="http://schemas.microsoft.com/office/word/2010/wordprocessingCanvas" xmlns:cx="http://schemas.microsoft.com/office/drawing/2014/chartex" xmlns:cx1="http://schemas.microsoft.com/office/drawing/2015/9/8/chartex" xmlns:cx2="http://schemas.microsoft.com/office/drawing/2015/10/21/chartex" xmlns:cx3="http://schemas.microsoft.com/office/drawing/2016/5/9/chartex" xmlns:cx4="http://schemas.microsoft.com/office/drawing/2016/5/10/chartex" xmlns:cx5="http://schemas.microsoft.com/office/drawing/2016/5/11/chartex" xmlns:cx6="http://schemas.microsoft.com/office/drawing/2016/5/12/chartex" xmlns:cx7="http://schemas.microsoft.com/office/drawing/2016/5/13/chartex" xmlns:cx8="http://schemas.microsoft.com/office/drawing/2016/5/14/chartex" xmlns:mc="http://schemas.openxmlformats.org/markup-compatibility/2006" xmlns:o="urn:schemas-microsoft-com:office:office" xmlns:r="http://schemas.openxmlformats.org/officeDocument/2006/relationships" xmlns:m="http://schemas.openxmlformats.org/officeDocument/2006/math" xmlns:v="urn:schemas-microsoft-com:vml" xmlns:wp14="http://schemas.microsoft.com/office/word/2010/wordprocessingDrawing" xmlns:wp="http://schemas.openxmlformats.org/drawingml/2006/wordprocessingDrawing" xmlns:w="http://schemas.openxmlformats.org/wordprocessingml/2006/main" xmlns:w14="http://schemas.microsoft.com/office/word/2010/wordml" xmlns:w10="urn:schemas-microsoft-com:office:word" xmlns:w15="http://schemas.microsoft.com/office/word/2012/wordml" xmlns:wpg="http://schemas.microsoft.com/office/word/2010/wordprocessingGroup" xmlns:wpi="http://schemas.microsoft.com/office/word/2010/wordprocessingInk" xmlns:wne="http://schemas.microsoft.com/office/word/2006/wordml" xmlns:wps="http://schemas.microsoft.com/office/word/2010/wordprocessingShape" xmlns:wpsCustomData="http://www.wps.cn/officeDocument/2013/wpsCustomData" mc:Ignorable="w14 w15 wp14">
+<w:document xmlns:wpc="http://schemas.microsoft.com/office/word/2010/wordprocessingCanvas" xmlns:cx="http://schemas.microsoft.com/office/drawing/2014/chartex" xmlns:cx1="http://schemas.microsoft.com/office/drawing/2015/9/8/chartex" xmlns:cx2="http://schemas.microsoft.com/office/drawing/2015/10/21/chartex" xmlns:cx3="http://schemas.microsoft.com/office/drawing/2016/5/9/chartex" xmlns:cx4="http://schemas.microsoft.com/office/drawing/2016/5/10/chartex" xmlns:cx5="http://schemas.microsoft.com/office/drawing/2016/5/11/chartex" xmlns:cx6="http://schemas.microsoft.com/office/drawing/2016/5/12/chartex" xmlns:cx7="http://schemas.microsoft.com/office/drawing/2016/5/13/chartex" xmlns:cx8="http://schemas.microsoft.com/office/drawing/2016/5/14/chartex" xmlns:mc="http://schemas.openxmlformats.org/markup-compatibility/2006" xmlns:aink="http://schemas.microsoft.com/office/drawing/2016/ink" xmlns:am3d="http://schemas.microsoft.com/office/drawing/2017/model3d" xmlns:o="urn:schemas-microsoft-com:office:office" xmlns:oel="http://schemas.microsoft.com/office/2019/extlst" xmlns:r="http://schemas.openxmlformats.org/officeDocument/2006/relationships" xmlns:m="http://schemas.openxmlformats.org/officeDocument/2006/math" xmlns:v="urn:schemas-microsoft-com:vml" xmlns:wp14="http://schemas.microsoft.com/office/word/2010/wordprocessingDrawing" xmlns:wp="http://schemas.openxmlformats.org/drawingml/2006/wordprocessingDrawing" xmlns:w10="urn:schemas-microsoft-com:office:word" xmlns:w="http://schemas.openxmlformats.org/wordprocessingml/2006/main" xmlns:w14="http://schemas.microsoft.com/office/word/2010/wordml" xmlns:w15="http://schemas.microsoft.com/office/word/2012/wordml" xmlns:w16cei="http://schemas.microsoft.com/office/word/2026/wordml/cei" xmlns:w16cex="http://schemas.microsoft.com/office/word/2018/wordml/cex" xmlns:w16cid="http://schemas.microsoft.com/office/word/2016/wordml/cid" xmlns:w16="http://schemas.microsoft.com/office/word/2018/wordml" xmlns:w16du="http://schemas.microsoft.com/office/word/2023/wordml/word16du" xmlns:w16sdtdh="http://schemas.microsoft.com/office/word/2020/wordml/sdtdatahash" xmlns:w16sdtfl="http://schemas.microsoft.com/office/word/2024/wordml/sdtformatlock" xmlns:w16se="http://schemas.microsoft.com/office/word/2015/wordml/symex" xmlns:wpg="http://schemas.microsoft.com/office/word/2010/wordprocessingGroup" xmlns:wpi="http://schemas.microsoft.com/office/word/2010/wordprocessingInk" xmlns:wne="http://schemas.microsoft.com/office/word/2006/wordml" xmlns:wps="http://schemas.microsoft.com/office/word/2010/wordprocessingShape" mc:Ignorable="w14 w15 w16se w16cid w16 w16cex w16sdtdh w16sdtfl w16du wp14">
   <w:body>
     <w:tbl>
       <w:tblPr>
-        <w:tblStyle w:val="12"/>
         <w:tblpPr w:leftFromText="180" w:rightFromText="180" w:vertAnchor="text" w:horzAnchor="page" w:tblpX="6751" w:tblpY="2572"/>
         <w:tblOverlap w:val="never"/>
         <w:tblW w:w="0" w:type="auto"/>
-        <w:tblInd w:w="0" w:type="dxa"/>
         <w:tblBorders>
-          <w:top w:val="single" w:color="A6A6A6" w:sz="4" w:space="0"/>
-          <w:left w:val="single" w:color="A6A6A6" w:sz="4" w:space="0"/>
-          <w:bottom w:val="single" w:color="A6A6A6" w:sz="4" w:space="0"/>
-          <w:right w:val="single" w:color="A6A6A6" w:sz="4" w:space="0"/>
-          <w:insideH w:val="none" w:color="auto" w:sz="0" w:space="0"/>
-          <w:insideV w:val="none" w:color="auto" w:sz="0" w:space="0"/>
+          <w:top w:val="single" w:sz="4" w:space="0" w:color="A6A6A6"/>
+          <w:left w:val="single" w:sz="4" w:space="0" w:color="A6A6A6"/>
+          <w:bottom w:val="single" w:sz="4" w:space="0" w:color="A6A6A6"/>
+          <w:right w:val="single" w:sz="4" w:space="0" w:color="A6A6A6"/>
         </w:tblBorders>
         <w:shd w:val="clear" w:color="auto" w:fill="F2F2F2"/>
-        <w:tblLayout w:type="autofit"/>
-        <w:tblCellMar>
-          <w:top w:w="0" w:type="dxa"/>
-          <w:left w:w="108" w:type="dxa"/>
-          <w:bottom w:w="0" w:type="dxa"/>
-          <w:right w:w="108" w:type="dxa"/>
-        </w:tblCellMar>
+        <w:tblLook w:val="04A0" w:firstRow="1" w:lastRow="0" w:firstColumn="1" w:lastColumn="0" w:noHBand="0" w:noVBand="1"/>
       </w:tblPr>
       <w:tblGrid>
         <w:gridCol w:w="675"/>
         <w:gridCol w:w="4140"/>
       </w:tblGrid>
       <w:tr>
-        <w:tblPrEx>
-          <w:tblBorders>
-            <w:top w:val="single" w:color="A6A6A6" w:sz="4" w:space="0"/>
-            <w:left w:val="single" w:color="A6A6A6" w:sz="4" w:space="0"/>
-            <w:bottom w:val="single" w:color="A6A6A6" w:sz="4" w:space="0"/>
-            <w:right w:val="single" w:color="A6A6A6" w:sz="4" w:space="0"/>
-            <w:insideH w:val="none" w:color="auto" w:sz="0" w:space="0"/>
-            <w:insideV w:val="none" w:color="auto" w:sz="0" w:space="0"/>
-          </w:tblBorders>
-          <w:shd w:val="clear" w:color="auto" w:fill="F2F2F2"/>
-        </w:tblPrEx>
         <w:tc>
           <w:tcPr>
             <w:tcW w:w="675" w:type="dxa"/>
@@ -54,11 +33,12 @@
             <w:r>
               <w:rPr>
                 <w:iCs/>
+                <w:noProof/>
               </w:rPr>
               <mc:AlternateContent>
                 <mc:Choice Requires="wpg">
                   <w:drawing>
-                    <wp:anchor distT="0" distB="0" distL="114300" distR="114300" simplePos="0" relativeHeight="251666432" behindDoc="1" locked="0" layoutInCell="1" allowOverlap="1">
+                    <wp:anchor distT="0" distB="0" distL="114300" distR="114300" simplePos="0" relativeHeight="251666432" behindDoc="1" locked="0" layoutInCell="1" allowOverlap="1" wp14:anchorId="56D78A5E" wp14:editId="56D78A5F">
                       <wp:simplePos x="0" y="0"/>
                       <wp:positionH relativeFrom="column">
                         <wp:posOffset>11430</wp:posOffset>
@@ -69,7 +49,7 @@
                       <wp:extent cx="209550" cy="210185"/>
                       <wp:effectExtent l="0" t="0" r="0" b="0"/>
                       <wp:wrapTight wrapText="bothSides">
-                        <wp:wrapPolygon>
+                        <wp:wrapPolygon edited="0">
                           <wp:start x="1964" y="0"/>
                           <wp:lineTo x="0" y="1958"/>
                           <wp:lineTo x="0" y="19577"/>
@@ -123,7 +103,7 @@
                                 <pic:cNvPicPr/>
                               </pic:nvPicPr>
                               <pic:blipFill>
-                                <a:blip r:embed="rId8"/>
+                                <a:blip r:embed="rId12"/>
                                 <a:stretch>
                                   <a:fillRect/>
                                 </a:stretch>
@@ -144,7 +124,7 @@
                     </wp:anchor>
                   </w:drawing>
                 </mc:Choice>
-                <mc:Fallback>
+                <mc:Fallback xmlns:wpsCustomData="http://www.wps.cn/officeDocument/2013/wpsCustomData">
                   <w:pict>
                     <v:group id="_x0000_s1026" o:spid="_x0000_s1026" o:spt="203" style="position:absolute;left:0pt;margin-left:0.9pt;margin-top:0pt;height:16.55pt;width:16.5pt;mso-wrap-distance-left:9pt;mso-wrap-distance-right:9pt;z-index:-251650048;mso-width-relative:page;mso-height-relative:page;" coordsize="276225,244475" wrapcoords="1964 0 0 1958 0 19577 19636 19577 19636 0 1964 0" o:gfxdata="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">
                       <o:lock v:ext="edit" aspectratio="f"/>
@@ -157,7 +137,7 @@
                       <v:shape id="Graphic 24" o:spid="_x0000_s1026" o:spt="75" alt="Employee badge" type="#_x0000_t75" style="position:absolute;left:28924;top:95;height:228600;width:228600;" filled="f" o:preferrelative="t" stroked="f" coordsize="21600,21600" o:gfxdata="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">
                         <v:fill on="f" focussize="0,0"/>
                         <v:stroke on="f"/>
-                        <v:imagedata r:id="rId8" o:title=""/>
+                        <v:imagedata r:id="rId13" o:title=""/>
                         <o:lock v:ext="edit" aspectratio="f"/>
                       </v:shape>
                       <w10:wrap type="tight"/>
@@ -236,18 +216,11 @@
                 <w:sz w:val="20"/>
               </w:rPr>
               <w:tab/>
+              <w:t xml:space="preserve"> </w:t>
             </w:r>
             <w:r>
               <w:rPr>
                 <w:rFonts w:ascii="Arial" w:hAnsi="Arial" w:cs="Arial"/>
-                <w:iCs/>
-                <w:sz w:val="20"/>
-              </w:rPr>
-              <w:t xml:space="preserve"> </w:t>
-            </w:r>
-            <w:r>
-              <w:rPr>
-                <w:rFonts w:hint="default" w:ascii="Arial" w:hAnsi="Arial" w:cs="Arial"/>
                 <w:iCs/>
                 <w:sz w:val="20"/>
                 <w:lang w:val="en-ZA"/>
@@ -290,13 +263,6 @@
                 <w:sz w:val="20"/>
               </w:rPr>
               <w:tab/>
-            </w:r>
-            <w:r>
-              <w:rPr>
-                <w:rFonts w:ascii="Arial" w:hAnsi="Arial" w:cs="Arial"/>
-                <w:iCs/>
-                <w:sz w:val="20"/>
-              </w:rPr>
               <w:t>South African</w:t>
             </w:r>
           </w:p>
@@ -310,32 +276,15 @@
                 <w:rFonts w:ascii="Arial" w:hAnsi="Arial" w:cs="Arial"/>
                 <w:color w:val="007DA4"/>
                 <w:sz w:val="20"/>
-                <w:szCs w:val="20"/>
               </w:rPr>
             </w:pPr>
           </w:p>
         </w:tc>
       </w:tr>
+      <w:bookmarkStart w:id="0" w:name="_Hlk46831819"/>
       <w:tr>
-        <w:tblPrEx>
-          <w:tblBorders>
-            <w:top w:val="single" w:color="A6A6A6" w:sz="4" w:space="0"/>
-            <w:left w:val="single" w:color="A6A6A6" w:sz="4" w:space="0"/>
-            <w:bottom w:val="single" w:color="A6A6A6" w:sz="4" w:space="0"/>
-            <w:right w:val="single" w:color="A6A6A6" w:sz="4" w:space="0"/>
-            <w:insideH w:val="none" w:color="auto" w:sz="0" w:space="0"/>
-            <w:insideV w:val="none" w:color="auto" w:sz="0" w:space="0"/>
-          </w:tblBorders>
-          <w:shd w:val="clear" w:color="auto" w:fill="F2F2F2"/>
-          <w:tblCellMar>
-            <w:top w:w="0" w:type="dxa"/>
-            <w:left w:w="108" w:type="dxa"/>
-            <w:bottom w:w="0" w:type="dxa"/>
-            <w:right w:w="108" w:type="dxa"/>
-          </w:tblCellMar>
-        </w:tblPrEx>
         <w:trPr>
-          <w:trHeight w:val="329" w:hRule="atLeast"/>
+          <w:trHeight w:val="329"/>
         </w:trPr>
         <w:tc>
           <w:tcPr>
@@ -349,12 +298,14 @@
                 <w:szCs w:val="16"/>
               </w:rPr>
             </w:pPr>
-            <w:bookmarkStart w:id="0" w:name="_Hlk46831819"/>
             <w:r>
+              <w:rPr>
+                <w:noProof/>
+              </w:rPr>
               <mc:AlternateContent>
                 <mc:Choice Requires="wpg">
                   <w:drawing>
-                    <wp:anchor distT="0" distB="0" distL="114300" distR="114300" simplePos="0" relativeHeight="251661312" behindDoc="1" locked="0" layoutInCell="1" allowOverlap="1">
+                    <wp:anchor distT="0" distB="0" distL="114300" distR="114300" simplePos="0" relativeHeight="251661312" behindDoc="1" locked="0" layoutInCell="1" allowOverlap="1" wp14:anchorId="56D78A60" wp14:editId="56D78A61">
                       <wp:simplePos x="0" y="0"/>
                       <wp:positionH relativeFrom="column">
                         <wp:posOffset>62865</wp:posOffset>
@@ -365,7 +316,7 @@
                       <wp:extent cx="208915" cy="210185"/>
                       <wp:effectExtent l="0" t="0" r="635" b="0"/>
                       <wp:wrapTight wrapText="bothSides">
-                        <wp:wrapPolygon>
+                        <wp:wrapPolygon edited="0">
                           <wp:start x="1970" y="0"/>
                           <wp:lineTo x="0" y="1958"/>
                           <wp:lineTo x="0" y="19577"/>
@@ -419,7 +370,7 @@
                                 <pic:cNvPicPr/>
                               </pic:nvPicPr>
                               <pic:blipFill>
-                                <a:blip r:embed="rId9"/>
+                                <a:blip r:embed="rId14"/>
                                 <a:stretch>
                                   <a:fillRect/>
                                 </a:stretch>
@@ -440,7 +391,7 @@
                     </wp:anchor>
                   </w:drawing>
                 </mc:Choice>
-                <mc:Fallback>
+                <mc:Fallback xmlns:wpsCustomData="http://www.wps.cn/officeDocument/2013/wpsCustomData">
                   <w:pict>
                     <v:group id="_x0000_s1026" o:spid="_x0000_s1026" o:spt="203" style="position:absolute;left:0pt;margin-left:4.95pt;margin-top:0pt;height:16.55pt;width:16.45pt;mso-wrap-distance-left:9pt;mso-wrap-distance-right:9pt;z-index:-251655168;mso-width-relative:page;mso-height-relative:page;" coordorigin="0,95003" coordsize="276225,244475" wrapcoords="1970 0 0 1958 0 19577 19696 19577 19696 0 1970 0" o:gfxdata="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">
                       <o:lock v:ext="edit" aspectratio="f"/>
@@ -453,7 +404,7 @@
                       <v:shape id="Graphic 25" o:spid="_x0000_s1026" o:spt="75" alt="Checklist RTL" type="#_x0000_t75" style="position:absolute;left:35626;top:137061;height:160655;width:192405;" filled="f" o:preferrelative="t" stroked="f" coordsize="21600,21600" o:gfxdata="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">
                         <v:fill on="f" focussize="0,0"/>
                         <v:stroke on="f"/>
-                        <v:imagedata r:id="rId9" o:title=""/>
+                        <v:imagedata r:id="rId15" o:title=""/>
                         <o:lock v:ext="edit" aspectratio="f"/>
                       </v:shape>
                       <w10:wrap type="tight"/>
@@ -500,7 +451,7 @@
               </w:numPr>
               <w:ind w:left="344" w:hanging="283"/>
               <w:rPr>
-                <w:rFonts w:hint="default" w:ascii="Arial" w:hAnsi="Arial"/>
+                <w:rFonts w:ascii="Arial" w:hAnsi="Arial"/>
                 <w:sz w:val="20"/>
                 <w:lang w:val="en-ZA"/>
               </w:rPr>
@@ -508,11 +459,8 @@
           </w:p>
           <w:p>
             <w:pPr>
-              <w:numPr>
-                <w:numId w:val="0"/>
-              </w:numPr>
               <w:rPr>
-                <w:rFonts w:hint="default" w:ascii="Arial" w:hAnsi="Arial"/>
+                <w:rFonts w:ascii="Arial" w:hAnsi="Arial"/>
                 <w:sz w:val="20"/>
                 <w:lang w:val="en-ZA"/>
               </w:rPr>
@@ -529,23 +477,6 @@
         </w:tc>
       </w:tr>
       <w:tr>
-        <w:tblPrEx>
-          <w:tblBorders>
-            <w:top w:val="single" w:color="A6A6A6" w:sz="4" w:space="0"/>
-            <w:left w:val="single" w:color="A6A6A6" w:sz="4" w:space="0"/>
-            <w:bottom w:val="single" w:color="A6A6A6" w:sz="4" w:space="0"/>
-            <w:right w:val="single" w:color="A6A6A6" w:sz="4" w:space="0"/>
-            <w:insideH w:val="none" w:color="auto" w:sz="0" w:space="0"/>
-            <w:insideV w:val="none" w:color="auto" w:sz="0" w:space="0"/>
-          </w:tblBorders>
-          <w:shd w:val="clear" w:color="auto" w:fill="F2F2F2"/>
-          <w:tblCellMar>
-            <w:top w:w="0" w:type="dxa"/>
-            <w:left w:w="108" w:type="dxa"/>
-            <w:bottom w:w="0" w:type="dxa"/>
-            <w:right w:w="108" w:type="dxa"/>
-          </w:tblCellMar>
-        </w:tblPrEx>
         <w:tc>
           <w:tcPr>
             <w:tcW w:w="675" w:type="dxa"/>
@@ -556,10 +487,13 @@
               <w:spacing w:before="20" w:after="20"/>
             </w:pPr>
             <w:r>
+              <w:rPr>
+                <w:noProof/>
+              </w:rPr>
               <mc:AlternateContent>
                 <mc:Choice Requires="wpg">
                   <w:drawing>
-                    <wp:anchor distT="0" distB="0" distL="114300" distR="114300" simplePos="0" relativeHeight="251662336" behindDoc="0" locked="0" layoutInCell="1" allowOverlap="1">
+                    <wp:anchor distT="0" distB="0" distL="114300" distR="114300" simplePos="0" relativeHeight="251662336" behindDoc="0" locked="0" layoutInCell="1" allowOverlap="1" wp14:anchorId="56D78A62" wp14:editId="56D78A63">
                       <wp:simplePos x="0" y="0"/>
                       <wp:positionH relativeFrom="column">
                         <wp:posOffset>-4445</wp:posOffset>
@@ -615,7 +549,7 @@
                                 <pic:cNvPicPr/>
                               </pic:nvPicPr>
                               <pic:blipFill>
-                                <a:blip r:embed="rId10"/>
+                                <a:blip r:embed="rId16"/>
                                 <a:stretch>
                                   <a:fillRect/>
                                 </a:stretch>
@@ -636,7 +570,7 @@
                     </wp:anchor>
                   </w:drawing>
                 </mc:Choice>
-                <mc:Fallback>
+                <mc:Fallback xmlns:wpsCustomData="http://www.wps.cn/officeDocument/2013/wpsCustomData">
                   <w:pict>
                     <v:group id="_x0000_s1026" o:spid="_x0000_s1026" o:spt="203" style="position:absolute;left:0pt;margin-left:-0.35pt;margin-top:0.15pt;height:16.55pt;width:16.45pt;z-index:251662336;mso-width-relative:page;mso-height-relative:page;" coordsize="457200,457200" o:gfxdata="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">
                       <o:lock v:ext="edit" aspectratio="f"/>
@@ -649,7 +583,7 @@
                       <v:shape id="Graphic 20" o:spid="_x0000_s1026" o:spt="75" alt="Graduation cap" type="#_x0000_t75" style="position:absolute;left:45939;top:0;height:427382;width:384470;" filled="f" o:preferrelative="t" stroked="f" coordsize="21600,21600" o:gfxdata="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">
                         <v:fill on="f" focussize="0,0"/>
                         <v:stroke on="f"/>
-                        <v:imagedata r:id="rId10" o:title=""/>
+                        <v:imagedata r:id="rId17" o:title=""/>
                         <o:lock v:ext="edit" aspectratio="f"/>
                       </v:shape>
                     </v:group>
@@ -684,7 +618,7 @@
             </w:r>
             <w:r>
               <w:rPr>
-                <w:rFonts w:hint="default" w:ascii="Arial" w:hAnsi="Arial"/>
+                <w:rFonts w:ascii="Arial" w:hAnsi="Arial"/>
                 <w:sz w:val="20"/>
               </w:rPr>
               <w:t xml:space="preserve"> </w:t>
@@ -698,21 +632,16 @@
               </w:numPr>
               <w:ind w:left="319" w:hanging="284"/>
               <w:rPr>
-                <w:rFonts w:hint="default" w:ascii="Arial" w:hAnsi="Arial"/>
+                <w:rFonts w:ascii="Arial" w:hAnsi="Arial"/>
                 <w:sz w:val="20"/>
-                <w:szCs w:val="20"/>
               </w:rPr>
             </w:pPr>
           </w:p>
           <w:p>
             <w:pPr>
-              <w:numPr>
-                <w:numId w:val="0"/>
-              </w:numPr>
               <w:rPr>
-                <w:rFonts w:hint="default" w:ascii="Arial" w:hAnsi="Arial"/>
+                <w:rFonts w:ascii="Arial" w:hAnsi="Arial"/>
                 <w:sz w:val="20"/>
-                <w:szCs w:val="20"/>
               </w:rPr>
             </w:pPr>
           </w:p>
@@ -721,30 +650,12 @@
               <w:rPr>
                 <w:rFonts w:ascii="Arial" w:hAnsi="Arial" w:cs="Arial"/>
                 <w:sz w:val="20"/>
-                <w:szCs w:val="20"/>
               </w:rPr>
             </w:pPr>
           </w:p>
         </w:tc>
       </w:tr>
       <w:tr>
-        <w:tblPrEx>
-          <w:tblBorders>
-            <w:top w:val="single" w:color="A6A6A6" w:sz="4" w:space="0"/>
-            <w:left w:val="single" w:color="A6A6A6" w:sz="4" w:space="0"/>
-            <w:bottom w:val="single" w:color="A6A6A6" w:sz="4" w:space="0"/>
-            <w:right w:val="single" w:color="A6A6A6" w:sz="4" w:space="0"/>
-            <w:insideH w:val="none" w:color="auto" w:sz="0" w:space="0"/>
-            <w:insideV w:val="none" w:color="auto" w:sz="0" w:space="0"/>
-          </w:tblBorders>
-          <w:shd w:val="clear" w:color="auto" w:fill="F2F2F2"/>
-          <w:tblCellMar>
-            <w:top w:w="0" w:type="dxa"/>
-            <w:left w:w="108" w:type="dxa"/>
-            <w:bottom w:w="0" w:type="dxa"/>
-            <w:right w:w="108" w:type="dxa"/>
-          </w:tblCellMar>
-        </w:tblPrEx>
         <w:tc>
           <w:tcPr>
             <w:tcW w:w="675" w:type="dxa"/>
@@ -755,10 +666,13 @@
               <w:spacing w:before="20" w:after="20"/>
             </w:pPr>
             <w:r>
+              <w:rPr>
+                <w:noProof/>
+              </w:rPr>
               <mc:AlternateContent>
                 <mc:Choice Requires="wpg">
                   <w:drawing>
-                    <wp:anchor distT="0" distB="0" distL="114300" distR="114300" simplePos="0" relativeHeight="251663360" behindDoc="0" locked="0" layoutInCell="1" allowOverlap="1">
+                    <wp:anchor distT="0" distB="0" distL="114300" distR="114300" simplePos="0" relativeHeight="251663360" behindDoc="0" locked="0" layoutInCell="1" allowOverlap="1" wp14:anchorId="56D78A64" wp14:editId="56D78A65">
                       <wp:simplePos x="0" y="0"/>
                       <wp:positionH relativeFrom="column">
                         <wp:posOffset>38735</wp:posOffset>
@@ -1108,7 +1022,7 @@
                     </wp:anchor>
                   </w:drawing>
                 </mc:Choice>
-                <mc:Fallback>
+                <mc:Fallback xmlns:wpsCustomData="http://www.wps.cn/officeDocument/2013/wpsCustomData">
                   <w:pict>
                     <v:group id="_x0000_s1026" o:spid="_x0000_s1026" o:spt="203" style="position:absolute;left:0pt;margin-left:3.05pt;margin-top:0pt;height:16.55pt;width:16.45pt;z-index:251663360;mso-width-relative:page;mso-height-relative:page;" coordsize="276225,244475" o:gfxdata="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">
                       <o:lock v:ext="edit" aspectratio="f"/>
@@ -1174,13 +1088,13 @@
               </w:numPr>
               <w:ind w:left="319" w:hanging="284"/>
               <w:rPr>
-                <w:rFonts w:hint="default" w:ascii="Arial" w:hAnsi="Arial"/>
+                <w:rFonts w:ascii="Arial" w:hAnsi="Arial"/>
                 <w:sz w:val="20"/>
               </w:rPr>
             </w:pPr>
             <w:r>
               <w:rPr>
-                <w:rFonts w:hint="default" w:ascii="Arial" w:hAnsi="Arial"/>
+                <w:rFonts w:ascii="Arial" w:hAnsi="Arial"/>
                 <w:sz w:val="20"/>
               </w:rPr>
               <w:t>Microsoft Office</w:t>
@@ -1188,13 +1102,9 @@
           </w:p>
           <w:p>
             <w:pPr>
-              <w:numPr>
-                <w:ilvl w:val="0"/>
-                <w:numId w:val="1"/>
-              </w:numPr>
-              <w:ind w:left="319" w:hanging="284"/>
+              <w:ind w:left="319"/>
               <w:rPr>
-                <w:rFonts w:hint="default" w:ascii="Arial" w:hAnsi="Arial"/>
+                <w:rFonts w:ascii="Arial" w:hAnsi="Arial"/>
                 <w:sz w:val="20"/>
               </w:rPr>
             </w:pPr>
@@ -1204,7 +1114,6 @@
               <w:rPr>
                 <w:rFonts w:ascii="Arial" w:hAnsi="Arial" w:cs="Arial"/>
                 <w:sz w:val="20"/>
-                <w:szCs w:val="20"/>
               </w:rPr>
             </w:pPr>
           </w:p>
@@ -1213,30 +1122,12 @@
               <w:rPr>
                 <w:rFonts w:ascii="Arial" w:hAnsi="Arial" w:cs="Arial"/>
                 <w:sz w:val="20"/>
-                <w:szCs w:val="20"/>
               </w:rPr>
             </w:pPr>
           </w:p>
         </w:tc>
       </w:tr>
       <w:tr>
-        <w:tblPrEx>
-          <w:tblBorders>
-            <w:top w:val="single" w:color="A6A6A6" w:sz="4" w:space="0"/>
-            <w:left w:val="single" w:color="A6A6A6" w:sz="4" w:space="0"/>
-            <w:bottom w:val="single" w:color="A6A6A6" w:sz="4" w:space="0"/>
-            <w:right w:val="single" w:color="A6A6A6" w:sz="4" w:space="0"/>
-            <w:insideH w:val="none" w:color="auto" w:sz="0" w:space="0"/>
-            <w:insideV w:val="none" w:color="auto" w:sz="0" w:space="0"/>
-          </w:tblBorders>
-          <w:shd w:val="clear" w:color="auto" w:fill="F2F2F2"/>
-          <w:tblCellMar>
-            <w:top w:w="0" w:type="dxa"/>
-            <w:left w:w="108" w:type="dxa"/>
-            <w:bottom w:w="0" w:type="dxa"/>
-            <w:right w:w="108" w:type="dxa"/>
-          </w:tblCellMar>
-        </w:tblPrEx>
         <w:tc>
           <w:tcPr>
             <w:tcW w:w="675" w:type="dxa"/>
@@ -1247,10 +1138,13 @@
               <w:spacing w:before="20" w:after="20"/>
             </w:pPr>
             <w:r>
+              <w:rPr>
+                <w:noProof/>
+              </w:rPr>
               <mc:AlternateContent>
                 <mc:Choice Requires="wpg">
                   <w:drawing>
-                    <wp:anchor distT="0" distB="0" distL="114300" distR="114300" simplePos="0" relativeHeight="251664384" behindDoc="1" locked="0" layoutInCell="1" allowOverlap="1">
+                    <wp:anchor distT="0" distB="0" distL="114300" distR="114300" simplePos="0" relativeHeight="251664384" behindDoc="1" locked="0" layoutInCell="1" allowOverlap="1" wp14:anchorId="56D78A66" wp14:editId="56D78A67">
                       <wp:simplePos x="0" y="0"/>
                       <wp:positionH relativeFrom="column">
                         <wp:posOffset>18415</wp:posOffset>
@@ -1261,7 +1155,7 @@
                       <wp:extent cx="209550" cy="210185"/>
                       <wp:effectExtent l="0" t="0" r="0" b="0"/>
                       <wp:wrapTight wrapText="bothSides">
-                        <wp:wrapPolygon>
+                        <wp:wrapPolygon edited="0">
                           <wp:start x="1964" y="0"/>
                           <wp:lineTo x="0" y="1958"/>
                           <wp:lineTo x="0" y="19577"/>
@@ -1315,7 +1209,7 @@
                                 <pic:cNvPicPr/>
                               </pic:nvPicPr>
                               <pic:blipFill>
-                                <a:blip r:embed="rId11"/>
+                                <a:blip r:embed="rId18"/>
                                 <a:stretch>
                                   <a:fillRect/>
                                 </a:stretch>
@@ -1336,7 +1230,7 @@
                     </wp:anchor>
                   </w:drawing>
                 </mc:Choice>
-                <mc:Fallback>
+                <mc:Fallback xmlns:wpsCustomData="http://www.wps.cn/officeDocument/2013/wpsCustomData">
                   <w:pict>
                     <v:group id="_x0000_s1026" o:spid="_x0000_s1026" o:spt="203" style="position:absolute;left:0pt;margin-left:1.45pt;margin-top:0pt;height:16.55pt;width:16.5pt;mso-wrap-distance-left:9pt;mso-wrap-distance-right:9pt;z-index:-251652096;mso-width-relative:page;mso-height-relative:page;" coordsize="276225,244475" wrapcoords="1964 0 0 1958 0 19577 19636 19577 19636 0 1964 0" o:gfxdata="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">
                       <o:lock v:ext="edit" aspectratio="f"/>
@@ -1349,7 +1243,7 @@
                       <v:shape id="Graphic 22" o:spid="_x0000_s1026" o:spt="75" alt="Wreath" type="#_x0000_t75" style="position:absolute;left:13750;top:15875;height:228600;width:228600;" filled="f" o:preferrelative="t" stroked="f" coordsize="21600,21600" o:gfxdata="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">
                         <v:fill on="f" focussize="0,0"/>
                         <v:stroke on="f"/>
-                        <v:imagedata r:id="rId11" o:title=""/>
+                        <v:imagedata r:id="rId19" o:title=""/>
                         <o:lock v:ext="edit" aspectratio="f"/>
                       </v:shape>
                       <w10:wrap type="tight"/>
@@ -1393,7 +1287,7 @@
               </w:numPr>
               <w:ind w:left="319" w:hanging="284"/>
               <w:rPr>
-                <w:rFonts w:hint="default" w:ascii="Arial" w:hAnsi="Arial"/>
+                <w:rFonts w:ascii="Arial" w:hAnsi="Arial"/>
                 <w:sz w:val="20"/>
               </w:rPr>
             </w:pPr>
@@ -1403,7 +1297,6 @@
               <w:rPr>
                 <w:rFonts w:ascii="Arial" w:hAnsi="Arial" w:cs="Arial"/>
                 <w:sz w:val="20"/>
-                <w:szCs w:val="20"/>
               </w:rPr>
             </w:pPr>
           </w:p>
@@ -1412,32 +1305,14 @@
               <w:rPr>
                 <w:rFonts w:ascii="Arial" w:hAnsi="Arial" w:cs="Arial"/>
                 <w:sz w:val="20"/>
-                <w:szCs w:val="20"/>
               </w:rPr>
             </w:pPr>
           </w:p>
         </w:tc>
       </w:tr>
       <w:tr>
-        <w:tblPrEx>
-          <w:tblBorders>
-            <w:top w:val="single" w:color="A6A6A6" w:sz="4" w:space="0"/>
-            <w:left w:val="single" w:color="A6A6A6" w:sz="4" w:space="0"/>
-            <w:bottom w:val="single" w:color="A6A6A6" w:sz="4" w:space="0"/>
-            <w:right w:val="single" w:color="A6A6A6" w:sz="4" w:space="0"/>
-            <w:insideH w:val="none" w:color="auto" w:sz="0" w:space="0"/>
-            <w:insideV w:val="none" w:color="auto" w:sz="0" w:space="0"/>
-          </w:tblBorders>
-          <w:shd w:val="clear" w:color="auto" w:fill="F2F2F2"/>
-          <w:tblCellMar>
-            <w:top w:w="0" w:type="dxa"/>
-            <w:left w:w="108" w:type="dxa"/>
-            <w:bottom w:w="0" w:type="dxa"/>
-            <w:right w:w="108" w:type="dxa"/>
-          </w:tblCellMar>
-        </w:tblPrEx>
         <w:trPr>
-          <w:trHeight w:val="940" w:hRule="atLeast"/>
+          <w:trHeight w:val="940"/>
         </w:trPr>
         <w:tc>
           <w:tcPr>
@@ -1449,10 +1324,13 @@
               <w:spacing w:before="20" w:after="20"/>
             </w:pPr>
             <w:r>
+              <w:rPr>
+                <w:noProof/>
+              </w:rPr>
               <mc:AlternateContent>
                 <mc:Choice Requires="wpg">
                   <w:drawing>
-                    <wp:anchor distT="0" distB="0" distL="114300" distR="114300" simplePos="0" relativeHeight="251665408" behindDoc="0" locked="0" layoutInCell="1" allowOverlap="1">
+                    <wp:anchor distT="0" distB="0" distL="114300" distR="114300" simplePos="0" relativeHeight="251665408" behindDoc="0" locked="0" layoutInCell="1" allowOverlap="1" wp14:anchorId="56D78A68" wp14:editId="56D78A69">
                       <wp:simplePos x="0" y="0"/>
                       <wp:positionH relativeFrom="column">
                         <wp:posOffset>46355</wp:posOffset>
@@ -1510,7 +1388,7 @@
                                 </pic:cNvPicPr>
                               </pic:nvPicPr>
                               <pic:blipFill>
-                                <a:blip r:embed="rId12"/>
+                                <a:blip r:embed="rId20"/>
                                 <a:stretch>
                                   <a:fillRect/>
                                 </a:stretch>
@@ -1531,7 +1409,7 @@
                     </wp:anchor>
                   </w:drawing>
                 </mc:Choice>
-                <mc:Fallback>
+                <mc:Fallback xmlns:wpsCustomData="http://www.wps.cn/officeDocument/2013/wpsCustomData">
                   <w:pict>
                     <v:group id="_x0000_s1026" o:spid="_x0000_s1026" o:spt="203" style="position:absolute;left:0pt;margin-left:3.65pt;margin-top:-0.1pt;height:16.55pt;width:16.45pt;z-index:251665408;mso-width-relative:page;mso-height-relative:page;" coordorigin="11875,308759" coordsize="276225,252560" o:gfxdata="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">
                       <o:lock v:ext="edit" aspectratio="f"/>
@@ -1544,7 +1422,7 @@
                       <v:shape id="Graphic 40" o:spid="_x0000_s1026" o:spt="75" alt="Chat" type="#_x0000_t75" style="position:absolute;left:23786;top:332719;height:228600;width:228600;" filled="f" o:preferrelative="t" stroked="f" coordsize="21600,21600" o:gfxdata="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">
                         <v:fill on="f" focussize="0,0"/>
                         <v:stroke on="f"/>
-                        <v:imagedata r:id="rId12" o:title=""/>
+                        <v:imagedata r:id="rId21" o:title=""/>
                         <o:lock v:ext="edit" aspectratio="t"/>
                       </v:shape>
                     </v:group>
@@ -1601,7 +1479,7 @@
             <w:pPr>
               <w:ind w:firstLine="29"/>
               <w:rPr>
-                <w:rFonts w:hint="default" w:ascii="Arial" w:hAnsi="Arial"/>
+                <w:rFonts w:ascii="Arial" w:hAnsi="Arial"/>
                 <w:color w:val="000000"/>
                 <w:sz w:val="20"/>
                 <w:lang w:val="en-ZA"/>
@@ -1645,11 +1523,6 @@
           <w:color w:val="000000" w:themeColor="text1"/>
           <w:sz w:val="18"/>
           <w:szCs w:val="18"/>
-          <w14:textFill>
-            <w14:solidFill>
-              <w14:schemeClr w14:val="tx1"/>
-            </w14:solidFill>
-          </w14:textFill>
         </w:rPr>
       </w:pPr>
     </w:p>
@@ -1668,11 +1541,6 @@
           <w:color w:val="000000" w:themeColor="text1"/>
           <w:sz w:val="18"/>
           <w:szCs w:val="18"/>
-          <w14:textFill>
-            <w14:solidFill>
-              <w14:schemeClr w14:val="tx1"/>
-            </w14:solidFill>
-          </w14:textFill>
         </w:rPr>
       </w:pPr>
     </w:p>
@@ -1711,7 +1579,7 @@
       </w:pPr>
       <w:r>
         <w:rPr>
-          <w:rFonts w:hint="default" w:ascii="Arial" w:hAnsi="Arial"/>
+          <w:rFonts w:ascii="Arial" w:hAnsi="Arial"/>
           <w:b/>
           <w:bCs/>
           <w:iCs/>
@@ -1797,6 +1665,7 @@
           <w:b/>
           <w:bCs/>
           <w:iCs/>
+          <w:noProof/>
           <w:color w:val="C00000"/>
           <w:sz w:val="22"/>
           <w:szCs w:val="22"/>
@@ -1804,7 +1673,7 @@
         <mc:AlternateContent>
           <mc:Choice Requires="wps">
             <w:drawing>
-              <wp:anchor distT="0" distB="0" distL="114300" distR="114300" simplePos="0" relativeHeight="251659264" behindDoc="0" locked="0" layoutInCell="1" allowOverlap="1">
+              <wp:anchor distT="0" distB="0" distL="114300" distR="114300" simplePos="0" relativeHeight="251659264" behindDoc="0" locked="0" layoutInCell="1" allowOverlap="1" wp14:anchorId="56D78A6A" wp14:editId="56D78A6B">
                 <wp:simplePos x="0" y="0"/>
                 <wp:positionH relativeFrom="column">
                   <wp:posOffset>386715</wp:posOffset>
@@ -1870,8 +1739,11 @@
                               </w:rPr>
                             </w:pPr>
                             <w:r>
+                              <w:rPr>
+                                <w:noProof/>
+                              </w:rPr>
                               <w:drawing>
-                                <wp:inline distT="0" distB="0" distL="0" distR="0">
+                                <wp:inline distT="0" distB="0" distL="0" distR="0" wp14:anchorId="56D78A7A" wp14:editId="56D78A7B">
                                   <wp:extent cx="1098550" cy="1359535"/>
                                   <wp:effectExtent l="0" t="0" r="6350" b="0"/>
                                   <wp:docPr id="6" name="Picture 6" descr="Graphical user interface, application&#10;&#10;Description automatically generated"/>
@@ -1888,7 +1760,7 @@
                                           </pic:cNvPicPr>
                                         </pic:nvPicPr>
                                         <pic:blipFill>
-                                          <a:blip r:embed="rId13">
+                                          <a:blip r:embed="rId22">
                                             <a:extLst>
                                               <a:ext uri="{28A0092B-C50C-407E-A947-70E740481C1C}">
                                                 <a14:useLocalDpi xmlns:a14="http://schemas.microsoft.com/office/drawing/2010/main" val="0"/>
@@ -1931,7 +1803,7 @@
               </wp:anchor>
             </w:drawing>
           </mc:Choice>
-          <mc:Fallback>
+          <mc:Fallback xmlns:wpsCustomData="http://www.wps.cn/officeDocument/2013/wpsCustomData">
             <w:pict>
               <v:shape id="_x0000_s1026" o:spid="_x0000_s1026" o:spt="202" type="#_x0000_t202" style="position:absolute;left:0pt;margin-left:30.45pt;margin-top:10.25pt;height:113.5pt;width:103pt;z-index:251659264;mso-width-relative:page;mso-height-relative:page;" fillcolor="#FFFFFF [3201]" filled="t" stroked="f" coordsize="21600,21600" o:gfxdata="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">
                 <v:fill on="t" focussize="0,0"/>
@@ -1973,7 +1845,7 @@
                                     </pic:cNvPicPr>
                                   </pic:nvPicPr>
                                   <pic:blipFill>
-                                    <a:blip r:embed="rId13">
+                                    <a:blip r:embed="rId23">
                                       <a:extLst>
                                         <a:ext uri="{28A0092B-C50C-407E-A947-70E740481C1C}">
                                           <a14:useLocalDpi xmlns:a14="http://schemas.microsoft.com/office/drawing/2010/main" val="0"/>
@@ -2205,18 +2077,10 @@
           <w:b/>
           <w:bCs/>
           <w:iCs/>
-          <w:color w:val="558ED5" w:themeColor="text2" w:themeTint="99"/>
+          <w:color w:val="548DD4" w:themeColor="text2" w:themeTint="99"/>
           <w:sz w:val="26"/>
           <w:szCs w:val="26"/>
           <w:lang w:val="en-ZA" w:eastAsia="en-ZA"/>
-          <w14:textFill>
-            <w14:solidFill>
-              <w14:schemeClr w14:val="tx2">
-                <w14:lumMod w14:val="60000"/>
-                <w14:lumOff w14:val="40000"/>
-              </w14:schemeClr>
-            </w14:solidFill>
-          </w14:textFill>
         </w:rPr>
       </w:pPr>
       <w:r>
@@ -2239,7 +2103,7 @@
         <w:ind w:right="4678"/>
         <w:jc w:val="both"/>
         <w:rPr>
-          <w:rFonts w:hint="default" w:ascii="Arial" w:hAnsi="Arial"/>
+          <w:rFonts w:ascii="Arial" w:hAnsi="Arial"/>
           <w:sz w:val="20"/>
         </w:rPr>
       </w:pPr>
@@ -2250,7 +2114,7 @@
         <w:ind w:right="4678"/>
         <w:jc w:val="both"/>
         <w:rPr>
-          <w:rFonts w:hint="default" w:ascii="Arial" w:hAnsi="Arial"/>
+          <w:rFonts w:ascii="Arial" w:hAnsi="Arial"/>
           <w:sz w:val="20"/>
         </w:rPr>
       </w:pPr>
@@ -2261,7 +2125,7 @@
         <w:ind w:left="567" w:right="4678"/>
         <w:jc w:val="both"/>
         <w:rPr>
-          <w:rFonts w:hint="default" w:ascii="Arial" w:hAnsi="Arial"/>
+          <w:rFonts w:ascii="Arial" w:hAnsi="Arial"/>
           <w:sz w:val="20"/>
         </w:rPr>
       </w:pPr>
@@ -2272,7 +2136,7 @@
         <w:ind w:left="567" w:right="4678"/>
         <w:jc w:val="both"/>
         <w:rPr>
-          <w:rFonts w:hint="default" w:ascii="Arial" w:hAnsi="Arial"/>
+          <w:rFonts w:ascii="Arial" w:hAnsi="Arial"/>
           <w:sz w:val="20"/>
         </w:rPr>
       </w:pPr>
@@ -2283,7 +2147,7 @@
         <w:ind w:right="4678"/>
         <w:jc w:val="both"/>
         <w:rPr>
-          <w:rFonts w:hint="default" w:ascii="Arial" w:hAnsi="Arial"/>
+          <w:rFonts w:ascii="Arial" w:hAnsi="Arial"/>
           <w:sz w:val="20"/>
         </w:rPr>
       </w:pPr>
@@ -2383,7 +2247,7 @@
         <w:ind w:left="851" w:hanging="284"/>
         <w:jc w:val="both"/>
         <w:rPr>
-          <w:rFonts w:hint="default" w:ascii="Arial" w:hAnsi="Arial" w:cs="Arial"/>
+          <w:rFonts w:ascii="Arial" w:hAnsi="Arial" w:cs="Arial"/>
           <w:b/>
           <w:bCs/>
           <w:szCs w:val="24"/>
@@ -2410,7 +2274,7 @@
       </w:r>
       <w:r>
         <w:rPr>
-          <w:rFonts w:hint="default" w:ascii="Arial" w:hAnsi="Arial" w:cs="Arial"/>
+          <w:rFonts w:ascii="Arial" w:hAnsi="Arial" w:cs="Arial"/>
           <w:b/>
           <w:bCs/>
           <w:szCs w:val="24"/>
@@ -2426,9 +2290,8 @@
           <w:tab w:val="left" w:pos="2552"/>
         </w:tabs>
         <w:ind w:left="851" w:hanging="284"/>
-        <w:jc w:val="left"/>
-        <w:rPr>
-          <w:rFonts w:hint="default" w:ascii="Arial" w:hAnsi="Arial" w:cs="Arial"/>
+        <w:rPr>
+          <w:rFonts w:ascii="Arial" w:hAnsi="Arial" w:cs="Arial"/>
           <w:b/>
           <w:bCs/>
           <w:szCs w:val="24"/>
@@ -2442,8 +2305,9 @@
           <w:bCs/>
           <w:szCs w:val="24"/>
         </w:rPr>
-        <w:t xml:space="preserve">Position: </w:t>
+        <w:t>Position</w:t>
       </w:r>
+      <w:proofErr w:type="gramStart"/>
       <w:r>
         <w:rPr>
           <w:rFonts w:ascii="Arial" w:hAnsi="Arial" w:cs="Arial"/>
@@ -2451,17 +2315,37 @@
           <w:bCs/>
           <w:szCs w:val="24"/>
         </w:rPr>
+        <w:t xml:space="preserve">: </w:t>
+      </w:r>
+      <w:r>
+        <w:rPr>
+          <w:rFonts w:ascii="Arial" w:hAnsi="Arial" w:cs="Arial"/>
+          <w:b/>
+          <w:bCs/>
+          <w:szCs w:val="24"/>
+        </w:rPr>
         <w:tab/>
       </w:r>
       <w:r>
         <w:rPr>
-          <w:rFonts w:hint="default" w:ascii="Arial" w:hAnsi="Arial"/>
+          <w:rFonts w:ascii="Arial" w:hAnsi="Arial"/>
           <w:b/>
           <w:bCs/>
           <w:szCs w:val="24"/>
           <w:lang w:val="en-GB"/>
         </w:rPr>
-        <w:t>Job Title</w:t>
+        <w:t>Job</w:t>
+      </w:r>
+      <w:proofErr w:type="gramEnd"/>
+      <w:r>
+        <w:rPr>
+          <w:rFonts w:ascii="Arial" w:hAnsi="Arial"/>
+          <w:b/>
+          <w:bCs/>
+          <w:szCs w:val="24"/>
+          <w:lang w:val="en-GB"/>
+        </w:rPr>
+        <w:t xml:space="preserve"> Title</w:t>
       </w:r>
     </w:p>
     <w:p>
@@ -2473,7 +2357,7 @@
         <w:ind w:left="851" w:hanging="284"/>
         <w:jc w:val="both"/>
         <w:rPr>
-          <w:rFonts w:hint="default" w:ascii="Arial" w:hAnsi="Arial" w:cs="Arial"/>
+          <w:rFonts w:ascii="Arial" w:hAnsi="Arial" w:cs="Arial"/>
           <w:sz w:val="22"/>
           <w:szCs w:val="22"/>
           <w:lang w:val="en-ZA"/>
@@ -2485,7 +2369,16 @@
           <w:sz w:val="22"/>
           <w:szCs w:val="22"/>
         </w:rPr>
-        <w:t xml:space="preserve">Period: </w:t>
+        <w:t>Period</w:t>
+      </w:r>
+      <w:proofErr w:type="gramStart"/>
+      <w:r>
+        <w:rPr>
+          <w:rFonts w:ascii="Arial" w:hAnsi="Arial" w:cs="Arial"/>
+          <w:sz w:val="22"/>
+          <w:szCs w:val="22"/>
+        </w:rPr>
+        <w:t xml:space="preserve">: </w:t>
       </w:r>
       <w:r>
         <w:rPr>
@@ -2497,12 +2390,22 @@
       </w:r>
       <w:r>
         <w:rPr>
-          <w:rFonts w:hint="default" w:ascii="Arial" w:hAnsi="Arial"/>
+          <w:rFonts w:ascii="Arial" w:hAnsi="Arial"/>
           <w:sz w:val="22"/>
           <w:szCs w:val="22"/>
           <w:lang w:val="en-ZA"/>
         </w:rPr>
-        <w:t>April 2025 - Current</w:t>
+        <w:t>April</w:t>
+      </w:r>
+      <w:proofErr w:type="gramEnd"/>
+      <w:r>
+        <w:rPr>
+          <w:rFonts w:ascii="Arial" w:hAnsi="Arial"/>
+          <w:sz w:val="22"/>
+          <w:szCs w:val="22"/>
+          <w:lang w:val="en-ZA"/>
+        </w:rPr>
+        <w:t xml:space="preserve"> 2025 - Current</w:t>
       </w:r>
     </w:p>
     <w:p>
@@ -2556,16 +2459,12 @@
     </w:p>
     <w:p>
       <w:pPr>
-        <w:pStyle w:val="48"/>
-        <w:numPr>
-          <w:ilvl w:val="0"/>
-          <w:numId w:val="0"/>
-        </w:numPr>
+        <w:pStyle w:val="ListParagraph"/>
         <w:spacing w:line="312" w:lineRule="auto"/>
-        <w:ind w:right="284" w:rightChars="0"/>
+        <w:ind w:left="0" w:right="284"/>
         <w:jc w:val="both"/>
         <w:rPr>
-          <w:rFonts w:hint="default" w:ascii="Arial" w:hAnsi="Arial" w:eastAsia="Times New Roman"/>
+          <w:rFonts w:ascii="Arial" w:eastAsia="Times New Roman" w:hAnsi="Arial"/>
           <w:sz w:val="16"/>
           <w:szCs w:val="16"/>
           <w:lang w:val="en-US"/>
@@ -2574,7 +2473,7 @@
     </w:p>
     <w:p>
       <w:pPr>
-        <w:pStyle w:val="48"/>
+        <w:pStyle w:val="ListParagraph"/>
         <w:numPr>
           <w:ilvl w:val="0"/>
           <w:numId w:val="2"/>
@@ -2583,9 +2482,7 @@
         <w:ind w:left="1134" w:right="284" w:hanging="567"/>
         <w:jc w:val="both"/>
         <w:rPr>
-          <w:rFonts w:hint="default" w:ascii="Arial" w:hAnsi="Arial" w:eastAsia="Times New Roman"/>
-          <w:b w:val="0"/>
-          <w:bCs w:val="0"/>
+          <w:rFonts w:ascii="Arial" w:eastAsia="Times New Roman" w:hAnsi="Arial"/>
           <w:sz w:val="22"/>
           <w:szCs w:val="22"/>
           <w:lang w:val="en-US"/>
@@ -2594,9 +2491,9 @@
     </w:p>
     <w:p>
       <w:pPr>
-        <w:pStyle w:val="48"/>
+        <w:pStyle w:val="ListParagraph"/>
         <w:pBdr>
-          <w:bottom w:val="single" w:color="675DC6" w:sz="4" w:space="1"/>
+          <w:bottom w:val="single" w:sz="4" w:space="1" w:color="675DC6"/>
         </w:pBdr>
         <w:tabs>
           <w:tab w:val="left" w:pos="891"/>
@@ -2606,7 +2503,7 @@
         <w:ind w:left="567" w:right="284"/>
         <w:jc w:val="both"/>
         <w:rPr>
-          <w:rFonts w:hint="default" w:ascii="Arial" w:hAnsi="Arial" w:eastAsia="Times New Roman"/>
+          <w:rFonts w:ascii="Arial" w:eastAsia="Times New Roman" w:hAnsi="Arial"/>
           <w:sz w:val="22"/>
           <w:szCs w:val="22"/>
           <w:lang w:val="en-US"/>
@@ -2638,7 +2535,7 @@
         <w:ind w:left="851" w:hanging="284"/>
         <w:jc w:val="both"/>
         <w:rPr>
-          <w:rFonts w:hint="default" w:ascii="Arial" w:hAnsi="Arial" w:cs="Arial"/>
+          <w:rFonts w:ascii="Arial" w:hAnsi="Arial" w:cs="Arial"/>
           <w:b/>
           <w:bCs/>
           <w:szCs w:val="24"/>
@@ -2665,7 +2562,7 @@
       </w:r>
       <w:r>
         <w:rPr>
-          <w:rFonts w:hint="default" w:ascii="Arial" w:hAnsi="Arial"/>
+          <w:rFonts w:ascii="Arial" w:hAnsi="Arial"/>
           <w:b/>
           <w:bCs/>
           <w:szCs w:val="24"/>
@@ -2683,7 +2580,7 @@
         <w:ind w:left="851" w:hanging="284"/>
         <w:jc w:val="both"/>
         <w:rPr>
-          <w:rFonts w:hint="default" w:ascii="Arial" w:hAnsi="Arial" w:cs="Arial"/>
+          <w:rFonts w:ascii="Arial" w:hAnsi="Arial" w:cs="Arial"/>
           <w:b/>
           <w:bCs/>
           <w:szCs w:val="24"/>
@@ -2697,8 +2594,9 @@
           <w:bCs/>
           <w:szCs w:val="24"/>
         </w:rPr>
-        <w:t xml:space="preserve">Position: </w:t>
+        <w:t>Position</w:t>
       </w:r>
+      <w:proofErr w:type="gramStart"/>
       <w:r>
         <w:rPr>
           <w:rFonts w:ascii="Arial" w:hAnsi="Arial" w:cs="Arial"/>
@@ -2706,20 +2604,38 @@
           <w:bCs/>
           <w:szCs w:val="24"/>
         </w:rPr>
+        <w:t xml:space="preserve">: </w:t>
+      </w:r>
+      <w:r>
+        <w:rPr>
+          <w:rFonts w:ascii="Arial" w:hAnsi="Arial" w:cs="Arial"/>
+          <w:b/>
+          <w:bCs/>
+          <w:szCs w:val="24"/>
+        </w:rPr>
         <w:tab/>
       </w:r>
       <w:r>
         <w:rPr>
-          <w:rFonts w:hint="default" w:ascii="Arial" w:hAnsi="Arial" w:cs="Arial"/>
+          <w:rFonts w:ascii="Arial" w:hAnsi="Arial" w:cs="Arial"/>
           <w:b/>
           <w:bCs/>
           <w:szCs w:val="24"/>
           <w:lang w:val="en-ZA"/>
         </w:rPr>
-        <w:t>Job Title</w:t>
+        <w:t>Job</w:t>
       </w:r>
-      <w:bookmarkStart w:id="1" w:name="_GoBack"/>
-      <w:bookmarkEnd w:id="1"/>
+      <w:proofErr w:type="gramEnd"/>
+      <w:r>
+        <w:rPr>
+          <w:rFonts w:ascii="Arial" w:hAnsi="Arial" w:cs="Arial"/>
+          <w:b/>
+          <w:bCs/>
+          <w:szCs w:val="24"/>
+          <w:lang w:val="en-ZA"/>
+        </w:rPr>
+        <w:t xml:space="preserve"> Title</w:t>
+      </w:r>
     </w:p>
     <w:p>
       <w:pPr>
@@ -2730,7 +2646,7 @@
         <w:ind w:left="851" w:hanging="284"/>
         <w:jc w:val="both"/>
         <w:rPr>
-          <w:rFonts w:hint="default" w:ascii="Arial" w:hAnsi="Arial" w:cs="Arial"/>
+          <w:rFonts w:ascii="Arial" w:hAnsi="Arial" w:cs="Arial"/>
           <w:sz w:val="22"/>
           <w:szCs w:val="22"/>
           <w:lang w:val="en-ZA"/>
@@ -2742,7 +2658,16 @@
           <w:sz w:val="22"/>
           <w:szCs w:val="22"/>
         </w:rPr>
-        <w:t xml:space="preserve">Period: </w:t>
+        <w:t>Period</w:t>
+      </w:r>
+      <w:proofErr w:type="gramStart"/>
+      <w:r>
+        <w:rPr>
+          <w:rFonts w:ascii="Arial" w:hAnsi="Arial" w:cs="Arial"/>
+          <w:sz w:val="22"/>
+          <w:szCs w:val="22"/>
+        </w:rPr>
+        <w:t xml:space="preserve">: </w:t>
       </w:r>
       <w:r>
         <w:rPr>
@@ -2754,16 +2679,26 @@
       </w:r>
       <w:r>
         <w:rPr>
-          <w:rFonts w:hint="default" w:ascii="Arial" w:hAnsi="Arial" w:cs="Arial"/>
+          <w:rFonts w:ascii="Arial" w:hAnsi="Arial" w:cs="Arial"/>
           <w:sz w:val="22"/>
           <w:szCs w:val="22"/>
           <w:lang w:val="en-ZA"/>
         </w:rPr>
-        <w:t>April 2023 - March 2025</w:t>
+        <w:t>April</w:t>
+      </w:r>
+      <w:proofErr w:type="gramEnd"/>
+      <w:r>
+        <w:rPr>
+          <w:rFonts w:ascii="Arial" w:hAnsi="Arial" w:cs="Arial"/>
+          <w:sz w:val="22"/>
+          <w:szCs w:val="22"/>
+          <w:lang w:val="en-ZA"/>
+        </w:rPr>
+        <w:t xml:space="preserve"> 2023 - March 2025</w:t>
       </w:r>
       <w:r>
         <w:rPr>
-          <w:rFonts w:hint="default" w:ascii="Arial" w:hAnsi="Arial"/>
+          <w:rFonts w:ascii="Arial" w:hAnsi="Arial"/>
           <w:sz w:val="22"/>
           <w:szCs w:val="22"/>
           <w:lang w:val="en-ZA"/>
@@ -2837,7 +2772,7 @@
     </w:p>
     <w:p>
       <w:pPr>
-        <w:pStyle w:val="48"/>
+        <w:pStyle w:val="ListParagraph"/>
         <w:numPr>
           <w:ilvl w:val="0"/>
           <w:numId w:val="2"/>
@@ -2846,9 +2781,7 @@
         <w:ind w:left="1134" w:right="284" w:hanging="567"/>
         <w:jc w:val="both"/>
         <w:rPr>
-          <w:rFonts w:hint="default" w:ascii="Arial" w:hAnsi="Arial" w:eastAsia="Times New Roman"/>
-          <w:b w:val="0"/>
-          <w:bCs w:val="0"/>
+          <w:rFonts w:ascii="Arial" w:eastAsia="Times New Roman" w:hAnsi="Arial"/>
           <w:sz w:val="22"/>
           <w:szCs w:val="22"/>
           <w:lang w:val="en-US"/>
@@ -2857,17 +2790,12 @@
     </w:p>
     <w:p>
       <w:pPr>
-        <w:pStyle w:val="48"/>
-        <w:numPr>
-          <w:ilvl w:val="0"/>
-          <w:numId w:val="0"/>
-        </w:numPr>
+        <w:pStyle w:val="ListParagraph"/>
         <w:spacing w:line="312" w:lineRule="auto"/>
-        <w:ind w:right="284" w:rightChars="0"/>
-        <w:contextualSpacing/>
+        <w:ind w:left="0" w:right="284"/>
         <w:jc w:val="both"/>
         <w:rPr>
-          <w:rFonts w:hint="default" w:ascii="Arial" w:hAnsi="Arial" w:eastAsia="Times New Roman"/>
+          <w:rFonts w:ascii="Arial" w:eastAsia="Times New Roman" w:hAnsi="Arial"/>
           <w:sz w:val="22"/>
           <w:szCs w:val="22"/>
           <w:lang w:val="en-GB"/>
@@ -2875,87 +2803,69 @@
       </w:pPr>
     </w:p>
     <w:sectPr>
-      <w:headerReference r:id="rId5" w:type="first"/>
-      <w:headerReference r:id="rId3" w:type="default"/>
-      <w:footerReference r:id="rId6" w:type="default"/>
-      <w:headerReference r:id="rId4" w:type="even"/>
+      <w:headerReference w:type="even" r:id="rId24"/>
+      <w:headerReference w:type="default" r:id="rId25"/>
+      <w:footerReference w:type="default" r:id="rId26"/>
+      <w:headerReference w:type="first" r:id="rId27"/>
       <w:pgSz w:w="11907" w:h="16840"/>
       <w:pgMar w:top="1021" w:right="992" w:bottom="1021" w:left="851" w:header="794" w:footer="680" w:gutter="0"/>
       <w:paperSrc w:first="15" w:other="15"/>
-      <w:cols w:space="720" w:num="1"/>
-      <w:docGrid w:linePitch="360" w:charSpace="0"/>
+      <w:cols w:space="720"/>
+      <w:docGrid w:linePitch="360"/>
     </w:sectPr>
   </w:body>
 </w:document>
 </file>
 
+<file path=word/endnotes.xml><?xml version="1.0" encoding="utf-8"?>
+<w:endnotes xmlns:wpc="http://schemas.microsoft.com/office/word/2010/wordprocessingCanvas" xmlns:cx="http://schemas.microsoft.com/office/drawing/2014/chartex" xmlns:cx1="http://schemas.microsoft.com/office/drawing/2015/9/8/chartex" xmlns:cx2="http://schemas.microsoft.com/office/drawing/2015/10/21/chartex" xmlns:cx3="http://schemas.microsoft.com/office/drawing/2016/5/9/chartex" xmlns:cx4="http://schemas.microsoft.com/office/drawing/2016/5/10/chartex" xmlns:cx5="http://schemas.microsoft.com/office/drawing/2016/5/11/chartex" xmlns:cx6="http://schemas.microsoft.com/office/drawing/2016/5/12/chartex" xmlns:cx7="http://schemas.microsoft.com/office/drawing/2016/5/13/chartex" xmlns:cx8="http://schemas.microsoft.com/office/drawing/2016/5/14/chartex" xmlns:mc="http://schemas.openxmlformats.org/markup-compatibility/2006" xmlns:aink="http://schemas.microsoft.com/office/drawing/2016/ink" xmlns:am3d="http://schemas.microsoft.com/office/drawing/2017/model3d" xmlns:o="urn:schemas-microsoft-com:office:office" xmlns:oel="http://schemas.microsoft.com/office/2019/extlst" xmlns:r="http://schemas.openxmlformats.org/officeDocument/2006/relationships" xmlns:m="http://schemas.openxmlformats.org/officeDocument/2006/math" xmlns:v="urn:schemas-microsoft-com:vml" xmlns:wp14="http://schemas.microsoft.com/office/word/2010/wordprocessingDrawing" xmlns:wp="http://schemas.openxmlformats.org/drawingml/2006/wordprocessingDrawing" xmlns:w10="urn:schemas-microsoft-com:office:word" xmlns:w="http://schemas.openxmlformats.org/wordprocessingml/2006/main" xmlns:w14="http://schemas.microsoft.com/office/word/2010/wordml" xmlns:w15="http://schemas.microsoft.com/office/word/2012/wordml" xmlns:w16cei="http://schemas.microsoft.com/office/word/2026/wordml/cei" xmlns:w16cex="http://schemas.microsoft.com/office/word/2018/wordml/cex" xmlns:w16cid="http://schemas.microsoft.com/office/word/2016/wordml/cid" xmlns:w16="http://schemas.microsoft.com/office/word/2018/wordml" xmlns:w16du="http://schemas.microsoft.com/office/word/2023/wordml/word16du" xmlns:w16sdtdh="http://schemas.microsoft.com/office/word/2020/wordml/sdtdatahash" xmlns:w16sdtfl="http://schemas.microsoft.com/office/word/2024/wordml/sdtformatlock" xmlns:w16se="http://schemas.microsoft.com/office/word/2015/wordml/symex" xmlns:wpg="http://schemas.microsoft.com/office/word/2010/wordprocessingGroup" xmlns:wpi="http://schemas.microsoft.com/office/word/2010/wordprocessingInk" xmlns:wne="http://schemas.microsoft.com/office/word/2006/wordml" xmlns:wps="http://schemas.microsoft.com/office/word/2010/wordprocessingShape" mc:Ignorable="w14 w15 w16se w16cid w16 w16cex w16sdtdh w16sdtfl w16du wp14">
+  <w:endnote w:type="separator" w:id="-1">
+    <w:p>
+      <w:r>
+        <w:separator/>
+      </w:r>
+    </w:p>
+  </w:endnote>
+  <w:endnote w:type="continuationSeparator" w:id="0">
+    <w:p>
+      <w:r>
+        <w:continuationSeparator/>
+      </w:r>
+    </w:p>
+  </w:endnote>
+</w:endnotes>
+</file>
+
 <file path=word/footer1.xml><?xml version="1.0" encoding="utf-8"?>
-<w:ftr xmlns:wpc="http://schemas.microsoft.com/office/word/2010/wordprocessingCanvas" xmlns:mc="http://schemas.openxmlformats.org/markup-compatibility/2006" xmlns:o="urn:schemas-microsoft-com:office:office" xmlns:r="http://schemas.openxmlformats.org/officeDocument/2006/relationships" xmlns:m="http://schemas.openxmlformats.org/officeDocument/2006/math" xmlns:v="urn:schemas-microsoft-com:vml" xmlns:wp14="http://schemas.microsoft.com/office/word/2010/wordprocessingDrawing" xmlns:wp="http://schemas.openxmlformats.org/drawingml/2006/wordprocessingDrawing" xmlns:w10="urn:schemas-microsoft-com:office:word" xmlns:w="http://schemas.openxmlformats.org/wordprocessingml/2006/main" xmlns:w14="http://schemas.microsoft.com/office/word/2010/wordml" xmlns:w15="http://schemas.microsoft.com/office/word/2012/wordml" xmlns:wpg="http://schemas.microsoft.com/office/word/2010/wordprocessingGroup" xmlns:wpi="http://schemas.microsoft.com/office/word/2010/wordprocessingInk" xmlns:wne="http://schemas.microsoft.com/office/word/2006/wordml" xmlns:wps="http://schemas.microsoft.com/office/word/2010/wordprocessingShape" xmlns:wpsCustomData="http://www.wps.cn/officeDocument/2013/wpsCustomData" mc:Ignorable="w14 w15 wp14">
+<w:ftr xmlns:wpc="http://schemas.microsoft.com/office/word/2010/wordprocessingCanvas" xmlns:cx="http://schemas.microsoft.com/office/drawing/2014/chartex" xmlns:cx1="http://schemas.microsoft.com/office/drawing/2015/9/8/chartex" xmlns:cx2="http://schemas.microsoft.com/office/drawing/2015/10/21/chartex" xmlns:cx3="http://schemas.microsoft.com/office/drawing/2016/5/9/chartex" xmlns:cx4="http://schemas.microsoft.com/office/drawing/2016/5/10/chartex" xmlns:cx5="http://schemas.microsoft.com/office/drawing/2016/5/11/chartex" xmlns:cx6="http://schemas.microsoft.com/office/drawing/2016/5/12/chartex" xmlns:cx7="http://schemas.microsoft.com/office/drawing/2016/5/13/chartex" xmlns:cx8="http://schemas.microsoft.com/office/drawing/2016/5/14/chartex" xmlns:mc="http://schemas.openxmlformats.org/markup-compatibility/2006" xmlns:aink="http://schemas.microsoft.com/office/drawing/2016/ink" xmlns:am3d="http://schemas.microsoft.com/office/drawing/2017/model3d" xmlns:o="urn:schemas-microsoft-com:office:office" xmlns:oel="http://schemas.microsoft.com/office/2019/extlst" xmlns:r="http://schemas.openxmlformats.org/officeDocument/2006/relationships" xmlns:m="http://schemas.openxmlformats.org/officeDocument/2006/math" xmlns:v="urn:schemas-microsoft-com:vml" xmlns:wp14="http://schemas.microsoft.com/office/word/2010/wordprocessingDrawing" xmlns:wp="http://schemas.openxmlformats.org/drawingml/2006/wordprocessingDrawing" xmlns:w10="urn:schemas-microsoft-com:office:word" xmlns:w="http://schemas.openxmlformats.org/wordprocessingml/2006/main" xmlns:w14="http://schemas.microsoft.com/office/word/2010/wordml" xmlns:w15="http://schemas.microsoft.com/office/word/2012/wordml" xmlns:w16cei="http://schemas.microsoft.com/office/word/2026/wordml/cei" xmlns:w16cex="http://schemas.microsoft.com/office/word/2018/wordml/cex" xmlns:w16cid="http://schemas.microsoft.com/office/word/2016/wordml/cid" xmlns:w16="http://schemas.microsoft.com/office/word/2018/wordml" xmlns:w16du="http://schemas.microsoft.com/office/word/2023/wordml/word16du" xmlns:w16sdtdh="http://schemas.microsoft.com/office/word/2020/wordml/sdtdatahash" xmlns:w16sdtfl="http://schemas.microsoft.com/office/word/2024/wordml/sdtformatlock" xmlns:w16se="http://schemas.microsoft.com/office/word/2015/wordml/symex" xmlns:wpg="http://schemas.microsoft.com/office/word/2010/wordprocessingGroup" xmlns:wpi="http://schemas.microsoft.com/office/word/2010/wordprocessingInk" xmlns:wne="http://schemas.microsoft.com/office/word/2006/wordml" xmlns:wps="http://schemas.microsoft.com/office/word/2010/wordprocessingShape" mc:Ignorable="w14 w15 w16se w16cid w16 w16cex w16sdtdh w16sdtfl w16du wp14">
   <w:sdt>
     <w:sdtPr>
       <w:rPr>
         <w:rFonts w:ascii="Arial" w:hAnsi="Arial" w:cs="Arial"/>
         <w:i/>
         <w:iCs/>
-        <w:color w:val="808080" w:themeColor="text1" w:themeTint="80"/>
+        <w:color w:val="7F7F7F" w:themeColor="text1" w:themeTint="80"/>
         <w:sz w:val="18"/>
         <w:szCs w:val="18"/>
-        <w14:textFill>
-          <w14:solidFill>
-            <w14:schemeClr w14:val="tx1">
-              <w14:lumMod w14:val="50000"/>
-              <w14:lumOff w14:val="50000"/>
-            </w14:schemeClr>
-          </w14:solidFill>
-        </w14:textFill>
       </w:rPr>
       <w:id w:val="1095370526"/>
-      <w:docPartObj>
-        <w:docPartGallery w:val="autotext"/>
-      </w:docPartObj>
     </w:sdtPr>
-    <w:sdtEndPr>
-      <w:rPr>
-        <w:rFonts w:ascii="Arial" w:hAnsi="Arial" w:cs="Arial"/>
-        <w:i/>
-        <w:iCs/>
-        <w:color w:val="808080" w:themeColor="text1" w:themeTint="80"/>
-        <w:sz w:val="18"/>
-        <w:szCs w:val="18"/>
-        <w14:textFill>
-          <w14:solidFill>
-            <w14:schemeClr w14:val="tx1">
-              <w14:lumMod w14:val="50000"/>
-              <w14:lumOff w14:val="50000"/>
-            </w14:schemeClr>
-          </w14:solidFill>
-        </w14:textFill>
-      </w:rPr>
-    </w:sdtEndPr>
     <w:sdtContent>
       <w:p>
         <w:pPr>
-          <w:pStyle w:val="20"/>
+          <w:pStyle w:val="Footer"/>
           <w:tabs>
+            <w:tab w:val="clear" w:pos="8640"/>
             <w:tab w:val="right" w:pos="8647"/>
-            <w:tab w:val="clear" w:pos="8640"/>
           </w:tabs>
           <w:ind w:left="567" w:right="112"/>
           <w:rPr>
             <w:rFonts w:ascii="Arial" w:hAnsi="Arial" w:cs="Arial"/>
             <w:i/>
             <w:iCs/>
-            <w:color w:val="808080" w:themeColor="text1" w:themeTint="80"/>
+            <w:color w:val="7F7F7F" w:themeColor="text1" w:themeTint="80"/>
             <w:sz w:val="18"/>
             <w:szCs w:val="18"/>
-            <w14:textFill>
-              <w14:solidFill>
-                <w14:schemeClr w14:val="tx1">
-                  <w14:lumMod w14:val="50000"/>
-                  <w14:lumOff w14:val="50000"/>
-                </w14:schemeClr>
-              </w14:solidFill>
-            </w14:textFill>
           </w:rPr>
         </w:pPr>
         <w:r>
@@ -2963,134 +2873,110 @@
             <w:rFonts w:ascii="Arial" w:hAnsi="Arial" w:cs="Arial"/>
             <w:i/>
             <w:iCs/>
-            <w:color w:val="808080" w:themeColor="text1" w:themeTint="80"/>
+            <w:color w:val="7F7F7F" w:themeColor="text1" w:themeTint="80"/>
             <w:sz w:val="18"/>
             <w:szCs w:val="18"/>
-            <w14:textFill>
-              <w14:solidFill>
-                <w14:schemeClr w14:val="tx1">
-                  <w14:lumMod w14:val="50000"/>
-                  <w14:lumOff w14:val="50000"/>
-                </w14:schemeClr>
-              </w14:solidFill>
-            </w14:textFill>
           </w:rPr>
           <w:t>Private and Confidential</w:t>
         </w:r>
       </w:p>
       <w:p>
         <w:pPr>
-          <w:pStyle w:val="20"/>
+          <w:pStyle w:val="Footer"/>
           <w:tabs>
+            <w:tab w:val="clear" w:pos="8640"/>
             <w:tab w:val="right" w:pos="8647"/>
-            <w:tab w:val="clear" w:pos="8640"/>
           </w:tabs>
-          <w:ind w:right="112" w:firstLine="540" w:firstLineChars="300"/>
+          <w:ind w:right="112" w:firstLineChars="300" w:firstLine="540"/>
           <w:rPr>
-            <w:rFonts w:hint="default" w:ascii="Arial" w:hAnsi="Arial"/>
+            <w:rFonts w:ascii="Arial" w:hAnsi="Arial"/>
             <w:i/>
             <w:iCs/>
-            <w:color w:val="808080" w:themeColor="text1" w:themeTint="80"/>
+            <w:color w:val="7F7F7F" w:themeColor="text1" w:themeTint="80"/>
             <w:sz w:val="18"/>
             <w:szCs w:val="18"/>
-            <w14:textFill>
-              <w14:solidFill>
-                <w14:schemeClr w14:val="tx1">
-                  <w14:lumMod w14:val="50000"/>
-                  <w14:lumOff w14:val="50000"/>
-                </w14:schemeClr>
-              </w14:solidFill>
-            </w14:textFill>
           </w:rPr>
         </w:pPr>
         <w:r>
           <w:rPr>
-            <w:rFonts w:hint="default" w:ascii="Arial" w:hAnsi="Arial"/>
+            <w:rFonts w:ascii="Arial" w:hAnsi="Arial"/>
             <w:i/>
             <w:iCs/>
-            <w:color w:val="808080" w:themeColor="text1" w:themeTint="80"/>
+            <w:color w:val="7F7F7F" w:themeColor="text1" w:themeTint="80"/>
             <w:sz w:val="18"/>
             <w:szCs w:val="18"/>
-            <w14:textFill>
-              <w14:solidFill>
-                <w14:schemeClr w14:val="tx1">
-                  <w14:lumMod w14:val="50000"/>
-                  <w14:lumOff w14:val="50000"/>
-                </w14:schemeClr>
-              </w14:solidFill>
-            </w14:textFill>
           </w:rPr>
-          <w:t xml:space="preserve">The client accepts SoluGrowth Recruitment Solution’s terms &amp; conditions upon acceptance of the candidate profile(s). </w:t>
+          <w:t xml:space="preserve">The client accepts </w:t>
+        </w:r>
+        <w:proofErr w:type="spellStart"/>
+        <w:r>
+          <w:rPr>
+            <w:rFonts w:ascii="Arial" w:hAnsi="Arial"/>
+            <w:i/>
+            <w:iCs/>
+            <w:color w:val="7F7F7F" w:themeColor="text1" w:themeTint="80"/>
+            <w:sz w:val="18"/>
+            <w:szCs w:val="18"/>
+          </w:rPr>
+          <w:t>SoluGrowth</w:t>
+        </w:r>
+        <w:proofErr w:type="spellEnd"/>
+        <w:r>
+          <w:rPr>
+            <w:rFonts w:ascii="Arial" w:hAnsi="Arial"/>
+            <w:i/>
+            <w:iCs/>
+            <w:color w:val="7F7F7F" w:themeColor="text1" w:themeTint="80"/>
+            <w:sz w:val="18"/>
+            <w:szCs w:val="18"/>
+          </w:rPr>
+          <w:t xml:space="preserve"> Recruitment Solution’s terms &amp; conditions upon acceptance of the candidate profile(s). </w:t>
         </w:r>
       </w:p>
       <w:p>
         <w:pPr>
-          <w:pStyle w:val="20"/>
+          <w:pStyle w:val="Footer"/>
           <w:tabs>
+            <w:tab w:val="clear" w:pos="8640"/>
             <w:tab w:val="right" w:pos="8647"/>
-            <w:tab w:val="clear" w:pos="8640"/>
           </w:tabs>
-          <w:ind w:right="112" w:firstLine="540" w:firstLineChars="300"/>
+          <w:ind w:right="112" w:firstLineChars="300" w:firstLine="540"/>
           <w:rPr>
             <w:rFonts w:ascii="Arial" w:hAnsi="Arial" w:cs="Arial"/>
             <w:i/>
             <w:iCs/>
-            <w:color w:val="808080" w:themeColor="text1" w:themeTint="80"/>
+            <w:color w:val="7F7F7F" w:themeColor="text1" w:themeTint="80"/>
             <w:sz w:val="18"/>
             <w:szCs w:val="18"/>
-            <w14:textFill>
-              <w14:solidFill>
-                <w14:schemeClr w14:val="tx1">
-                  <w14:lumMod w14:val="50000"/>
-                  <w14:lumOff w14:val="50000"/>
-                </w14:schemeClr>
-              </w14:solidFill>
-            </w14:textFill>
           </w:rPr>
         </w:pPr>
         <w:r>
           <w:rPr>
-            <w:rFonts w:hint="default" w:ascii="Arial" w:hAnsi="Arial"/>
+            <w:rFonts w:ascii="Arial" w:hAnsi="Arial"/>
             <w:i/>
             <w:iCs/>
-            <w:color w:val="808080" w:themeColor="text1" w:themeTint="80"/>
+            <w:color w:val="7F7F7F" w:themeColor="text1" w:themeTint="80"/>
             <w:sz w:val="18"/>
             <w:szCs w:val="18"/>
-            <w14:textFill>
-              <w14:solidFill>
-                <w14:schemeClr w14:val="tx1">
-                  <w14:lumMod w14:val="50000"/>
-                  <w14:lumOff w14:val="50000"/>
-                </w14:schemeClr>
-              </w14:solidFill>
-            </w14:textFill>
           </w:rPr>
           <w:t>Placement fees will be applicable for a period of 12 months after introducing the candidate to the client.</w:t>
         </w:r>
       </w:p>
       <w:p>
         <w:pPr>
-          <w:pStyle w:val="20"/>
+          <w:pStyle w:val="Footer"/>
           <w:tabs>
+            <w:tab w:val="clear" w:pos="8640"/>
             <w:tab w:val="right" w:pos="8647"/>
-            <w:tab w:val="clear" w:pos="8640"/>
           </w:tabs>
           <w:ind w:left="567" w:right="112"/>
           <w:rPr>
             <w:rFonts w:ascii="Arial" w:hAnsi="Arial" w:cs="Arial"/>
             <w:i/>
             <w:iCs/>
-            <w:color w:val="808080" w:themeColor="text1" w:themeTint="80"/>
+            <w:color w:val="7F7F7F" w:themeColor="text1" w:themeTint="80"/>
             <w:sz w:val="18"/>
             <w:szCs w:val="18"/>
-            <w14:textFill>
-              <w14:solidFill>
-                <w14:schemeClr w14:val="tx1">
-                  <w14:lumMod w14:val="50000"/>
-                  <w14:lumOff w14:val="50000"/>
-                </w14:schemeClr>
-              </w14:solidFill>
-            </w14:textFill>
           </w:rPr>
         </w:pPr>
         <w:r>
@@ -3098,17 +2984,9 @@
             <w:rFonts w:ascii="Arial" w:hAnsi="Arial" w:cs="Arial"/>
             <w:i/>
             <w:iCs/>
-            <w:color w:val="808080" w:themeColor="text1" w:themeTint="80"/>
+            <w:color w:val="7F7F7F" w:themeColor="text1" w:themeTint="80"/>
             <w:sz w:val="18"/>
             <w:szCs w:val="18"/>
-            <w14:textFill>
-              <w14:solidFill>
-                <w14:schemeClr w14:val="tx1">
-                  <w14:lumMod w14:val="50000"/>
-                  <w14:lumOff w14:val="50000"/>
-                </w14:schemeClr>
-              </w14:solidFill>
-            </w14:textFill>
           </w:rPr>
           <w:tab/>
         </w:r>
@@ -3117,17 +2995,9 @@
             <w:rFonts w:ascii="Arial" w:hAnsi="Arial" w:cs="Arial"/>
             <w:i/>
             <w:iCs/>
-            <w:color w:val="808080" w:themeColor="text1" w:themeTint="80"/>
+            <w:color w:val="7F7F7F" w:themeColor="text1" w:themeTint="80"/>
             <w:sz w:val="18"/>
             <w:szCs w:val="18"/>
-            <w14:textFill>
-              <w14:solidFill>
-                <w14:schemeClr w14:val="tx1">
-                  <w14:lumMod w14:val="50000"/>
-                  <w14:lumOff w14:val="50000"/>
-                </w14:schemeClr>
-              </w14:solidFill>
-            </w14:textFill>
           </w:rPr>
           <w:tab/>
         </w:r>
@@ -3136,37 +3006,11 @@
             <w:rFonts w:ascii="Arial" w:hAnsi="Arial" w:cs="Arial"/>
             <w:i/>
             <w:iCs/>
-            <w:color w:val="808080" w:themeColor="text1" w:themeTint="80"/>
+            <w:color w:val="7F7F7F" w:themeColor="text1" w:themeTint="80"/>
             <w:sz w:val="18"/>
             <w:szCs w:val="18"/>
-            <w14:textFill>
-              <w14:solidFill>
-                <w14:schemeClr w14:val="tx1">
-                  <w14:lumMod w14:val="50000"/>
-                  <w14:lumOff w14:val="50000"/>
-                </w14:schemeClr>
-              </w14:solidFill>
-            </w14:textFill>
           </w:rPr>
           <w:tab/>
-        </w:r>
-        <w:r>
-          <w:rPr>
-            <w:rFonts w:ascii="Arial" w:hAnsi="Arial" w:cs="Arial"/>
-            <w:i/>
-            <w:iCs/>
-            <w:color w:val="808080" w:themeColor="text1" w:themeTint="80"/>
-            <w:sz w:val="18"/>
-            <w:szCs w:val="18"/>
-            <w14:textFill>
-              <w14:solidFill>
-                <w14:schemeClr w14:val="tx1">
-                  <w14:lumMod w14:val="50000"/>
-                  <w14:lumOff w14:val="50000"/>
-                </w14:schemeClr>
-              </w14:solidFill>
-            </w14:textFill>
-          </w:rPr>
           <w:t xml:space="preserve">   Page </w:t>
         </w:r>
         <w:r>
@@ -3174,17 +3018,9 @@
             <w:rFonts w:ascii="Arial" w:hAnsi="Arial" w:cs="Arial"/>
             <w:i/>
             <w:iCs/>
-            <w:color w:val="808080" w:themeColor="text1" w:themeTint="80"/>
+            <w:color w:val="7F7F7F" w:themeColor="text1" w:themeTint="80"/>
             <w:sz w:val="18"/>
             <w:szCs w:val="18"/>
-            <w14:textFill>
-              <w14:solidFill>
-                <w14:schemeClr w14:val="tx1">
-                  <w14:lumMod w14:val="50000"/>
-                  <w14:lumOff w14:val="50000"/>
-                </w14:schemeClr>
-              </w14:solidFill>
-            </w14:textFill>
           </w:rPr>
           <w:fldChar w:fldCharType="begin"/>
         </w:r>
@@ -3193,17 +3029,9 @@
             <w:rFonts w:ascii="Arial" w:hAnsi="Arial" w:cs="Arial"/>
             <w:i/>
             <w:iCs/>
-            <w:color w:val="808080" w:themeColor="text1" w:themeTint="80"/>
+            <w:color w:val="7F7F7F" w:themeColor="text1" w:themeTint="80"/>
             <w:sz w:val="18"/>
             <w:szCs w:val="18"/>
-            <w14:textFill>
-              <w14:solidFill>
-                <w14:schemeClr w14:val="tx1">
-                  <w14:lumMod w14:val="50000"/>
-                  <w14:lumOff w14:val="50000"/>
-                </w14:schemeClr>
-              </w14:solidFill>
-            </w14:textFill>
           </w:rPr>
           <w:instrText xml:space="preserve"> PAGE  \* Arabic  \* MERGEFORMAT </w:instrText>
         </w:r>
@@ -3212,17 +3040,9 @@
             <w:rFonts w:ascii="Arial" w:hAnsi="Arial" w:cs="Arial"/>
             <w:i/>
             <w:iCs/>
-            <w:color w:val="808080" w:themeColor="text1" w:themeTint="80"/>
+            <w:color w:val="7F7F7F" w:themeColor="text1" w:themeTint="80"/>
             <w:sz w:val="18"/>
             <w:szCs w:val="18"/>
-            <w14:textFill>
-              <w14:solidFill>
-                <w14:schemeClr w14:val="tx1">
-                  <w14:lumMod w14:val="50000"/>
-                  <w14:lumOff w14:val="50000"/>
-                </w14:schemeClr>
-              </w14:solidFill>
-            </w14:textFill>
           </w:rPr>
           <w:fldChar w:fldCharType="separate"/>
         </w:r>
@@ -3231,17 +3051,9 @@
             <w:rFonts w:ascii="Arial" w:hAnsi="Arial" w:cs="Arial"/>
             <w:i/>
             <w:iCs/>
-            <w:color w:val="808080" w:themeColor="text1" w:themeTint="80"/>
+            <w:color w:val="7F7F7F" w:themeColor="text1" w:themeTint="80"/>
             <w:sz w:val="18"/>
             <w:szCs w:val="18"/>
-            <w14:textFill>
-              <w14:solidFill>
-                <w14:schemeClr w14:val="tx1">
-                  <w14:lumMod w14:val="50000"/>
-                  <w14:lumOff w14:val="50000"/>
-                </w14:schemeClr>
-              </w14:solidFill>
-            </w14:textFill>
           </w:rPr>
           <w:t>1</w:t>
         </w:r>
@@ -3250,17 +3062,9 @@
             <w:rFonts w:ascii="Arial" w:hAnsi="Arial" w:cs="Arial"/>
             <w:i/>
             <w:iCs/>
-            <w:color w:val="808080" w:themeColor="text1" w:themeTint="80"/>
+            <w:color w:val="7F7F7F" w:themeColor="text1" w:themeTint="80"/>
             <w:sz w:val="18"/>
             <w:szCs w:val="18"/>
-            <w14:textFill>
-              <w14:solidFill>
-                <w14:schemeClr w14:val="tx1">
-                  <w14:lumMod w14:val="50000"/>
-                  <w14:lumOff w14:val="50000"/>
-                </w14:schemeClr>
-              </w14:solidFill>
-            </w14:textFill>
           </w:rPr>
           <w:fldChar w:fldCharType="end"/>
         </w:r>
@@ -3269,17 +3073,9 @@
             <w:rFonts w:ascii="Arial" w:hAnsi="Arial" w:cs="Arial"/>
             <w:i/>
             <w:iCs/>
-            <w:color w:val="808080" w:themeColor="text1" w:themeTint="80"/>
+            <w:color w:val="7F7F7F" w:themeColor="text1" w:themeTint="80"/>
             <w:sz w:val="18"/>
             <w:szCs w:val="18"/>
-            <w14:textFill>
-              <w14:solidFill>
-                <w14:schemeClr w14:val="tx1">
-                  <w14:lumMod w14:val="50000"/>
-                  <w14:lumOff w14:val="50000"/>
-                </w14:schemeClr>
-              </w14:solidFill>
-            </w14:textFill>
           </w:rPr>
           <w:t xml:space="preserve"> of </w:t>
         </w:r>
@@ -3288,17 +3084,9 @@
             <w:rFonts w:ascii="Arial" w:hAnsi="Arial" w:cs="Arial"/>
             <w:i/>
             <w:iCs/>
-            <w:color w:val="808080" w:themeColor="text1" w:themeTint="80"/>
+            <w:color w:val="7F7F7F" w:themeColor="text1" w:themeTint="80"/>
             <w:sz w:val="18"/>
             <w:szCs w:val="18"/>
-            <w14:textFill>
-              <w14:solidFill>
-                <w14:schemeClr w14:val="tx1">
-                  <w14:lumMod w14:val="50000"/>
-                  <w14:lumOff w14:val="50000"/>
-                </w14:schemeClr>
-              </w14:solidFill>
-            </w14:textFill>
           </w:rPr>
           <w:fldChar w:fldCharType="begin"/>
         </w:r>
@@ -3307,17 +3095,9 @@
             <w:rFonts w:ascii="Arial" w:hAnsi="Arial" w:cs="Arial"/>
             <w:i/>
             <w:iCs/>
-            <w:color w:val="808080" w:themeColor="text1" w:themeTint="80"/>
+            <w:color w:val="7F7F7F" w:themeColor="text1" w:themeTint="80"/>
             <w:sz w:val="18"/>
             <w:szCs w:val="18"/>
-            <w14:textFill>
-              <w14:solidFill>
-                <w14:schemeClr w14:val="tx1">
-                  <w14:lumMod w14:val="50000"/>
-                  <w14:lumOff w14:val="50000"/>
-                </w14:schemeClr>
-              </w14:solidFill>
-            </w14:textFill>
           </w:rPr>
           <w:instrText xml:space="preserve"> NUMPAGES  \* Arabic  \* MERGEFORMAT </w:instrText>
         </w:r>
@@ -3326,17 +3106,9 @@
             <w:rFonts w:ascii="Arial" w:hAnsi="Arial" w:cs="Arial"/>
             <w:i/>
             <w:iCs/>
-            <w:color w:val="808080" w:themeColor="text1" w:themeTint="80"/>
+            <w:color w:val="7F7F7F" w:themeColor="text1" w:themeTint="80"/>
             <w:sz w:val="18"/>
             <w:szCs w:val="18"/>
-            <w14:textFill>
-              <w14:solidFill>
-                <w14:schemeClr w14:val="tx1">
-                  <w14:lumMod w14:val="50000"/>
-                  <w14:lumOff w14:val="50000"/>
-                </w14:schemeClr>
-              </w14:solidFill>
-            </w14:textFill>
           </w:rPr>
           <w:fldChar w:fldCharType="separate"/>
         </w:r>
@@ -3345,17 +3117,9 @@
             <w:rFonts w:ascii="Arial" w:hAnsi="Arial" w:cs="Arial"/>
             <w:i/>
             <w:iCs/>
-            <w:color w:val="808080" w:themeColor="text1" w:themeTint="80"/>
+            <w:color w:val="7F7F7F" w:themeColor="text1" w:themeTint="80"/>
             <w:sz w:val="18"/>
             <w:szCs w:val="18"/>
-            <w14:textFill>
-              <w14:solidFill>
-                <w14:schemeClr w14:val="tx1">
-                  <w14:lumMod w14:val="50000"/>
-                  <w14:lumOff w14:val="50000"/>
-                </w14:schemeClr>
-              </w14:solidFill>
-            </w14:textFill>
           </w:rPr>
           <w:t>2</w:t>
         </w:r>
@@ -3364,17 +3128,9 @@
             <w:rFonts w:ascii="Arial" w:hAnsi="Arial" w:cs="Arial"/>
             <w:i/>
             <w:iCs/>
-            <w:color w:val="808080" w:themeColor="text1" w:themeTint="80"/>
+            <w:color w:val="7F7F7F" w:themeColor="text1" w:themeTint="80"/>
             <w:sz w:val="18"/>
             <w:szCs w:val="18"/>
-            <w14:textFill>
-              <w14:solidFill>
-                <w14:schemeClr w14:val="tx1">
-                  <w14:lumMod w14:val="50000"/>
-                  <w14:lumOff w14:val="50000"/>
-                </w14:schemeClr>
-              </w14:solidFill>
-            </w14:textFill>
           </w:rPr>
           <w:fldChar w:fldCharType="end"/>
         </w:r>
@@ -3385,8 +3141,44 @@
 </w:ftr>
 </file>
 
+<file path=word/footnotes.xml><?xml version="1.0" encoding="utf-8"?>
+<w:footnotes xmlns:wpc="http://schemas.microsoft.com/office/word/2010/wordprocessingCanvas" xmlns:cx="http://schemas.microsoft.com/office/drawing/2014/chartex" xmlns:cx1="http://schemas.microsoft.com/office/drawing/2015/9/8/chartex" xmlns:cx2="http://schemas.microsoft.com/office/drawing/2015/10/21/chartex" xmlns:cx3="http://schemas.microsoft.com/office/drawing/2016/5/9/chartex" xmlns:cx4="http://schemas.microsoft.com/office/drawing/2016/5/10/chartex" xmlns:cx5="http://schemas.microsoft.com/office/drawing/2016/5/11/chartex" xmlns:cx6="http://schemas.microsoft.com/office/drawing/2016/5/12/chartex" xmlns:cx7="http://schemas.microsoft.com/office/drawing/2016/5/13/chartex" xmlns:cx8="http://schemas.microsoft.com/office/drawing/2016/5/14/chartex" xmlns:mc="http://schemas.openxmlformats.org/markup-compatibility/2006" xmlns:aink="http://schemas.microsoft.com/office/drawing/2016/ink" xmlns:am3d="http://schemas.microsoft.com/office/drawing/2017/model3d" xmlns:o="urn:schemas-microsoft-com:office:office" xmlns:oel="http://schemas.microsoft.com/office/2019/extlst" xmlns:r="http://schemas.openxmlformats.org/officeDocument/2006/relationships" xmlns:m="http://schemas.openxmlformats.org/officeDocument/2006/math" xmlns:v="urn:schemas-microsoft-com:vml" xmlns:wp14="http://schemas.microsoft.com/office/word/2010/wordprocessingDrawing" xmlns:wp="http://schemas.openxmlformats.org/drawingml/2006/wordprocessingDrawing" xmlns:w10="urn:schemas-microsoft-com:office:word" xmlns:w="http://schemas.openxmlformats.org/wordprocessingml/2006/main" xmlns:w14="http://schemas.microsoft.com/office/word/2010/wordml" xmlns:w15="http://schemas.microsoft.com/office/word/2012/wordml" xmlns:w16cei="http://schemas.microsoft.com/office/word/2026/wordml/cei" xmlns:w16cex="http://schemas.microsoft.com/office/word/2018/wordml/cex" xmlns:w16cid="http://schemas.microsoft.com/office/word/2016/wordml/cid" xmlns:w16="http://schemas.microsoft.com/office/word/2018/wordml" xmlns:w16du="http://schemas.microsoft.com/office/word/2023/wordml/word16du" xmlns:w16sdtdh="http://schemas.microsoft.com/office/word/2020/wordml/sdtdatahash" xmlns:w16sdtfl="http://schemas.microsoft.com/office/word/2024/wordml/sdtformatlock" xmlns:w16se="http://schemas.microsoft.com/office/word/2015/wordml/symex" xmlns:wpg="http://schemas.microsoft.com/office/word/2010/wordprocessingGroup" xmlns:wpi="http://schemas.microsoft.com/office/word/2010/wordprocessingInk" xmlns:wne="http://schemas.microsoft.com/office/word/2006/wordml" xmlns:wps="http://schemas.microsoft.com/office/word/2010/wordprocessingShape" mc:Ignorable="w14 w15 w16se w16cid w16 w16cex w16sdtdh w16sdtfl w16du wp14">
+  <w:footnote w:type="separator" w:id="-1">
+    <w:p>
+      <w:r>
+        <w:separator/>
+      </w:r>
+    </w:p>
+  </w:footnote>
+  <w:footnote w:type="continuationSeparator" w:id="0">
+    <w:p>
+      <w:r>
+        <w:continuationSeparator/>
+      </w:r>
+    </w:p>
+  </w:footnote>
+</w:footnotes>
+</file>
+
 <file path=word/header1.xml><?xml version="1.0" encoding="utf-8"?>
-<w:hdr xmlns:wpc="http://schemas.microsoft.com/office/word/2010/wordprocessingCanvas" xmlns:mc="http://schemas.openxmlformats.org/markup-compatibility/2006" xmlns:o="urn:schemas-microsoft-com:office:office" xmlns:r="http://schemas.openxmlformats.org/officeDocument/2006/relationships" xmlns:m="http://schemas.openxmlformats.org/officeDocument/2006/math" xmlns:v="urn:schemas-microsoft-com:vml" xmlns:wp14="http://schemas.microsoft.com/office/word/2010/wordprocessingDrawing" xmlns:wp="http://schemas.openxmlformats.org/drawingml/2006/wordprocessingDrawing" xmlns:w10="urn:schemas-microsoft-com:office:word" xmlns:w="http://schemas.openxmlformats.org/wordprocessingml/2006/main" xmlns:w14="http://schemas.microsoft.com/office/word/2010/wordml" xmlns:w15="http://schemas.microsoft.com/office/word/2012/wordml" xmlns:wpg="http://schemas.microsoft.com/office/word/2010/wordprocessingGroup" xmlns:wpi="http://schemas.microsoft.com/office/word/2010/wordprocessingInk" xmlns:wne="http://schemas.microsoft.com/office/word/2006/wordml" xmlns:wps="http://schemas.microsoft.com/office/word/2010/wordprocessingShape" xmlns:wpsCustomData="http://www.wps.cn/officeDocument/2013/wpsCustomData" mc:Ignorable="w14 w15 wp14">
+<w:hdr xmlns:wpc="http://schemas.microsoft.com/office/word/2010/wordprocessingCanvas" xmlns:cx="http://schemas.microsoft.com/office/drawing/2014/chartex" xmlns:cx1="http://schemas.microsoft.com/office/drawing/2015/9/8/chartex" xmlns:cx2="http://schemas.microsoft.com/office/drawing/2015/10/21/chartex" xmlns:cx3="http://schemas.microsoft.com/office/drawing/2016/5/9/chartex" xmlns:cx4="http://schemas.microsoft.com/office/drawing/2016/5/10/chartex" xmlns:cx5="http://schemas.microsoft.com/office/drawing/2016/5/11/chartex" xmlns:cx6="http://schemas.microsoft.com/office/drawing/2016/5/12/chartex" xmlns:cx7="http://schemas.microsoft.com/office/drawing/2016/5/13/chartex" xmlns:cx8="http://schemas.microsoft.com/office/drawing/2016/5/14/chartex" xmlns:mc="http://schemas.openxmlformats.org/markup-compatibility/2006" xmlns:aink="http://schemas.microsoft.com/office/drawing/2016/ink" xmlns:am3d="http://schemas.microsoft.com/office/drawing/2017/model3d" xmlns:o="urn:schemas-microsoft-com:office:office" xmlns:oel="http://schemas.microsoft.com/office/2019/extlst" xmlns:r="http://schemas.openxmlformats.org/officeDocument/2006/relationships" xmlns:m="http://schemas.openxmlformats.org/officeDocument/2006/math" xmlns:v="urn:schemas-microsoft-com:vml" xmlns:wp14="http://schemas.microsoft.com/office/word/2010/wordprocessingDrawing" xmlns:wp="http://schemas.openxmlformats.org/drawingml/2006/wordprocessingDrawing" xmlns:w10="urn:schemas-microsoft-com:office:word" xmlns:w="http://schemas.openxmlformats.org/wordprocessingml/2006/main" xmlns:w14="http://schemas.microsoft.com/office/word/2010/wordml" xmlns:w15="http://schemas.microsoft.com/office/word/2012/wordml" xmlns:w16cei="http://schemas.microsoft.com/office/word/2026/wordml/cei" xmlns:w16cex="http://schemas.microsoft.com/office/word/2018/wordml/cex" xmlns:w16cid="http://schemas.microsoft.com/office/word/2016/wordml/cid" xmlns:w16="http://schemas.microsoft.com/office/word/2018/wordml" xmlns:w16du="http://schemas.microsoft.com/office/word/2023/wordml/word16du" xmlns:w16sdtdh="http://schemas.microsoft.com/office/word/2020/wordml/sdtdatahash" xmlns:w16sdtfl="http://schemas.microsoft.com/office/word/2024/wordml/sdtformatlock" xmlns:w16se="http://schemas.microsoft.com/office/word/2015/wordml/symex" xmlns:wpg="http://schemas.microsoft.com/office/word/2010/wordprocessingGroup" xmlns:wpi="http://schemas.microsoft.com/office/word/2010/wordprocessingInk" xmlns:wne="http://schemas.microsoft.com/office/word/2006/wordml" xmlns:wps="http://schemas.microsoft.com/office/word/2010/wordprocessingShape" mc:Ignorable="w14 w15 w16se w16cid w16 w16cex w16sdtdh w16sdtfl w16du wp14">
+  <w:p>
+    <w:pPr>
+      <w:contextualSpacing/>
+      <w:rPr>
+        <w:rFonts w:asciiTheme="minorHAnsi" w:hAnsiTheme="minorHAnsi" w:cs="Arial"/>
+        <w:i/>
+        <w:color w:val="000000"/>
+        <w:sz w:val="20"/>
+      </w:rPr>
+    </w:pPr>
+  </w:p>
+  <w:p/>
+</w:hdr>
+</file>
+
+<file path=word/header2.xml><?xml version="1.0" encoding="utf-8"?>
+<w:hdr xmlns:wpc="http://schemas.microsoft.com/office/word/2010/wordprocessingCanvas" xmlns:cx="http://schemas.microsoft.com/office/drawing/2014/chartex" xmlns:cx1="http://schemas.microsoft.com/office/drawing/2015/9/8/chartex" xmlns:cx2="http://schemas.microsoft.com/office/drawing/2015/10/21/chartex" xmlns:cx3="http://schemas.microsoft.com/office/drawing/2016/5/9/chartex" xmlns:cx4="http://schemas.microsoft.com/office/drawing/2016/5/10/chartex" xmlns:cx5="http://schemas.microsoft.com/office/drawing/2016/5/11/chartex" xmlns:cx6="http://schemas.microsoft.com/office/drawing/2016/5/12/chartex" xmlns:cx7="http://schemas.microsoft.com/office/drawing/2016/5/13/chartex" xmlns:cx8="http://schemas.microsoft.com/office/drawing/2016/5/14/chartex" xmlns:mc="http://schemas.openxmlformats.org/markup-compatibility/2006" xmlns:aink="http://schemas.microsoft.com/office/drawing/2016/ink" xmlns:am3d="http://schemas.microsoft.com/office/drawing/2017/model3d" xmlns:o="urn:schemas-microsoft-com:office:office" xmlns:oel="http://schemas.microsoft.com/office/2019/extlst" xmlns:r="http://schemas.openxmlformats.org/officeDocument/2006/relationships" xmlns:m="http://schemas.openxmlformats.org/officeDocument/2006/math" xmlns:v="urn:schemas-microsoft-com:vml" xmlns:wp14="http://schemas.microsoft.com/office/word/2010/wordprocessingDrawing" xmlns:wp="http://schemas.openxmlformats.org/drawingml/2006/wordprocessingDrawing" xmlns:w10="urn:schemas-microsoft-com:office:word" xmlns:w="http://schemas.openxmlformats.org/wordprocessingml/2006/main" xmlns:w14="http://schemas.microsoft.com/office/word/2010/wordml" xmlns:w15="http://schemas.microsoft.com/office/word/2012/wordml" xmlns:w16cei="http://schemas.microsoft.com/office/word/2026/wordml/cei" xmlns:w16cex="http://schemas.microsoft.com/office/word/2018/wordml/cex" xmlns:w16cid="http://schemas.microsoft.com/office/word/2016/wordml/cid" xmlns:w16="http://schemas.microsoft.com/office/word/2018/wordml" xmlns:w16du="http://schemas.microsoft.com/office/word/2023/wordml/word16du" xmlns:w16sdtdh="http://schemas.microsoft.com/office/word/2020/wordml/sdtdatahash" xmlns:w16sdtfl="http://schemas.microsoft.com/office/word/2024/wordml/sdtformatlock" xmlns:w16se="http://schemas.microsoft.com/office/word/2015/wordml/symex" xmlns:wpg="http://schemas.microsoft.com/office/word/2010/wordprocessingGroup" xmlns:wpi="http://schemas.microsoft.com/office/word/2010/wordprocessingInk" xmlns:wne="http://schemas.microsoft.com/office/word/2006/wordml" xmlns:wps="http://schemas.microsoft.com/office/word/2010/wordprocessingShape" mc:Ignorable="w14 w15 w16se w16cid w16 w16cex w16sdtdh w16sdtfl w16du wp14">
   <w:p>
     <w:pPr>
       <w:tabs>
@@ -3402,8 +3194,11 @@
       </w:rPr>
     </w:pPr>
     <w:r>
+      <w:rPr>
+        <w:noProof/>
+      </w:rPr>
       <w:drawing>
-        <wp:anchor distT="0" distB="0" distL="114300" distR="114300" simplePos="0" relativeHeight="251660288" behindDoc="1" locked="0" layoutInCell="1" allowOverlap="1">
+        <wp:anchor distT="0" distB="0" distL="114300" distR="114300" simplePos="0" relativeHeight="251660288" behindDoc="1" locked="0" layoutInCell="1" allowOverlap="1" wp14:anchorId="56D78A77" wp14:editId="56D78A78">
           <wp:simplePos x="0" y="0"/>
           <wp:positionH relativeFrom="column">
             <wp:posOffset>266700</wp:posOffset>
@@ -3414,7 +3209,7 @@
           <wp:extent cx="1800225" cy="771525"/>
           <wp:effectExtent l="0" t="0" r="9525" b="9525"/>
           <wp:wrapTight wrapText="bothSides">
-            <wp:wrapPolygon>
+            <wp:wrapPolygon edited="0">
               <wp:start x="0" y="0"/>
               <wp:lineTo x="0" y="21333"/>
               <wp:lineTo x="21486" y="21333"/>
@@ -3472,25 +3267,8 @@
 </w:hdr>
 </file>
 
-<file path=word/header2.xml><?xml version="1.0" encoding="utf-8"?>
-<w:hdr xmlns:wpc="http://schemas.microsoft.com/office/word/2010/wordprocessingCanvas" xmlns:mc="http://schemas.openxmlformats.org/markup-compatibility/2006" xmlns:o="urn:schemas-microsoft-com:office:office" xmlns:r="http://schemas.openxmlformats.org/officeDocument/2006/relationships" xmlns:m="http://schemas.openxmlformats.org/officeDocument/2006/math" xmlns:v="urn:schemas-microsoft-com:vml" xmlns:wp14="http://schemas.microsoft.com/office/word/2010/wordprocessingDrawing" xmlns:wp="http://schemas.openxmlformats.org/drawingml/2006/wordprocessingDrawing" xmlns:w10="urn:schemas-microsoft-com:office:word" xmlns:w="http://schemas.openxmlformats.org/wordprocessingml/2006/main" xmlns:w14="http://schemas.microsoft.com/office/word/2010/wordml" xmlns:w15="http://schemas.microsoft.com/office/word/2012/wordml" xmlns:wpg="http://schemas.microsoft.com/office/word/2010/wordprocessingGroup" xmlns:wpi="http://schemas.microsoft.com/office/word/2010/wordprocessingInk" xmlns:wne="http://schemas.microsoft.com/office/word/2006/wordml" xmlns:wps="http://schemas.microsoft.com/office/word/2010/wordprocessingShape" xmlns:wpsCustomData="http://www.wps.cn/officeDocument/2013/wpsCustomData" mc:Ignorable="w14 w15 wp14">
-  <w:p>
-    <w:pPr>
-      <w:contextualSpacing/>
-      <w:rPr>
-        <w:rFonts w:cs="Arial" w:asciiTheme="minorHAnsi" w:hAnsiTheme="minorHAnsi"/>
-        <w:i/>
-        <w:color w:val="000000"/>
-        <w:sz w:val="20"/>
-      </w:rPr>
-    </w:pPr>
-  </w:p>
-  <w:p/>
-</w:hdr>
-</file>
-
 <file path=word/header3.xml><?xml version="1.0" encoding="utf-8"?>
-<w:hdr xmlns:wpc="http://schemas.microsoft.com/office/word/2010/wordprocessingCanvas" xmlns:mc="http://schemas.openxmlformats.org/markup-compatibility/2006" xmlns:o="urn:schemas-microsoft-com:office:office" xmlns:r="http://schemas.openxmlformats.org/officeDocument/2006/relationships" xmlns:m="http://schemas.openxmlformats.org/officeDocument/2006/math" xmlns:v="urn:schemas-microsoft-com:vml" xmlns:wp14="http://schemas.microsoft.com/office/word/2010/wordprocessingDrawing" xmlns:wp="http://schemas.openxmlformats.org/drawingml/2006/wordprocessingDrawing" xmlns:w10="urn:schemas-microsoft-com:office:word" xmlns:w="http://schemas.openxmlformats.org/wordprocessingml/2006/main" xmlns:w14="http://schemas.microsoft.com/office/word/2010/wordml" xmlns:w15="http://schemas.microsoft.com/office/word/2012/wordml" xmlns:wpg="http://schemas.microsoft.com/office/word/2010/wordprocessingGroup" xmlns:wpi="http://schemas.microsoft.com/office/word/2010/wordprocessingInk" xmlns:wne="http://schemas.microsoft.com/office/word/2006/wordml" xmlns:wps="http://schemas.microsoft.com/office/word/2010/wordprocessingShape" xmlns:wpsCustomData="http://www.wps.cn/officeDocument/2013/wpsCustomData" mc:Ignorable="w14 w15 wp14">
+<w:hdr xmlns:wpc="http://schemas.microsoft.com/office/word/2010/wordprocessingCanvas" xmlns:cx="http://schemas.microsoft.com/office/drawing/2014/chartex" xmlns:cx1="http://schemas.microsoft.com/office/drawing/2015/9/8/chartex" xmlns:cx2="http://schemas.microsoft.com/office/drawing/2015/10/21/chartex" xmlns:cx3="http://schemas.microsoft.com/office/drawing/2016/5/9/chartex" xmlns:cx4="http://schemas.microsoft.com/office/drawing/2016/5/10/chartex" xmlns:cx5="http://schemas.microsoft.com/office/drawing/2016/5/11/chartex" xmlns:cx6="http://schemas.microsoft.com/office/drawing/2016/5/12/chartex" xmlns:cx7="http://schemas.microsoft.com/office/drawing/2016/5/13/chartex" xmlns:cx8="http://schemas.microsoft.com/office/drawing/2016/5/14/chartex" xmlns:mc="http://schemas.openxmlformats.org/markup-compatibility/2006" xmlns:aink="http://schemas.microsoft.com/office/drawing/2016/ink" xmlns:am3d="http://schemas.microsoft.com/office/drawing/2017/model3d" xmlns:o="urn:schemas-microsoft-com:office:office" xmlns:oel="http://schemas.microsoft.com/office/2019/extlst" xmlns:r="http://schemas.openxmlformats.org/officeDocument/2006/relationships" xmlns:m="http://schemas.openxmlformats.org/officeDocument/2006/math" xmlns:v="urn:schemas-microsoft-com:vml" xmlns:wp14="http://schemas.microsoft.com/office/word/2010/wordprocessingDrawing" xmlns:wp="http://schemas.openxmlformats.org/drawingml/2006/wordprocessingDrawing" xmlns:w10="urn:schemas-microsoft-com:office:word" xmlns:w="http://schemas.openxmlformats.org/wordprocessingml/2006/main" xmlns:w14="http://schemas.microsoft.com/office/word/2010/wordml" xmlns:w15="http://schemas.microsoft.com/office/word/2012/wordml" xmlns:w16cei="http://schemas.microsoft.com/office/word/2026/wordml/cei" xmlns:w16cex="http://schemas.microsoft.com/office/word/2018/wordml/cex" xmlns:w16cid="http://schemas.microsoft.com/office/word/2016/wordml/cid" xmlns:w16="http://schemas.microsoft.com/office/word/2018/wordml" xmlns:w16du="http://schemas.microsoft.com/office/word/2023/wordml/word16du" xmlns:w16sdtdh="http://schemas.microsoft.com/office/word/2020/wordml/sdtdatahash" xmlns:w16sdtfl="http://schemas.microsoft.com/office/word/2024/wordml/sdtformatlock" xmlns:w16se="http://schemas.microsoft.com/office/word/2015/wordml/symex" xmlns:wpg="http://schemas.microsoft.com/office/word/2010/wordprocessingGroup" xmlns:wpi="http://schemas.microsoft.com/office/word/2010/wordprocessingInk" xmlns:wne="http://schemas.microsoft.com/office/word/2006/wordml" xmlns:wps="http://schemas.microsoft.com/office/word/2010/wordprocessingShape" mc:Ignorable="w14 w15 w16se w16cid w16 w16cex w16sdtdh w16sdtfl w16du wp14">
   <w:sdt>
     <w:sdtPr>
       <w:id w:val="968752352"/>
@@ -3503,7 +3281,7 @@
     <w:sdtContent>
       <w:p>
         <w:pPr>
-          <w:pStyle w:val="21"/>
+          <w:pStyle w:val="Header"/>
         </w:pPr>
         <w:r>
           <w:t>[Type here]</w:t>
@@ -3513,19 +3291,19 @@
   </w:sdt>
   <w:p>
     <w:pPr>
-      <w:pStyle w:val="21"/>
+      <w:pStyle w:val="Header"/>
     </w:pPr>
   </w:p>
 </w:hdr>
 </file>
 
 <file path=word/numbering.xml><?xml version="1.0" encoding="utf-8"?>
-<w:numbering xmlns:wpc="http://schemas.microsoft.com/office/word/2010/wordprocessingCanvas" xmlns:mc="http://schemas.openxmlformats.org/markup-compatibility/2006" xmlns:o="urn:schemas-microsoft-com:office:office" xmlns:r="http://schemas.openxmlformats.org/officeDocument/2006/relationships" xmlns:m="http://schemas.openxmlformats.org/officeDocument/2006/math" xmlns:v="urn:schemas-microsoft-com:vml" xmlns:wp14="http://schemas.microsoft.com/office/word/2010/wordprocessingDrawing" xmlns:wp="http://schemas.openxmlformats.org/drawingml/2006/wordprocessingDrawing" xmlns:w10="urn:schemas-microsoft-com:office:word" xmlns:w="http://schemas.openxmlformats.org/wordprocessingml/2006/main" xmlns:w14="http://schemas.microsoft.com/office/word/2010/wordml" xmlns:wpg="http://schemas.microsoft.com/office/word/2010/wordprocessingGroup" xmlns:wpi="http://schemas.microsoft.com/office/word/2010/wordprocessingInk" xmlns:wne="http://schemas.microsoft.com/office/word/2006/wordml" xmlns:wps="http://schemas.microsoft.com/office/word/2010/wordprocessingShape" xmlns:wpsCustomData="http://www.wps.cn/officeDocument/2013/wpsCustomData" mc:Ignorable="w14 wp14">
-  <w:abstractNum w:abstractNumId="0">
+<w:numbering xmlns:wpc="http://schemas.microsoft.com/office/word/2010/wordprocessingCanvas" xmlns:cx="http://schemas.microsoft.com/office/drawing/2014/chartex" xmlns:cx1="http://schemas.microsoft.com/office/drawing/2015/9/8/chartex" xmlns:cx2="http://schemas.microsoft.com/office/drawing/2015/10/21/chartex" xmlns:cx3="http://schemas.microsoft.com/office/drawing/2016/5/9/chartex" xmlns:cx4="http://schemas.microsoft.com/office/drawing/2016/5/10/chartex" xmlns:cx5="http://schemas.microsoft.com/office/drawing/2016/5/11/chartex" xmlns:cx6="http://schemas.microsoft.com/office/drawing/2016/5/12/chartex" xmlns:cx7="http://schemas.microsoft.com/office/drawing/2016/5/13/chartex" xmlns:cx8="http://schemas.microsoft.com/office/drawing/2016/5/14/chartex" xmlns:mc="http://schemas.openxmlformats.org/markup-compatibility/2006" xmlns:aink="http://schemas.microsoft.com/office/drawing/2016/ink" xmlns:am3d="http://schemas.microsoft.com/office/drawing/2017/model3d" xmlns:o="urn:schemas-microsoft-com:office:office" xmlns:oel="http://schemas.microsoft.com/office/2019/extlst" xmlns:r="http://schemas.openxmlformats.org/officeDocument/2006/relationships" xmlns:m="http://schemas.openxmlformats.org/officeDocument/2006/math" xmlns:v="urn:schemas-microsoft-com:vml" xmlns:wp14="http://schemas.microsoft.com/office/word/2010/wordprocessingDrawing" xmlns:wp="http://schemas.openxmlformats.org/drawingml/2006/wordprocessingDrawing" xmlns:w10="urn:schemas-microsoft-com:office:word" xmlns:w="http://schemas.openxmlformats.org/wordprocessingml/2006/main" xmlns:w14="http://schemas.microsoft.com/office/word/2010/wordml" xmlns:w15="http://schemas.microsoft.com/office/word/2012/wordml" xmlns:w16cei="http://schemas.microsoft.com/office/word/2026/wordml/cei" xmlns:w16cex="http://schemas.microsoft.com/office/word/2018/wordml/cex" xmlns:w16cid="http://schemas.microsoft.com/office/word/2016/wordml/cid" xmlns:w16="http://schemas.microsoft.com/office/word/2018/wordml" xmlns:w16du="http://schemas.microsoft.com/office/word/2023/wordml/word16du" xmlns:w16sdtdh="http://schemas.microsoft.com/office/word/2020/wordml/sdtdatahash" xmlns:w16sdtfl="http://schemas.microsoft.com/office/word/2024/wordml/sdtformatlock" xmlns:w16se="http://schemas.microsoft.com/office/word/2015/wordml/symex" xmlns:wpg="http://schemas.microsoft.com/office/word/2010/wordprocessingGroup" xmlns:wpi="http://schemas.microsoft.com/office/word/2010/wordprocessingInk" xmlns:wne="http://schemas.microsoft.com/office/word/2006/wordml" xmlns:wps="http://schemas.microsoft.com/office/word/2010/wordprocessingShape" mc:Ignorable="w14 w15 w16se w16cid w16 w16cex w16sdtdh w16sdtfl w16du wp14">
+  <w:abstractNum w:abstractNumId="0" w15:restartNumberingAfterBreak="0">
     <w:nsid w:val="46E4604F"/>
     <w:multiLevelType w:val="multilevel"/>
     <w:tmpl w:val="46E4604F"/>
-    <w:lvl w:ilvl="0" w:tentative="0">
+    <w:lvl w:ilvl="0">
       <w:start w:val="1"/>
       <w:numFmt w:val="bullet"/>
       <w:lvlText w:val=""/>
@@ -3534,14 +3312,14 @@
         <w:ind w:left="720" w:hanging="360"/>
       </w:pPr>
       <w:rPr>
-        <w:rFonts w:hint="default" w:ascii="Symbol" w:hAnsi="Symbol"/>
+        <w:rFonts w:ascii="Symbol" w:hAnsi="Symbol" w:hint="default"/>
         <w:color w:val="auto"/>
         <w:sz w:val="20"/>
         <w:szCs w:val="20"/>
         <w:lang w:val="en-US"/>
       </w:rPr>
     </w:lvl>
-    <w:lvl w:ilvl="1" w:tentative="0">
+    <w:lvl w:ilvl="1">
       <w:start w:val="1"/>
       <w:numFmt w:val="bullet"/>
       <w:lvlText w:val="o"/>
@@ -3550,10 +3328,10 @@
         <w:ind w:left="1440" w:hanging="360"/>
       </w:pPr>
       <w:rPr>
-        <w:rFonts w:hint="default" w:ascii="Courier New" w:hAnsi="Courier New" w:cs="Courier New"/>
+        <w:rFonts w:ascii="Courier New" w:hAnsi="Courier New" w:cs="Courier New" w:hint="default"/>
       </w:rPr>
     </w:lvl>
-    <w:lvl w:ilvl="2" w:tentative="0">
+    <w:lvl w:ilvl="2">
       <w:start w:val="1"/>
       <w:numFmt w:val="bullet"/>
       <w:lvlText w:val=""/>
@@ -3562,10 +3340,10 @@
         <w:ind w:left="2160" w:hanging="360"/>
       </w:pPr>
       <w:rPr>
-        <w:rFonts w:hint="default" w:ascii="Wingdings" w:hAnsi="Wingdings"/>
+        <w:rFonts w:ascii="Wingdings" w:hAnsi="Wingdings" w:hint="default"/>
       </w:rPr>
     </w:lvl>
-    <w:lvl w:ilvl="3" w:tentative="0">
+    <w:lvl w:ilvl="3">
       <w:start w:val="1"/>
       <w:numFmt w:val="bullet"/>
       <w:lvlText w:val=""/>
@@ -3574,10 +3352,10 @@
         <w:ind w:left="2880" w:hanging="360"/>
       </w:pPr>
       <w:rPr>
-        <w:rFonts w:hint="default" w:ascii="Symbol" w:hAnsi="Symbol"/>
+        <w:rFonts w:ascii="Symbol" w:hAnsi="Symbol" w:hint="default"/>
       </w:rPr>
     </w:lvl>
-    <w:lvl w:ilvl="4" w:tentative="0">
+    <w:lvl w:ilvl="4">
       <w:start w:val="1"/>
       <w:numFmt w:val="bullet"/>
       <w:lvlText w:val="o"/>
@@ -3586,10 +3364,10 @@
         <w:ind w:left="3600" w:hanging="360"/>
       </w:pPr>
       <w:rPr>
-        <w:rFonts w:hint="default" w:ascii="Courier New" w:hAnsi="Courier New" w:cs="Courier New"/>
+        <w:rFonts w:ascii="Courier New" w:hAnsi="Courier New" w:cs="Courier New" w:hint="default"/>
       </w:rPr>
     </w:lvl>
-    <w:lvl w:ilvl="5" w:tentative="0">
+    <w:lvl w:ilvl="5">
       <w:start w:val="1"/>
       <w:numFmt w:val="bullet"/>
       <w:lvlText w:val=""/>
@@ -3598,10 +3376,10 @@
         <w:ind w:left="4320" w:hanging="360"/>
       </w:pPr>
       <w:rPr>
-        <w:rFonts w:hint="default" w:ascii="Wingdings" w:hAnsi="Wingdings"/>
+        <w:rFonts w:ascii="Wingdings" w:hAnsi="Wingdings" w:hint="default"/>
       </w:rPr>
     </w:lvl>
-    <w:lvl w:ilvl="6" w:tentative="0">
+    <w:lvl w:ilvl="6">
       <w:start w:val="1"/>
       <w:numFmt w:val="bullet"/>
       <w:lvlText w:val=""/>
@@ -3610,10 +3388,10 @@
         <w:ind w:left="5040" w:hanging="360"/>
       </w:pPr>
       <w:rPr>
-        <w:rFonts w:hint="default" w:ascii="Symbol" w:hAnsi="Symbol"/>
+        <w:rFonts w:ascii="Symbol" w:hAnsi="Symbol" w:hint="default"/>
       </w:rPr>
     </w:lvl>
-    <w:lvl w:ilvl="7" w:tentative="0">
+    <w:lvl w:ilvl="7">
       <w:start w:val="1"/>
       <w:numFmt w:val="bullet"/>
       <w:lvlText w:val="o"/>
@@ -3622,10 +3400,10 @@
         <w:ind w:left="5760" w:hanging="360"/>
       </w:pPr>
       <w:rPr>
-        <w:rFonts w:hint="default" w:ascii="Courier New" w:hAnsi="Courier New" w:cs="Courier New"/>
+        <w:rFonts w:ascii="Courier New" w:hAnsi="Courier New" w:cs="Courier New" w:hint="default"/>
       </w:rPr>
     </w:lvl>
-    <w:lvl w:ilvl="8" w:tentative="0">
+    <w:lvl w:ilvl="8">
       <w:start w:val="1"/>
       <w:numFmt w:val="bullet"/>
       <w:lvlText w:val=""/>
@@ -3634,15 +3412,15 @@
         <w:ind w:left="6480" w:hanging="360"/>
       </w:pPr>
       <w:rPr>
-        <w:rFonts w:hint="default" w:ascii="Wingdings" w:hAnsi="Wingdings"/>
+        <w:rFonts w:ascii="Wingdings" w:hAnsi="Wingdings" w:hint="default"/>
       </w:rPr>
     </w:lvl>
   </w:abstractNum>
-  <w:abstractNum w:abstractNumId="1">
+  <w:abstractNum w:abstractNumId="1" w15:restartNumberingAfterBreak="0">
     <w:nsid w:val="6AEF2D4C"/>
     <w:multiLevelType w:val="multilevel"/>
     <w:tmpl w:val="6AEF2D4C"/>
-    <w:lvl w:ilvl="0" w:tentative="0">
+    <w:lvl w:ilvl="0">
       <w:start w:val="1"/>
       <w:numFmt w:val="bullet"/>
       <w:lvlText w:val=""/>
@@ -3651,10 +3429,10 @@
         <w:ind w:left="927" w:hanging="360"/>
       </w:pPr>
       <w:rPr>
-        <w:rFonts w:hint="default" w:ascii="Symbol" w:hAnsi="Symbol"/>
+        <w:rFonts w:ascii="Symbol" w:hAnsi="Symbol" w:hint="default"/>
       </w:rPr>
     </w:lvl>
-    <w:lvl w:ilvl="1" w:tentative="0">
+    <w:lvl w:ilvl="1">
       <w:start w:val="1"/>
       <w:numFmt w:val="bullet"/>
       <w:lvlText w:val="o"/>
@@ -3663,10 +3441,10 @@
         <w:ind w:left="1647" w:hanging="360"/>
       </w:pPr>
       <w:rPr>
-        <w:rFonts w:hint="default" w:ascii="Courier New" w:hAnsi="Courier New" w:cs="Courier New"/>
+        <w:rFonts w:ascii="Courier New" w:hAnsi="Courier New" w:cs="Courier New" w:hint="default"/>
       </w:rPr>
     </w:lvl>
-    <w:lvl w:ilvl="2" w:tentative="0">
+    <w:lvl w:ilvl="2">
       <w:start w:val="1"/>
       <w:numFmt w:val="bullet"/>
       <w:lvlText w:val=""/>
@@ -3675,10 +3453,10 @@
         <w:ind w:left="2367" w:hanging="360"/>
       </w:pPr>
       <w:rPr>
-        <w:rFonts w:hint="default" w:ascii="Wingdings" w:hAnsi="Wingdings"/>
+        <w:rFonts w:ascii="Wingdings" w:hAnsi="Wingdings" w:hint="default"/>
       </w:rPr>
     </w:lvl>
-    <w:lvl w:ilvl="3" w:tentative="0">
+    <w:lvl w:ilvl="3">
       <w:start w:val="1"/>
       <w:numFmt w:val="bullet"/>
       <w:lvlText w:val=""/>
@@ -3687,10 +3465,10 @@
         <w:ind w:left="3087" w:hanging="360"/>
       </w:pPr>
       <w:rPr>
-        <w:rFonts w:hint="default" w:ascii="Symbol" w:hAnsi="Symbol"/>
+        <w:rFonts w:ascii="Symbol" w:hAnsi="Symbol" w:hint="default"/>
       </w:rPr>
     </w:lvl>
-    <w:lvl w:ilvl="4" w:tentative="0">
+    <w:lvl w:ilvl="4">
       <w:start w:val="1"/>
       <w:numFmt w:val="bullet"/>
       <w:lvlText w:val="o"/>
@@ -3699,10 +3477,10 @@
         <w:ind w:left="3807" w:hanging="360"/>
       </w:pPr>
       <w:rPr>
-        <w:rFonts w:hint="default" w:ascii="Courier New" w:hAnsi="Courier New" w:cs="Courier New"/>
+        <w:rFonts w:ascii="Courier New" w:hAnsi="Courier New" w:cs="Courier New" w:hint="default"/>
       </w:rPr>
     </w:lvl>
-    <w:lvl w:ilvl="5" w:tentative="0">
+    <w:lvl w:ilvl="5">
       <w:start w:val="1"/>
       <w:numFmt w:val="bullet"/>
       <w:lvlText w:val=""/>
@@ -3711,10 +3489,10 @@
         <w:ind w:left="4527" w:hanging="360"/>
       </w:pPr>
       <w:rPr>
-        <w:rFonts w:hint="default" w:ascii="Wingdings" w:hAnsi="Wingdings"/>
+        <w:rFonts w:ascii="Wingdings" w:hAnsi="Wingdings" w:hint="default"/>
       </w:rPr>
     </w:lvl>
-    <w:lvl w:ilvl="6" w:tentative="0">
+    <w:lvl w:ilvl="6">
       <w:start w:val="1"/>
       <w:numFmt w:val="bullet"/>
       <w:lvlText w:val=""/>
@@ -3723,10 +3501,10 @@
         <w:ind w:left="5247" w:hanging="360"/>
       </w:pPr>
       <w:rPr>
-        <w:rFonts w:hint="default" w:ascii="Symbol" w:hAnsi="Symbol"/>
+        <w:rFonts w:ascii="Symbol" w:hAnsi="Symbol" w:hint="default"/>
       </w:rPr>
     </w:lvl>
-    <w:lvl w:ilvl="7" w:tentative="0">
+    <w:lvl w:ilvl="7">
       <w:start w:val="1"/>
       <w:numFmt w:val="bullet"/>
       <w:lvlText w:val="o"/>
@@ -3735,10 +3513,10 @@
         <w:ind w:left="5967" w:hanging="360"/>
       </w:pPr>
       <w:rPr>
-        <w:rFonts w:hint="default" w:ascii="Courier New" w:hAnsi="Courier New" w:cs="Courier New"/>
+        <w:rFonts w:ascii="Courier New" w:hAnsi="Courier New" w:cs="Courier New" w:hint="default"/>
       </w:rPr>
     </w:lvl>
-    <w:lvl w:ilvl="8" w:tentative="0">
+    <w:lvl w:ilvl="8">
       <w:start w:val="1"/>
       <w:numFmt w:val="bullet"/>
       <w:lvlText w:val=""/>
@@ -3747,298 +3525,418 @@
         <w:ind w:left="6687" w:hanging="360"/>
       </w:pPr>
       <w:rPr>
-        <w:rFonts w:hint="default" w:ascii="Wingdings" w:hAnsi="Wingdings"/>
+        <w:rFonts w:ascii="Wingdings" w:hAnsi="Wingdings" w:hint="default"/>
       </w:rPr>
     </w:lvl>
   </w:abstractNum>
-  <w:num w:numId="1">
+  <w:num w:numId="1" w16cid:durableId="992374820">
     <w:abstractNumId w:val="0"/>
   </w:num>
-  <w:num w:numId="2">
+  <w:num w:numId="2" w16cid:durableId="975988868">
     <w:abstractNumId w:val="1"/>
   </w:num>
 </w:numbering>
 </file>
 
 <file path=word/styles.xml><?xml version="1.0" encoding="utf-8"?>
-<w:styles xmlns:mc="http://schemas.openxmlformats.org/markup-compatibility/2006" xmlns:o="urn:schemas-microsoft-com:office:office" xmlns:r="http://schemas.openxmlformats.org/officeDocument/2006/relationships" xmlns:m="http://schemas.openxmlformats.org/officeDocument/2006/math" xmlns:v="urn:schemas-microsoft-com:vml" xmlns:w="http://schemas.openxmlformats.org/wordprocessingml/2006/main" xmlns:w14="http://schemas.microsoft.com/office/word/2010/wordml" xmlns:w10="urn:schemas-microsoft-com:office:word" xmlns:sl="http://schemas.openxmlformats.org/schemaLibrary/2006/main" xmlns:wpsCustomData="http://www.wps.cn/officeDocument/2013/wpsCustomData" mc:Ignorable="w14">
+<w:styles xmlns:mc="http://schemas.openxmlformats.org/markup-compatibility/2006" xmlns:r="http://schemas.openxmlformats.org/officeDocument/2006/relationships" xmlns:w="http://schemas.openxmlformats.org/wordprocessingml/2006/main" xmlns:w14="http://schemas.microsoft.com/office/word/2010/wordml" xmlns:w15="http://schemas.microsoft.com/office/word/2012/wordml" xmlns:w16cex="http://schemas.microsoft.com/office/word/2018/wordml/cex" xmlns:w16cid="http://schemas.microsoft.com/office/word/2016/wordml/cid" xmlns:w16="http://schemas.microsoft.com/office/word/2018/wordml" xmlns:w16du="http://schemas.microsoft.com/office/word/2023/wordml/word16du" xmlns:w16sdtdh="http://schemas.microsoft.com/office/word/2020/wordml/sdtdatahash" xmlns:w16sdtfl="http://schemas.microsoft.com/office/word/2024/wordml/sdtformatlock" xmlns:w16se="http://schemas.microsoft.com/office/word/2015/wordml/symex" mc:Ignorable="w14 w15 w16se w16cid w16 w16cex w16sdtdh w16sdtfl w16du">
   <w:docDefaults>
     <w:rPrDefault>
       <w:rPr>
-        <w:rFonts w:ascii="Times New Roman" w:hAnsi="Times New Roman" w:eastAsia="SimSun" w:cs="Times New Roman"/>
+        <w:rFonts w:ascii="Times New Roman" w:eastAsia="SimSun" w:hAnsi="Times New Roman" w:cs="Times New Roman"/>
+        <w:lang w:val="en-ZA" w:eastAsia="en-ZA" w:bidi="ar-SA"/>
       </w:rPr>
     </w:rPrDefault>
     <w:pPrDefault/>
   </w:docDefaults>
-  <w:latentStyles w:count="260" w:defQFormat="0" w:defUnhideWhenUsed="1" w:defSemiHidden="1" w:defUIPriority="99" w:defLockedState="0">
-    <w:lsdException w:qFormat="1" w:unhideWhenUsed="0" w:uiPriority="0" w:semiHidden="0" w:name="Normal"/>
-    <w:lsdException w:qFormat="1" w:unhideWhenUsed="0" w:uiPriority="9" w:semiHidden="0" w:name="heading 1"/>
-    <w:lsdException w:qFormat="1" w:unhideWhenUsed="0" w:uiPriority="9" w:semiHidden="0" w:name="heading 2"/>
-    <w:lsdException w:qFormat="1" w:unhideWhenUsed="0" w:uiPriority="9" w:semiHidden="0" w:name="heading 3"/>
-    <w:lsdException w:qFormat="1" w:unhideWhenUsed="0" w:uiPriority="9" w:semiHidden="0" w:name="heading 4"/>
-    <w:lsdException w:qFormat="1" w:unhideWhenUsed="0" w:uiPriority="9" w:semiHidden="0" w:name="heading 5"/>
-    <w:lsdException w:qFormat="1" w:unhideWhenUsed="0" w:uiPriority="9" w:semiHidden="0" w:name="heading 6"/>
-    <w:lsdException w:qFormat="1" w:unhideWhenUsed="0" w:uiPriority="9" w:semiHidden="0" w:name="heading 7"/>
-    <w:lsdException w:qFormat="1" w:unhideWhenUsed="0" w:uiPriority="9" w:semiHidden="0" w:name="heading 8"/>
-    <w:lsdException w:qFormat="1" w:unhideWhenUsed="0" w:uiPriority="9" w:semiHidden="0" w:name="heading 9"/>
-    <w:lsdException w:uiPriority="0" w:name="index 1"/>
-    <w:lsdException w:uiPriority="0" w:name="index 2"/>
-    <w:lsdException w:uiPriority="0" w:name="index 3"/>
-    <w:lsdException w:uiPriority="0" w:name="index 4"/>
-    <w:lsdException w:uiPriority="0" w:name="index 5"/>
-    <w:lsdException w:uiPriority="0" w:name="index 6"/>
-    <w:lsdException w:uiPriority="0" w:name="index 7"/>
-    <w:lsdException w:uiPriority="0" w:name="index 8"/>
-    <w:lsdException w:uiPriority="0" w:name="index 9"/>
-    <w:lsdException w:uiPriority="0" w:name="toc 1"/>
-    <w:lsdException w:uiPriority="0" w:name="toc 2"/>
-    <w:lsdException w:qFormat="1" w:unhideWhenUsed="0" w:uiPriority="0" w:name="toc 3"/>
-    <w:lsdException w:uiPriority="0" w:name="toc 4"/>
-    <w:lsdException w:uiPriority="0" w:name="toc 5"/>
-    <w:lsdException w:uiPriority="0" w:name="toc 6"/>
-    <w:lsdException w:uiPriority="0" w:name="toc 7"/>
-    <w:lsdException w:uiPriority="0" w:name="toc 8"/>
-    <w:lsdException w:uiPriority="0" w:name="toc 9"/>
-    <w:lsdException w:uiPriority="0" w:name="Normal Indent"/>
-    <w:lsdException w:uiPriority="0" w:name="footnote text"/>
-    <w:lsdException w:uiPriority="0" w:name="annotation text"/>
-    <w:lsdException w:qFormat="1" w:unhideWhenUsed="0" w:uiPriority="0" w:semiHidden="0" w:name="header"/>
-    <w:lsdException w:qFormat="1" w:unhideWhenUsed="0" w:uiPriority="99" w:semiHidden="0" w:name="footer"/>
-    <w:lsdException w:uiPriority="0" w:name="index heading"/>
-    <w:lsdException w:qFormat="1" w:unhideWhenUsed="0" w:uiPriority="35" w:semiHidden="0" w:name="caption"/>
-    <w:lsdException w:uiPriority="0" w:name="table of figures"/>
-    <w:lsdException w:uiPriority="0" w:name="envelope address"/>
-    <w:lsdException w:uiPriority="0" w:name="envelope return"/>
-    <w:lsdException w:uiPriority="0" w:name="footnote reference"/>
-    <w:lsdException w:uiPriority="0" w:name="annotation reference"/>
-    <w:lsdException w:uiPriority="0" w:name="line number"/>
-    <w:lsdException w:qFormat="1" w:unhideWhenUsed="0" w:uiPriority="99" w:semiHidden="0" w:name="page number"/>
-    <w:lsdException w:uiPriority="0" w:name="endnote reference"/>
-    <w:lsdException w:uiPriority="0" w:name="endnote text"/>
-    <w:lsdException w:uiPriority="0" w:name="table of authorities"/>
-    <w:lsdException w:uiPriority="0" w:name="macro"/>
-    <w:lsdException w:uiPriority="0" w:name="toa heading"/>
-    <w:lsdException w:uiPriority="0" w:name="List"/>
-    <w:lsdException w:uiPriority="0" w:name="List Bullet"/>
-    <w:lsdException w:unhideWhenUsed="0" w:uiPriority="0" w:semiHidden="0" w:name="List Number"/>
-    <w:lsdException w:uiPriority="0" w:name="List 2"/>
-    <w:lsdException w:uiPriority="0" w:name="List 3"/>
-    <w:lsdException w:unhideWhenUsed="0" w:uiPriority="0" w:semiHidden="0" w:name="List 4"/>
-    <w:lsdException w:unhideWhenUsed="0" w:uiPriority="0" w:semiHidden="0" w:name="List 5"/>
-    <w:lsdException w:uiPriority="0" w:name="List Bullet 2"/>
-    <w:lsdException w:uiPriority="0" w:name="List Bullet 3"/>
-    <w:lsdException w:uiPriority="0" w:name="List Bullet 4"/>
-    <w:lsdException w:uiPriority="0" w:name="List Bullet 5"/>
-    <w:lsdException w:uiPriority="0" w:name="List Number 2"/>
-    <w:lsdException w:uiPriority="0" w:name="List Number 3"/>
-    <w:lsdException w:uiPriority="0" w:name="List Number 4"/>
-    <w:lsdException w:uiPriority="0" w:name="List Number 5"/>
-    <w:lsdException w:qFormat="1" w:unhideWhenUsed="0" w:uiPriority="10" w:semiHidden="0" w:name="Title"/>
-    <w:lsdException w:uiPriority="0" w:name="Closing"/>
-    <w:lsdException w:uiPriority="0" w:name="Signature"/>
-    <w:lsdException w:qFormat="1" w:uiPriority="1" w:semiHidden="0" w:name="Default Paragraph Font"/>
-    <w:lsdException w:qFormat="1" w:unhideWhenUsed="0" w:uiPriority="99" w:semiHidden="0" w:name="Body Text"/>
-    <w:lsdException w:qFormat="1" w:unhideWhenUsed="0" w:uiPriority="99" w:semiHidden="0" w:name="Body Text Indent"/>
-    <w:lsdException w:uiPriority="0" w:name="List Continue"/>
-    <w:lsdException w:uiPriority="0" w:name="List Continue 2"/>
-    <w:lsdException w:uiPriority="0" w:name="List Continue 3"/>
-    <w:lsdException w:uiPriority="0" w:name="List Continue 4"/>
-    <w:lsdException w:uiPriority="0" w:name="List Continue 5"/>
-    <w:lsdException w:uiPriority="0" w:name="Message Header"/>
-    <w:lsdException w:qFormat="1" w:unhideWhenUsed="0" w:uiPriority="11" w:semiHidden="0" w:name="Subtitle"/>
-    <w:lsdException w:unhideWhenUsed="0" w:uiPriority="0" w:semiHidden="0" w:name="Salutation"/>
-    <w:lsdException w:unhideWhenUsed="0" w:uiPriority="0" w:semiHidden="0" w:name="Date"/>
-    <w:lsdException w:unhideWhenUsed="0" w:uiPriority="0" w:semiHidden="0" w:name="Body Text First Indent"/>
-    <w:lsdException w:uiPriority="0" w:name="Body Text First Indent 2"/>
-    <w:lsdException w:uiPriority="0" w:name="Note Heading"/>
-    <w:lsdException w:qFormat="1" w:uiPriority="0" w:name="Body Text 2"/>
-    <w:lsdException w:uiPriority="0" w:name="Body Text 3"/>
-    <w:lsdException w:uiPriority="0" w:name="Body Text Indent 2"/>
-    <w:lsdException w:qFormat="1" w:uiPriority="0" w:name="Body Text Indent 3"/>
-    <w:lsdException w:uiPriority="0" w:name="Block Text"/>
-    <w:lsdException w:qFormat="1" w:uiPriority="99" w:semiHidden="0" w:name="Hyperlink"/>
-    <w:lsdException w:uiPriority="0" w:name="FollowedHyperlink"/>
-    <w:lsdException w:qFormat="1" w:unhideWhenUsed="0" w:uiPriority="22" w:semiHidden="0" w:name="Strong"/>
-    <w:lsdException w:qFormat="1" w:unhideWhenUsed="0" w:uiPriority="20" w:semiHidden="0" w:name="Emphasis"/>
-    <w:lsdException w:uiPriority="0" w:name="Document Map"/>
-    <w:lsdException w:qFormat="1" w:unhideWhenUsed="0" w:uiPriority="99" w:semiHidden="0" w:name="Plain Text"/>
-    <w:lsdException w:uiPriority="0" w:name="E-mail Signature"/>
-    <w:lsdException w:uiPriority="0" w:name="Normal (Web)"/>
-    <w:lsdException w:uiPriority="0" w:name="HTML Acronym"/>
-    <w:lsdException w:uiPriority="0" w:name="HTML Address"/>
-    <w:lsdException w:uiPriority="0" w:name="HTML Cite"/>
-    <w:lsdException w:uiPriority="0" w:name="HTML Code"/>
-    <w:lsdException w:uiPriority="0" w:name="HTML Definition"/>
-    <w:lsdException w:uiPriority="0" w:name="HTML Keyboard"/>
-    <w:lsdException w:uiPriority="0" w:name="HTML Preformatted"/>
-    <w:lsdException w:uiPriority="0" w:name="HTML Sample"/>
-    <w:lsdException w:uiPriority="0" w:name="HTML Typewriter"/>
-    <w:lsdException w:uiPriority="0" w:name="HTML Variable"/>
-    <w:lsdException w:qFormat="1" w:uiPriority="99" w:name="Normal Table"/>
-    <w:lsdException w:uiPriority="0" w:name="annotation subject"/>
-    <w:lsdException w:uiPriority="0" w:name="Table Simple 1"/>
-    <w:lsdException w:uiPriority="0" w:name="Table Simple 2"/>
-    <w:lsdException w:uiPriority="0" w:name="Table Simple 3"/>
-    <w:lsdException w:uiPriority="0" w:name="Table Classic 1"/>
-    <w:lsdException w:uiPriority="0" w:name="Table Classic 2"/>
-    <w:lsdException w:uiPriority="0" w:name="Table Classic 3"/>
-    <w:lsdException w:uiPriority="0" w:name="Table Classic 4"/>
-    <w:lsdException w:uiPriority="0" w:name="Table Colorful 1"/>
-    <w:lsdException w:uiPriority="0" w:name="Table Colorful 2"/>
-    <w:lsdException w:uiPriority="0" w:name="Table Colorful 3"/>
-    <w:lsdException w:uiPriority="0" w:name="Table Columns 1"/>
-    <w:lsdException w:uiPriority="0" w:name="Table Columns 2"/>
-    <w:lsdException w:uiPriority="0" w:name="Table Columns 3"/>
-    <w:lsdException w:uiPriority="0" w:name="Table Columns 4"/>
-    <w:lsdException w:uiPriority="0" w:name="Table Columns 5"/>
-    <w:lsdException w:uiPriority="0" w:name="Table Grid 1"/>
-    <w:lsdException w:uiPriority="0" w:name="Table Grid 2"/>
-    <w:lsdException w:uiPriority="0" w:name="Table Grid 3"/>
-    <w:lsdException w:uiPriority="0" w:name="Table Grid 4"/>
-    <w:lsdException w:uiPriority="0" w:name="Table Grid 5"/>
-    <w:lsdException w:uiPriority="0" w:name="Table Grid 6"/>
-    <w:lsdException w:uiPriority="0" w:name="Table Grid 7"/>
-    <w:lsdException w:uiPriority="0" w:name="Table Grid 8"/>
-    <w:lsdException w:uiPriority="0" w:name="Table List 1"/>
-    <w:lsdException w:uiPriority="0" w:name="Table List 2"/>
-    <w:lsdException w:uiPriority="0" w:name="Table List 3"/>
-    <w:lsdException w:uiPriority="0" w:name="Table List 4"/>
-    <w:lsdException w:uiPriority="0" w:name="Table List 5"/>
-    <w:lsdException w:uiPriority="0" w:name="Table List 6"/>
-    <w:lsdException w:uiPriority="0" w:name="Table List 7"/>
-    <w:lsdException w:uiPriority="0" w:name="Table List 8"/>
-    <w:lsdException w:uiPriority="0" w:name="Table 3D effects 1"/>
-    <w:lsdException w:uiPriority="0" w:name="Table 3D effects 2"/>
-    <w:lsdException w:uiPriority="0" w:name="Table 3D effects 3"/>
-    <w:lsdException w:uiPriority="0" w:name="Table Contemporary"/>
-    <w:lsdException w:uiPriority="0" w:name="Table Elegant"/>
-    <w:lsdException w:uiPriority="0" w:name="Table Professional"/>
-    <w:lsdException w:uiPriority="0" w:name="Table Subtle 1"/>
-    <w:lsdException w:uiPriority="0" w:name="Table Subtle 2"/>
-    <w:lsdException w:uiPriority="0" w:name="Table Web 1"/>
-    <w:lsdException w:uiPriority="0" w:name="Table Web 2"/>
-    <w:lsdException w:uiPriority="0" w:name="Table Web 3"/>
-    <w:lsdException w:qFormat="1" w:unhideWhenUsed="0" w:uiPriority="99" w:name="Balloon Text"/>
-    <w:lsdException w:qFormat="1" w:unhideWhenUsed="0" w:uiPriority="0" w:semiHidden="0" w:name="Table Grid"/>
-    <w:lsdException w:uiPriority="0" w:name="Table Theme"/>
-    <w:lsdException w:qFormat="1" w:unhideWhenUsed="0" w:uiPriority="1" w:semiHidden="0" w:name="No Spacing"/>
-    <w:lsdException w:unhideWhenUsed="0" w:uiPriority="60" w:semiHidden="0" w:name="Light Shading"/>
-    <w:lsdException w:unhideWhenUsed="0" w:uiPriority="61" w:semiHidden="0" w:name="Light List"/>
-    <w:lsdException w:unhideWhenUsed="0" w:uiPriority="62" w:semiHidden="0" w:name="Light Grid"/>
-    <w:lsdException w:unhideWhenUsed="0" w:uiPriority="63" w:semiHidden="0" w:name="Medium Shading 1"/>
-    <w:lsdException w:unhideWhenUsed="0" w:uiPriority="64" w:semiHidden="0" w:name="Medium Shading 2"/>
-    <w:lsdException w:unhideWhenUsed="0" w:uiPriority="65" w:semiHidden="0" w:name="Medium List 1"/>
-    <w:lsdException w:unhideWhenUsed="0" w:uiPriority="66" w:semiHidden="0" w:name="Medium List 2"/>
-    <w:lsdException w:unhideWhenUsed="0" w:uiPriority="67" w:semiHidden="0" w:name="Medium Grid 1"/>
-    <w:lsdException w:unhideWhenUsed="0" w:uiPriority="68" w:semiHidden="0" w:name="Medium Grid 2"/>
-    <w:lsdException w:unhideWhenUsed="0" w:uiPriority="69" w:semiHidden="0" w:name="Medium Grid 3"/>
-    <w:lsdException w:unhideWhenUsed="0" w:uiPriority="70" w:semiHidden="0" w:name="Dark List"/>
-    <w:lsdException w:unhideWhenUsed="0" w:uiPriority="71" w:semiHidden="0" w:name="Colorful Shading"/>
-    <w:lsdException w:unhideWhenUsed="0" w:uiPriority="72" w:semiHidden="0" w:name="Colorful List"/>
-    <w:lsdException w:unhideWhenUsed="0" w:uiPriority="73" w:semiHidden="0" w:name="Colorful Grid"/>
-    <w:lsdException w:unhideWhenUsed="0" w:uiPriority="60" w:semiHidden="0" w:name="Light Shading Accent 1"/>
-    <w:lsdException w:unhideWhenUsed="0" w:uiPriority="61" w:semiHidden="0" w:name="Light List Accent 1"/>
-    <w:lsdException w:unhideWhenUsed="0" w:uiPriority="62" w:semiHidden="0" w:name="Light Grid Accent 1"/>
-    <w:lsdException w:unhideWhenUsed="0" w:uiPriority="63" w:semiHidden="0" w:name="Medium Shading 1 Accent 1"/>
-    <w:lsdException w:unhideWhenUsed="0" w:uiPriority="64" w:semiHidden="0" w:name="Medium Shading 2 Accent 1"/>
-    <w:lsdException w:unhideWhenUsed="0" w:uiPriority="65" w:semiHidden="0" w:name="Medium List 1 Accent 1"/>
-    <w:lsdException w:qFormat="1" w:unhideWhenUsed="0" w:uiPriority="34" w:semiHidden="0" w:name="List Paragraph"/>
-    <w:lsdException w:unhideWhenUsed="0" w:uiPriority="66" w:semiHidden="0" w:name="Medium List 2 Accent 1"/>
-    <w:lsdException w:unhideWhenUsed="0" w:uiPriority="67" w:semiHidden="0" w:name="Medium Grid 1 Accent 1"/>
-    <w:lsdException w:unhideWhenUsed="0" w:uiPriority="68" w:semiHidden="0" w:name="Medium Grid 2 Accent 1"/>
-    <w:lsdException w:unhideWhenUsed="0" w:uiPriority="69" w:semiHidden="0" w:name="Medium Grid 3 Accent 1"/>
-    <w:lsdException w:unhideWhenUsed="0" w:uiPriority="70" w:semiHidden="0" w:name="Dark List Accent 1"/>
-    <w:lsdException w:unhideWhenUsed="0" w:uiPriority="71" w:semiHidden="0" w:name="Colorful Shading Accent 1"/>
-    <w:lsdException w:unhideWhenUsed="0" w:uiPriority="72" w:semiHidden="0" w:name="Colorful List Accent 1"/>
-    <w:lsdException w:unhideWhenUsed="0" w:uiPriority="73" w:semiHidden="0" w:name="Colorful Grid Accent 1"/>
-    <w:lsdException w:unhideWhenUsed="0" w:uiPriority="60" w:semiHidden="0" w:name="Light Shading Accent 2"/>
-    <w:lsdException w:unhideWhenUsed="0" w:uiPriority="61" w:semiHidden="0" w:name="Light List Accent 2"/>
-    <w:lsdException w:unhideWhenUsed="0" w:uiPriority="62" w:semiHidden="0" w:name="Light Grid Accent 2"/>
-    <w:lsdException w:unhideWhenUsed="0" w:uiPriority="63" w:semiHidden="0" w:name="Medium Shading 1 Accent 2"/>
-    <w:lsdException w:unhideWhenUsed="0" w:uiPriority="64" w:semiHidden="0" w:name="Medium Shading 2 Accent 2"/>
-    <w:lsdException w:unhideWhenUsed="0" w:uiPriority="65" w:semiHidden="0" w:name="Medium List 1 Accent 2"/>
-    <w:lsdException w:unhideWhenUsed="0" w:uiPriority="66" w:semiHidden="0" w:name="Medium List 2 Accent 2"/>
-    <w:lsdException w:unhideWhenUsed="0" w:uiPriority="67" w:semiHidden="0" w:name="Medium Grid 1 Accent 2"/>
-    <w:lsdException w:unhideWhenUsed="0" w:uiPriority="68" w:semiHidden="0" w:name="Medium Grid 2 Accent 2"/>
-    <w:lsdException w:unhideWhenUsed="0" w:uiPriority="69" w:semiHidden="0" w:name="Medium Grid 3 Accent 2"/>
-    <w:lsdException w:unhideWhenUsed="0" w:uiPriority="70" w:semiHidden="0" w:name="Dark List Accent 2"/>
-    <w:lsdException w:unhideWhenUsed="0" w:uiPriority="71" w:semiHidden="0" w:name="Colorful Shading Accent 2"/>
-    <w:lsdException w:unhideWhenUsed="0" w:uiPriority="72" w:semiHidden="0" w:name="Colorful List Accent 2"/>
-    <w:lsdException w:unhideWhenUsed="0" w:uiPriority="73" w:semiHidden="0" w:name="Colorful Grid Accent 2"/>
-    <w:lsdException w:unhideWhenUsed="0" w:uiPriority="60" w:semiHidden="0" w:name="Light Shading Accent 3"/>
-    <w:lsdException w:unhideWhenUsed="0" w:uiPriority="61" w:semiHidden="0" w:name="Light List Accent 3"/>
-    <w:lsdException w:unhideWhenUsed="0" w:uiPriority="62" w:semiHidden="0" w:name="Light Grid Accent 3"/>
-    <w:lsdException w:unhideWhenUsed="0" w:uiPriority="63" w:semiHidden="0" w:name="Medium Shading 1 Accent 3"/>
-    <w:lsdException w:unhideWhenUsed="0" w:uiPriority="64" w:semiHidden="0" w:name="Medium Shading 2 Accent 3"/>
-    <w:lsdException w:unhideWhenUsed="0" w:uiPriority="65" w:semiHidden="0" w:name="Medium List 1 Accent 3"/>
-    <w:lsdException w:unhideWhenUsed="0" w:uiPriority="66" w:semiHidden="0" w:name="Medium List 2 Accent 3"/>
-    <w:lsdException w:unhideWhenUsed="0" w:uiPriority="67" w:semiHidden="0" w:name="Medium Grid 1 Accent 3"/>
-    <w:lsdException w:unhideWhenUsed="0" w:uiPriority="68" w:semiHidden="0" w:name="Medium Grid 2 Accent 3"/>
-    <w:lsdException w:unhideWhenUsed="0" w:uiPriority="69" w:semiHidden="0" w:name="Medium Grid 3 Accent 3"/>
-    <w:lsdException w:unhideWhenUsed="0" w:uiPriority="70" w:semiHidden="0" w:name="Dark List Accent 3"/>
-    <w:lsdException w:unhideWhenUsed="0" w:uiPriority="71" w:semiHidden="0" w:name="Colorful Shading Accent 3"/>
-    <w:lsdException w:unhideWhenUsed="0" w:uiPriority="72" w:semiHidden="0" w:name="Colorful List Accent 3"/>
-    <w:lsdException w:unhideWhenUsed="0" w:uiPriority="73" w:semiHidden="0" w:name="Colorful Grid Accent 3"/>
-    <w:lsdException w:unhideWhenUsed="0" w:uiPriority="60" w:semiHidden="0" w:name="Light Shading Accent 4"/>
-    <w:lsdException w:unhideWhenUsed="0" w:uiPriority="61" w:semiHidden="0" w:name="Light List Accent 4"/>
-    <w:lsdException w:unhideWhenUsed="0" w:uiPriority="62" w:semiHidden="0" w:name="Light Grid Accent 4"/>
-    <w:lsdException w:unhideWhenUsed="0" w:uiPriority="63" w:semiHidden="0" w:name="Medium Shading 1 Accent 4"/>
-    <w:lsdException w:unhideWhenUsed="0" w:uiPriority="64" w:semiHidden="0" w:name="Medium Shading 2 Accent 4"/>
-    <w:lsdException w:unhideWhenUsed="0" w:uiPriority="65" w:semiHidden="0" w:name="Medium List 1 Accent 4"/>
-    <w:lsdException w:unhideWhenUsed="0" w:uiPriority="66" w:semiHidden="0" w:name="Medium List 2 Accent 4"/>
-    <w:lsdException w:unhideWhenUsed="0" w:uiPriority="67" w:semiHidden="0" w:name="Medium Grid 1 Accent 4"/>
-    <w:lsdException w:unhideWhenUsed="0" w:uiPriority="68" w:semiHidden="0" w:name="Medium Grid 2 Accent 4"/>
-    <w:lsdException w:unhideWhenUsed="0" w:uiPriority="69" w:semiHidden="0" w:name="Medium Grid 3 Accent 4"/>
-    <w:lsdException w:unhideWhenUsed="0" w:uiPriority="70" w:semiHidden="0" w:name="Dark List Accent 4"/>
-    <w:lsdException w:unhideWhenUsed="0" w:uiPriority="71" w:semiHidden="0" w:name="Colorful Shading Accent 4"/>
-    <w:lsdException w:unhideWhenUsed="0" w:uiPriority="72" w:semiHidden="0" w:name="Colorful List Accent 4"/>
-    <w:lsdException w:unhideWhenUsed="0" w:uiPriority="73" w:semiHidden="0" w:name="Colorful Grid Accent 4"/>
-    <w:lsdException w:unhideWhenUsed="0" w:uiPriority="60" w:semiHidden="0" w:name="Light Shading Accent 5"/>
-    <w:lsdException w:unhideWhenUsed="0" w:uiPriority="61" w:semiHidden="0" w:name="Light List Accent 5"/>
-    <w:lsdException w:unhideWhenUsed="0" w:uiPriority="62" w:semiHidden="0" w:name="Light Grid Accent 5"/>
-    <w:lsdException w:unhideWhenUsed="0" w:uiPriority="63" w:semiHidden="0" w:name="Medium Shading 1 Accent 5"/>
-    <w:lsdException w:unhideWhenUsed="0" w:uiPriority="64" w:semiHidden="0" w:name="Medium Shading 2 Accent 5"/>
-    <w:lsdException w:unhideWhenUsed="0" w:uiPriority="65" w:semiHidden="0" w:name="Medium List 1 Accent 5"/>
-    <w:lsdException w:unhideWhenUsed="0" w:uiPriority="66" w:semiHidden="0" w:name="Medium List 2 Accent 5"/>
-    <w:lsdException w:unhideWhenUsed="0" w:uiPriority="67" w:semiHidden="0" w:name="Medium Grid 1 Accent 5"/>
-    <w:lsdException w:unhideWhenUsed="0" w:uiPriority="68" w:semiHidden="0" w:name="Medium Grid 2 Accent 5"/>
-    <w:lsdException w:unhideWhenUsed="0" w:uiPriority="69" w:semiHidden="0" w:name="Medium Grid 3 Accent 5"/>
-    <w:lsdException w:unhideWhenUsed="0" w:uiPriority="70" w:semiHidden="0" w:name="Dark List Accent 5"/>
-    <w:lsdException w:unhideWhenUsed="0" w:uiPriority="71" w:semiHidden="0" w:name="Colorful Shading Accent 5"/>
-    <w:lsdException w:unhideWhenUsed="0" w:uiPriority="72" w:semiHidden="0" w:name="Colorful List Accent 5"/>
-    <w:lsdException w:unhideWhenUsed="0" w:uiPriority="73" w:semiHidden="0" w:name="Colorful Grid Accent 5"/>
-    <w:lsdException w:unhideWhenUsed="0" w:uiPriority="60" w:semiHidden="0" w:name="Light Shading Accent 6"/>
-    <w:lsdException w:unhideWhenUsed="0" w:uiPriority="61" w:semiHidden="0" w:name="Light List Accent 6"/>
-    <w:lsdException w:unhideWhenUsed="0" w:uiPriority="62" w:semiHidden="0" w:name="Light Grid Accent 6"/>
-    <w:lsdException w:unhideWhenUsed="0" w:uiPriority="63" w:semiHidden="0" w:name="Medium Shading 1 Accent 6"/>
-    <w:lsdException w:unhideWhenUsed="0" w:uiPriority="64" w:semiHidden="0" w:name="Medium Shading 2 Accent 6"/>
-    <w:lsdException w:unhideWhenUsed="0" w:uiPriority="65" w:semiHidden="0" w:name="Medium List 1 Accent 6"/>
-    <w:lsdException w:unhideWhenUsed="0" w:uiPriority="66" w:semiHidden="0" w:name="Medium List 2 Accent 6"/>
-    <w:lsdException w:unhideWhenUsed="0" w:uiPriority="67" w:semiHidden="0" w:name="Medium Grid 1 Accent 6"/>
-    <w:lsdException w:unhideWhenUsed="0" w:uiPriority="68" w:semiHidden="0" w:name="Medium Grid 2 Accent 6"/>
-    <w:lsdException w:unhideWhenUsed="0" w:uiPriority="69" w:semiHidden="0" w:name="Medium Grid 3 Accent 6"/>
-    <w:lsdException w:unhideWhenUsed="0" w:uiPriority="70" w:semiHidden="0" w:name="Dark List Accent 6"/>
-    <w:lsdException w:unhideWhenUsed="0" w:uiPriority="71" w:semiHidden="0" w:name="Colorful Shading Accent 6"/>
-    <w:lsdException w:unhideWhenUsed="0" w:uiPriority="72" w:semiHidden="0" w:name="Colorful List Accent 6"/>
-    <w:lsdException w:unhideWhenUsed="0" w:uiPriority="73" w:semiHidden="0" w:name="Colorful Grid Accent 6"/>
+  <w:latentStyles w:defLockedState="0" w:defUIPriority="0" w:defSemiHidden="0" w:defUnhideWhenUsed="0" w:defQFormat="0" w:count="376">
+    <w:lsdException w:name="Normal" w:qFormat="1"/>
+    <w:lsdException w:name="heading 1" w:uiPriority="9" w:qFormat="1"/>
+    <w:lsdException w:name="heading 2" w:uiPriority="9" w:qFormat="1"/>
+    <w:lsdException w:name="heading 3" w:uiPriority="9" w:qFormat="1"/>
+    <w:lsdException w:name="heading 4" w:uiPriority="9" w:qFormat="1"/>
+    <w:lsdException w:name="heading 5" w:uiPriority="9" w:qFormat="1"/>
+    <w:lsdException w:name="heading 6" w:uiPriority="9" w:qFormat="1"/>
+    <w:lsdException w:name="heading 7" w:uiPriority="9" w:qFormat="1"/>
+    <w:lsdException w:name="heading 8" w:uiPriority="9" w:qFormat="1"/>
+    <w:lsdException w:name="heading 9" w:uiPriority="9" w:qFormat="1"/>
+    <w:lsdException w:name="index 1" w:semiHidden="1" w:unhideWhenUsed="1"/>
+    <w:lsdException w:name="index 2" w:semiHidden="1" w:unhideWhenUsed="1"/>
+    <w:lsdException w:name="index 3" w:semiHidden="1" w:unhideWhenUsed="1"/>
+    <w:lsdException w:name="index 4" w:semiHidden="1" w:unhideWhenUsed="1"/>
+    <w:lsdException w:name="index 5" w:semiHidden="1" w:unhideWhenUsed="1"/>
+    <w:lsdException w:name="index 6" w:semiHidden="1" w:unhideWhenUsed="1"/>
+    <w:lsdException w:name="index 7" w:semiHidden="1" w:unhideWhenUsed="1"/>
+    <w:lsdException w:name="index 8" w:semiHidden="1" w:unhideWhenUsed="1"/>
+    <w:lsdException w:name="index 9" w:semiHidden="1" w:unhideWhenUsed="1"/>
+    <w:lsdException w:name="toc 1" w:semiHidden="1" w:unhideWhenUsed="1"/>
+    <w:lsdException w:name="toc 2" w:semiHidden="1" w:unhideWhenUsed="1"/>
+    <w:lsdException w:name="toc 3" w:semiHidden="1" w:qFormat="1"/>
+    <w:lsdException w:name="toc 4" w:semiHidden="1" w:unhideWhenUsed="1"/>
+    <w:lsdException w:name="toc 5" w:semiHidden="1" w:unhideWhenUsed="1"/>
+    <w:lsdException w:name="toc 6" w:semiHidden="1" w:unhideWhenUsed="1"/>
+    <w:lsdException w:name="toc 7" w:semiHidden="1" w:unhideWhenUsed="1"/>
+    <w:lsdException w:name="toc 8" w:semiHidden="1" w:unhideWhenUsed="1"/>
+    <w:lsdException w:name="toc 9" w:semiHidden="1" w:unhideWhenUsed="1"/>
+    <w:lsdException w:name="Normal Indent" w:semiHidden="1" w:unhideWhenUsed="1"/>
+    <w:lsdException w:name="footnote text" w:semiHidden="1" w:unhideWhenUsed="1"/>
+    <w:lsdException w:name="annotation text" w:semiHidden="1" w:unhideWhenUsed="1"/>
+    <w:lsdException w:name="header" w:qFormat="1"/>
+    <w:lsdException w:name="footer" w:uiPriority="99" w:qFormat="1"/>
+    <w:lsdException w:name="index heading" w:semiHidden="1" w:unhideWhenUsed="1"/>
+    <w:lsdException w:name="caption" w:uiPriority="35" w:qFormat="1"/>
+    <w:lsdException w:name="table of figures" w:semiHidden="1" w:unhideWhenUsed="1"/>
+    <w:lsdException w:name="envelope address" w:semiHidden="1" w:unhideWhenUsed="1"/>
+    <w:lsdException w:name="envelope return" w:semiHidden="1" w:unhideWhenUsed="1"/>
+    <w:lsdException w:name="footnote reference" w:semiHidden="1" w:unhideWhenUsed="1"/>
+    <w:lsdException w:name="annotation reference" w:semiHidden="1" w:unhideWhenUsed="1"/>
+    <w:lsdException w:name="line number" w:semiHidden="1" w:unhideWhenUsed="1"/>
+    <w:lsdException w:name="page number" w:uiPriority="99" w:qFormat="1"/>
+    <w:lsdException w:name="endnote reference" w:semiHidden="1" w:unhideWhenUsed="1"/>
+    <w:lsdException w:name="endnote text" w:semiHidden="1" w:unhideWhenUsed="1"/>
+    <w:lsdException w:name="table of authorities" w:semiHidden="1" w:unhideWhenUsed="1"/>
+    <w:lsdException w:name="macro" w:semiHidden="1" w:unhideWhenUsed="1"/>
+    <w:lsdException w:name="toa heading" w:semiHidden="1" w:unhideWhenUsed="1"/>
+    <w:lsdException w:name="List" w:semiHidden="1" w:unhideWhenUsed="1"/>
+    <w:lsdException w:name="List Bullet" w:semiHidden="1" w:unhideWhenUsed="1"/>
+    <w:lsdException w:name="List 2" w:semiHidden="1" w:unhideWhenUsed="1"/>
+    <w:lsdException w:name="List 3" w:semiHidden="1" w:unhideWhenUsed="1"/>
+    <w:lsdException w:name="List Bullet 2" w:semiHidden="1" w:unhideWhenUsed="1"/>
+    <w:lsdException w:name="List Bullet 3" w:semiHidden="1" w:unhideWhenUsed="1"/>
+    <w:lsdException w:name="List Bullet 4" w:semiHidden="1" w:unhideWhenUsed="1"/>
+    <w:lsdException w:name="List Bullet 5" w:semiHidden="1" w:unhideWhenUsed="1"/>
+    <w:lsdException w:name="List Number 2" w:semiHidden="1" w:unhideWhenUsed="1"/>
+    <w:lsdException w:name="List Number 3" w:semiHidden="1" w:unhideWhenUsed="1"/>
+    <w:lsdException w:name="List Number 4" w:semiHidden="1" w:unhideWhenUsed="1"/>
+    <w:lsdException w:name="List Number 5" w:semiHidden="1" w:unhideWhenUsed="1"/>
+    <w:lsdException w:name="Title" w:uiPriority="10" w:qFormat="1"/>
+    <w:lsdException w:name="Closing" w:semiHidden="1" w:unhideWhenUsed="1"/>
+    <w:lsdException w:name="Signature" w:semiHidden="1" w:unhideWhenUsed="1"/>
+    <w:lsdException w:name="Default Paragraph Font" w:uiPriority="1" w:unhideWhenUsed="1" w:qFormat="1"/>
+    <w:lsdException w:name="Body Text" w:uiPriority="99" w:qFormat="1"/>
+    <w:lsdException w:name="Body Text Indent" w:uiPriority="99" w:qFormat="1"/>
+    <w:lsdException w:name="List Continue" w:semiHidden="1" w:unhideWhenUsed="1"/>
+    <w:lsdException w:name="List Continue 2" w:semiHidden="1" w:unhideWhenUsed="1"/>
+    <w:lsdException w:name="List Continue 3" w:semiHidden="1" w:unhideWhenUsed="1"/>
+    <w:lsdException w:name="List Continue 4" w:semiHidden="1" w:unhideWhenUsed="1"/>
+    <w:lsdException w:name="List Continue 5" w:semiHidden="1" w:unhideWhenUsed="1"/>
+    <w:lsdException w:name="Message Header" w:semiHidden="1" w:unhideWhenUsed="1"/>
+    <w:lsdException w:name="Subtitle" w:uiPriority="11" w:qFormat="1"/>
+    <w:lsdException w:name="Body Text First Indent 2" w:semiHidden="1" w:unhideWhenUsed="1"/>
+    <w:lsdException w:name="Note Heading" w:semiHidden="1" w:unhideWhenUsed="1"/>
+    <w:lsdException w:name="Body Text 2" w:semiHidden="1" w:unhideWhenUsed="1" w:qFormat="1"/>
+    <w:lsdException w:name="Body Text 3" w:semiHidden="1" w:unhideWhenUsed="1"/>
+    <w:lsdException w:name="Body Text Indent 2" w:semiHidden="1" w:unhideWhenUsed="1"/>
+    <w:lsdException w:name="Body Text Indent 3" w:semiHidden="1" w:unhideWhenUsed="1" w:qFormat="1"/>
+    <w:lsdException w:name="Block Text" w:semiHidden="1" w:unhideWhenUsed="1"/>
+    <w:lsdException w:name="Hyperlink" w:uiPriority="99" w:unhideWhenUsed="1" w:qFormat="1"/>
+    <w:lsdException w:name="FollowedHyperlink" w:semiHidden="1" w:unhideWhenUsed="1"/>
+    <w:lsdException w:name="Strong" w:uiPriority="22" w:qFormat="1"/>
+    <w:lsdException w:name="Emphasis" w:uiPriority="20" w:qFormat="1"/>
+    <w:lsdException w:name="Document Map" w:semiHidden="1" w:unhideWhenUsed="1"/>
+    <w:lsdException w:name="Plain Text" w:uiPriority="99" w:qFormat="1"/>
+    <w:lsdException w:name="E-mail Signature" w:semiHidden="1" w:unhideWhenUsed="1"/>
+    <w:lsdException w:name="HTML Top of Form" w:semiHidden="1" w:uiPriority="99" w:unhideWhenUsed="1"/>
+    <w:lsdException w:name="HTML Bottom of Form" w:semiHidden="1" w:uiPriority="99" w:unhideWhenUsed="1"/>
+    <w:lsdException w:name="Normal (Web)" w:semiHidden="1" w:unhideWhenUsed="1"/>
+    <w:lsdException w:name="HTML Acronym" w:semiHidden="1" w:unhideWhenUsed="1"/>
+    <w:lsdException w:name="HTML Address" w:semiHidden="1" w:unhideWhenUsed="1"/>
+    <w:lsdException w:name="HTML Cite" w:semiHidden="1" w:unhideWhenUsed="1"/>
+    <w:lsdException w:name="HTML Code" w:semiHidden="1" w:unhideWhenUsed="1"/>
+    <w:lsdException w:name="HTML Definition" w:semiHidden="1" w:unhideWhenUsed="1"/>
+    <w:lsdException w:name="HTML Keyboard" w:semiHidden="1" w:unhideWhenUsed="1"/>
+    <w:lsdException w:name="HTML Preformatted" w:semiHidden="1" w:unhideWhenUsed="1"/>
+    <w:lsdException w:name="HTML Sample" w:semiHidden="1" w:unhideWhenUsed="1"/>
+    <w:lsdException w:name="HTML Typewriter" w:semiHidden="1" w:unhideWhenUsed="1"/>
+    <w:lsdException w:name="HTML Variable" w:semiHidden="1" w:unhideWhenUsed="1"/>
+    <w:lsdException w:name="Normal Table" w:semiHidden="1" w:uiPriority="99" w:unhideWhenUsed="1" w:qFormat="1"/>
+    <w:lsdException w:name="annotation subject" w:semiHidden="1" w:unhideWhenUsed="1"/>
+    <w:lsdException w:name="No List" w:semiHidden="1" w:uiPriority="99" w:unhideWhenUsed="1"/>
+    <w:lsdException w:name="Outline List 1" w:semiHidden="1" w:uiPriority="99" w:unhideWhenUsed="1"/>
+    <w:lsdException w:name="Outline List 2" w:semiHidden="1" w:uiPriority="99" w:unhideWhenUsed="1"/>
+    <w:lsdException w:name="Outline List 3" w:semiHidden="1" w:uiPriority="99" w:unhideWhenUsed="1"/>
+    <w:lsdException w:name="Table Simple 1" w:semiHidden="1" w:unhideWhenUsed="1"/>
+    <w:lsdException w:name="Table Simple 2" w:semiHidden="1" w:unhideWhenUsed="1"/>
+    <w:lsdException w:name="Table Simple 3" w:semiHidden="1" w:unhideWhenUsed="1"/>
+    <w:lsdException w:name="Table Classic 1" w:semiHidden="1" w:unhideWhenUsed="1"/>
+    <w:lsdException w:name="Table Classic 2" w:semiHidden="1" w:unhideWhenUsed="1"/>
+    <w:lsdException w:name="Table Classic 3" w:semiHidden="1" w:unhideWhenUsed="1"/>
+    <w:lsdException w:name="Table Classic 4" w:semiHidden="1" w:unhideWhenUsed="1"/>
+    <w:lsdException w:name="Table Colorful 1" w:semiHidden="1" w:unhideWhenUsed="1"/>
+    <w:lsdException w:name="Table Colorful 2" w:semiHidden="1" w:unhideWhenUsed="1"/>
+    <w:lsdException w:name="Table Colorful 3" w:semiHidden="1" w:unhideWhenUsed="1"/>
+    <w:lsdException w:name="Table Columns 1" w:semiHidden="1" w:unhideWhenUsed="1"/>
+    <w:lsdException w:name="Table Columns 2" w:semiHidden="1" w:unhideWhenUsed="1"/>
+    <w:lsdException w:name="Table Columns 3" w:semiHidden="1" w:unhideWhenUsed="1"/>
+    <w:lsdException w:name="Table Columns 4" w:semiHidden="1" w:unhideWhenUsed="1"/>
+    <w:lsdException w:name="Table Columns 5" w:semiHidden="1" w:unhideWhenUsed="1"/>
+    <w:lsdException w:name="Table Grid 1" w:semiHidden="1" w:unhideWhenUsed="1"/>
+    <w:lsdException w:name="Table Grid 2" w:semiHidden="1" w:unhideWhenUsed="1"/>
+    <w:lsdException w:name="Table Grid 3" w:semiHidden="1" w:unhideWhenUsed="1"/>
+    <w:lsdException w:name="Table Grid 4" w:semiHidden="1" w:unhideWhenUsed="1"/>
+    <w:lsdException w:name="Table Grid 5" w:semiHidden="1" w:unhideWhenUsed="1"/>
+    <w:lsdException w:name="Table Grid 6" w:semiHidden="1" w:unhideWhenUsed="1"/>
+    <w:lsdException w:name="Table Grid 7" w:semiHidden="1" w:unhideWhenUsed="1"/>
+    <w:lsdException w:name="Table Grid 8" w:semiHidden="1" w:unhideWhenUsed="1"/>
+    <w:lsdException w:name="Table List 1" w:semiHidden="1" w:unhideWhenUsed="1"/>
+    <w:lsdException w:name="Table List 2" w:semiHidden="1" w:unhideWhenUsed="1"/>
+    <w:lsdException w:name="Table List 3" w:semiHidden="1" w:unhideWhenUsed="1"/>
+    <w:lsdException w:name="Table List 4" w:semiHidden="1" w:unhideWhenUsed="1"/>
+    <w:lsdException w:name="Table List 5" w:semiHidden="1" w:unhideWhenUsed="1"/>
+    <w:lsdException w:name="Table List 6" w:semiHidden="1" w:unhideWhenUsed="1"/>
+    <w:lsdException w:name="Table List 7" w:semiHidden="1" w:unhideWhenUsed="1"/>
+    <w:lsdException w:name="Table List 8" w:semiHidden="1" w:unhideWhenUsed="1"/>
+    <w:lsdException w:name="Table 3D effects 1" w:semiHidden="1" w:unhideWhenUsed="1"/>
+    <w:lsdException w:name="Table 3D effects 2" w:semiHidden="1" w:unhideWhenUsed="1"/>
+    <w:lsdException w:name="Table 3D effects 3" w:semiHidden="1" w:unhideWhenUsed="1"/>
+    <w:lsdException w:name="Table Contemporary" w:semiHidden="1" w:unhideWhenUsed="1"/>
+    <w:lsdException w:name="Table Elegant" w:semiHidden="1" w:unhideWhenUsed="1"/>
+    <w:lsdException w:name="Table Professional" w:semiHidden="1" w:unhideWhenUsed="1"/>
+    <w:lsdException w:name="Table Subtle 1" w:semiHidden="1" w:unhideWhenUsed="1"/>
+    <w:lsdException w:name="Table Subtle 2" w:semiHidden="1" w:unhideWhenUsed="1"/>
+    <w:lsdException w:name="Table Web 1" w:semiHidden="1" w:unhideWhenUsed="1"/>
+    <w:lsdException w:name="Table Web 2" w:semiHidden="1" w:unhideWhenUsed="1"/>
+    <w:lsdException w:name="Table Web 3" w:semiHidden="1" w:unhideWhenUsed="1"/>
+    <w:lsdException w:name="Balloon Text" w:semiHidden="1" w:uiPriority="99" w:qFormat="1"/>
+    <w:lsdException w:name="Table Grid" w:qFormat="1"/>
+    <w:lsdException w:name="Table Theme" w:semiHidden="1" w:unhideWhenUsed="1"/>
+    <w:lsdException w:name="Placeholder Text" w:semiHidden="1" w:uiPriority="99" w:unhideWhenUsed="1"/>
+    <w:lsdException w:name="No Spacing" w:uiPriority="1" w:qFormat="1"/>
+    <w:lsdException w:name="Light Shading" w:uiPriority="60"/>
+    <w:lsdException w:name="Light List" w:uiPriority="61"/>
+    <w:lsdException w:name="Light Grid" w:uiPriority="62"/>
+    <w:lsdException w:name="Medium Shading 1" w:uiPriority="63"/>
+    <w:lsdException w:name="Medium Shading 2" w:uiPriority="64"/>
+    <w:lsdException w:name="Medium List 1" w:uiPriority="65"/>
+    <w:lsdException w:name="Medium List 2" w:uiPriority="66"/>
+    <w:lsdException w:name="Medium Grid 1" w:uiPriority="67"/>
+    <w:lsdException w:name="Medium Grid 2" w:uiPriority="68"/>
+    <w:lsdException w:name="Medium Grid 3" w:uiPriority="69"/>
+    <w:lsdException w:name="Dark List" w:uiPriority="70"/>
+    <w:lsdException w:name="Colorful Shading" w:uiPriority="71"/>
+    <w:lsdException w:name="Colorful List" w:uiPriority="72"/>
+    <w:lsdException w:name="Colorful Grid" w:uiPriority="73"/>
+    <w:lsdException w:name="Light Shading Accent 1" w:uiPriority="60"/>
+    <w:lsdException w:name="Light List Accent 1" w:uiPriority="61"/>
+    <w:lsdException w:name="Light Grid Accent 1" w:uiPriority="62"/>
+    <w:lsdException w:name="Medium Shading 1 Accent 1" w:uiPriority="63"/>
+    <w:lsdException w:name="Medium Shading 2 Accent 1" w:uiPriority="64"/>
+    <w:lsdException w:name="Medium List 1 Accent 1" w:uiPriority="65"/>
+    <w:lsdException w:name="Revision" w:semiHidden="1" w:uiPriority="99" w:unhideWhenUsed="1"/>
+    <w:lsdException w:name="List Paragraph" w:uiPriority="34" w:qFormat="1"/>
+    <w:lsdException w:name="Quote" w:semiHidden="1" w:uiPriority="99" w:unhideWhenUsed="1"/>
+    <w:lsdException w:name="Intense Quote" w:semiHidden="1" w:uiPriority="99" w:unhideWhenUsed="1"/>
+    <w:lsdException w:name="Medium List 2 Accent 1" w:uiPriority="66"/>
+    <w:lsdException w:name="Medium Grid 1 Accent 1" w:uiPriority="67"/>
+    <w:lsdException w:name="Medium Grid 2 Accent 1" w:uiPriority="68"/>
+    <w:lsdException w:name="Medium Grid 3 Accent 1" w:uiPriority="69"/>
+    <w:lsdException w:name="Dark List Accent 1" w:uiPriority="70"/>
+    <w:lsdException w:name="Colorful Shading Accent 1" w:uiPriority="71"/>
+    <w:lsdException w:name="Colorful List Accent 1" w:uiPriority="72"/>
+    <w:lsdException w:name="Colorful Grid Accent 1" w:uiPriority="73"/>
+    <w:lsdException w:name="Light Shading Accent 2" w:uiPriority="60"/>
+    <w:lsdException w:name="Light List Accent 2" w:uiPriority="61"/>
+    <w:lsdException w:name="Light Grid Accent 2" w:uiPriority="62"/>
+    <w:lsdException w:name="Medium Shading 1 Accent 2" w:uiPriority="63"/>
+    <w:lsdException w:name="Medium Shading 2 Accent 2" w:uiPriority="64"/>
+    <w:lsdException w:name="Medium List 1 Accent 2" w:uiPriority="65"/>
+    <w:lsdException w:name="Medium List 2 Accent 2" w:uiPriority="66"/>
+    <w:lsdException w:name="Medium Grid 1 Accent 2" w:uiPriority="67"/>
+    <w:lsdException w:name="Medium Grid 2 Accent 2" w:uiPriority="68"/>
+    <w:lsdException w:name="Medium Grid 3 Accent 2" w:uiPriority="69"/>
+    <w:lsdException w:name="Dark List Accent 2" w:uiPriority="70"/>
+    <w:lsdException w:name="Colorful Shading Accent 2" w:uiPriority="71"/>
+    <w:lsdException w:name="Colorful List Accent 2" w:uiPriority="72"/>
+    <w:lsdException w:name="Colorful Grid Accent 2" w:uiPriority="73"/>
+    <w:lsdException w:name="Light Shading Accent 3" w:uiPriority="60"/>
+    <w:lsdException w:name="Light List Accent 3" w:uiPriority="61"/>
+    <w:lsdException w:name="Light Grid Accent 3" w:uiPriority="62"/>
+    <w:lsdException w:name="Medium Shading 1 Accent 3" w:uiPriority="63"/>
+    <w:lsdException w:name="Medium Shading 2 Accent 3" w:uiPriority="64"/>
+    <w:lsdException w:name="Medium List 1 Accent 3" w:uiPriority="65"/>
+    <w:lsdException w:name="Medium List 2 Accent 3" w:uiPriority="66"/>
+    <w:lsdException w:name="Medium Grid 1 Accent 3" w:uiPriority="67"/>
+    <w:lsdException w:name="Medium Grid 2 Accent 3" w:uiPriority="68"/>
+    <w:lsdException w:name="Medium Grid 3 Accent 3" w:uiPriority="69"/>
+    <w:lsdException w:name="Dark List Accent 3" w:uiPriority="70"/>
+    <w:lsdException w:name="Colorful Shading Accent 3" w:uiPriority="71"/>
+    <w:lsdException w:name="Colorful List Accent 3" w:uiPriority="72"/>
+    <w:lsdException w:name="Colorful Grid Accent 3" w:uiPriority="73"/>
+    <w:lsdException w:name="Light Shading Accent 4" w:uiPriority="60"/>
+    <w:lsdException w:name="Light List Accent 4" w:uiPriority="61"/>
+    <w:lsdException w:name="Light Grid Accent 4" w:uiPriority="62"/>
+    <w:lsdException w:name="Medium Shading 1 Accent 4" w:uiPriority="63"/>
+    <w:lsdException w:name="Medium Shading 2 Accent 4" w:uiPriority="64"/>
+    <w:lsdException w:name="Medium List 1 Accent 4" w:uiPriority="65"/>
+    <w:lsdException w:name="Medium List 2 Accent 4" w:uiPriority="66"/>
+    <w:lsdException w:name="Medium Grid 1 Accent 4" w:uiPriority="67"/>
+    <w:lsdException w:name="Medium Grid 2 Accent 4" w:uiPriority="68"/>
+    <w:lsdException w:name="Medium Grid 3 Accent 4" w:uiPriority="69"/>
+    <w:lsdException w:name="Dark List Accent 4" w:uiPriority="70"/>
+    <w:lsdException w:name="Colorful Shading Accent 4" w:uiPriority="71"/>
+    <w:lsdException w:name="Colorful List Accent 4" w:uiPriority="72"/>
+    <w:lsdException w:name="Colorful Grid Accent 4" w:uiPriority="73"/>
+    <w:lsdException w:name="Light Shading Accent 5" w:uiPriority="60"/>
+    <w:lsdException w:name="Light List Accent 5" w:uiPriority="61"/>
+    <w:lsdException w:name="Light Grid Accent 5" w:uiPriority="62"/>
+    <w:lsdException w:name="Medium Shading 1 Accent 5" w:uiPriority="63"/>
+    <w:lsdException w:name="Medium Shading 2 Accent 5" w:uiPriority="64"/>
+    <w:lsdException w:name="Medium List 1 Accent 5" w:uiPriority="65"/>
+    <w:lsdException w:name="Medium List 2 Accent 5" w:uiPriority="66"/>
+    <w:lsdException w:name="Medium Grid 1 Accent 5" w:uiPriority="67"/>
+    <w:lsdException w:name="Medium Grid 2 Accent 5" w:uiPriority="68"/>
+    <w:lsdException w:name="Medium Grid 3 Accent 5" w:uiPriority="69"/>
+    <w:lsdException w:name="Dark List Accent 5" w:uiPriority="70"/>
+    <w:lsdException w:name="Colorful Shading Accent 5" w:uiPriority="71"/>
+    <w:lsdException w:name="Colorful List Accent 5" w:uiPriority="72"/>
+    <w:lsdException w:name="Colorful Grid Accent 5" w:uiPriority="73"/>
+    <w:lsdException w:name="Light Shading Accent 6" w:uiPriority="60"/>
+    <w:lsdException w:name="Light List Accent 6" w:uiPriority="61"/>
+    <w:lsdException w:name="Light Grid Accent 6" w:uiPriority="62"/>
+    <w:lsdException w:name="Medium Shading 1 Accent 6" w:uiPriority="63"/>
+    <w:lsdException w:name="Medium Shading 2 Accent 6" w:uiPriority="64"/>
+    <w:lsdException w:name="Medium List 1 Accent 6" w:uiPriority="65"/>
+    <w:lsdException w:name="Medium List 2 Accent 6" w:uiPriority="66"/>
+    <w:lsdException w:name="Medium Grid 1 Accent 6" w:uiPriority="67"/>
+    <w:lsdException w:name="Medium Grid 2 Accent 6" w:uiPriority="68"/>
+    <w:lsdException w:name="Medium Grid 3 Accent 6" w:uiPriority="69"/>
+    <w:lsdException w:name="Dark List Accent 6" w:uiPriority="70"/>
+    <w:lsdException w:name="Colorful Shading Accent 6" w:uiPriority="71"/>
+    <w:lsdException w:name="Colorful List Accent 6" w:uiPriority="72"/>
+    <w:lsdException w:name="Colorful Grid Accent 6" w:uiPriority="73"/>
+    <w:lsdException w:name="Subtle Emphasis" w:uiPriority="19" w:qFormat="1"/>
+    <w:lsdException w:name="Intense Emphasis" w:uiPriority="21" w:qFormat="1"/>
+    <w:lsdException w:name="Subtle Reference" w:uiPriority="31" w:qFormat="1"/>
+    <w:lsdException w:name="Intense Reference" w:uiPriority="32" w:qFormat="1"/>
+    <w:lsdException w:name="Book Title" w:uiPriority="33" w:qFormat="1"/>
+    <w:lsdException w:name="Bibliography" w:semiHidden="1" w:uiPriority="37" w:unhideWhenUsed="1"/>
+    <w:lsdException w:name="TOC Heading" w:semiHidden="1" w:uiPriority="39" w:unhideWhenUsed="1" w:qFormat="1"/>
+    <w:lsdException w:name="Plain Table 1" w:uiPriority="41"/>
+    <w:lsdException w:name="Plain Table 2" w:uiPriority="42"/>
+    <w:lsdException w:name="Plain Table 3" w:uiPriority="43"/>
+    <w:lsdException w:name="Plain Table 4" w:uiPriority="44"/>
+    <w:lsdException w:name="Plain Table 5" w:uiPriority="45"/>
+    <w:lsdException w:name="Grid Table Light" w:uiPriority="40"/>
+    <w:lsdException w:name="Grid Table 1 Light" w:uiPriority="46"/>
+    <w:lsdException w:name="Grid Table 2" w:uiPriority="47"/>
+    <w:lsdException w:name="Grid Table 3" w:uiPriority="48"/>
+    <w:lsdException w:name="Grid Table 4" w:uiPriority="49"/>
+    <w:lsdException w:name="Grid Table 5 Dark" w:uiPriority="50"/>
+    <w:lsdException w:name="Grid Table 6 Colorful" w:uiPriority="51"/>
+    <w:lsdException w:name="Grid Table 7 Colorful" w:uiPriority="52"/>
+    <w:lsdException w:name="Grid Table 1 Light Accent 1" w:uiPriority="46"/>
+    <w:lsdException w:name="Grid Table 2 Accent 1" w:uiPriority="47"/>
+    <w:lsdException w:name="Grid Table 3 Accent 1" w:uiPriority="48"/>
+    <w:lsdException w:name="Grid Table 4 Accent 1" w:uiPriority="49"/>
+    <w:lsdException w:name="Grid Table 5 Dark Accent 1" w:uiPriority="50"/>
+    <w:lsdException w:name="Grid Table 6 Colorful Accent 1" w:uiPriority="51"/>
+    <w:lsdException w:name="Grid Table 7 Colorful Accent 1" w:uiPriority="52"/>
+    <w:lsdException w:name="Grid Table 1 Light Accent 2" w:uiPriority="46"/>
+    <w:lsdException w:name="Grid Table 2 Accent 2" w:uiPriority="47"/>
+    <w:lsdException w:name="Grid Table 3 Accent 2" w:uiPriority="48"/>
+    <w:lsdException w:name="Grid Table 4 Accent 2" w:uiPriority="49"/>
+    <w:lsdException w:name="Grid Table 5 Dark Accent 2" w:uiPriority="50"/>
+    <w:lsdException w:name="Grid Table 6 Colorful Accent 2" w:uiPriority="51"/>
+    <w:lsdException w:name="Grid Table 7 Colorful Accent 2" w:uiPriority="52"/>
+    <w:lsdException w:name="Grid Table 1 Light Accent 3" w:uiPriority="46"/>
+    <w:lsdException w:name="Grid Table 2 Accent 3" w:uiPriority="47"/>
+    <w:lsdException w:name="Grid Table 3 Accent 3" w:uiPriority="48"/>
+    <w:lsdException w:name="Grid Table 4 Accent 3" w:uiPriority="49"/>
+    <w:lsdException w:name="Grid Table 5 Dark Accent 3" w:uiPriority="50"/>
+    <w:lsdException w:name="Grid Table 6 Colorful Accent 3" w:uiPriority="51"/>
+    <w:lsdException w:name="Grid Table 7 Colorful Accent 3" w:uiPriority="52"/>
+    <w:lsdException w:name="Grid Table 1 Light Accent 4" w:uiPriority="46"/>
+    <w:lsdException w:name="Grid Table 2 Accent 4" w:uiPriority="47"/>
+    <w:lsdException w:name="Grid Table 3 Accent 4" w:uiPriority="48"/>
+    <w:lsdException w:name="Grid Table 4 Accent 4" w:uiPriority="49"/>
+    <w:lsdException w:name="Grid Table 5 Dark Accent 4" w:uiPriority="50"/>
+    <w:lsdException w:name="Grid Table 6 Colorful Accent 4" w:uiPriority="51"/>
+    <w:lsdException w:name="Grid Table 7 Colorful Accent 4" w:uiPriority="52"/>
+    <w:lsdException w:name="Grid Table 1 Light Accent 5" w:uiPriority="46"/>
+    <w:lsdException w:name="Grid Table 2 Accent 5" w:uiPriority="47"/>
+    <w:lsdException w:name="Grid Table 3 Accent 5" w:uiPriority="48"/>
+    <w:lsdException w:name="Grid Table 4 Accent 5" w:uiPriority="49"/>
+    <w:lsdException w:name="Grid Table 5 Dark Accent 5" w:uiPriority="50"/>
+    <w:lsdException w:name="Grid Table 6 Colorful Accent 5" w:uiPriority="51"/>
+    <w:lsdException w:name="Grid Table 7 Colorful Accent 5" w:uiPriority="52"/>
+    <w:lsdException w:name="Grid Table 1 Light Accent 6" w:uiPriority="46"/>
+    <w:lsdException w:name="Grid Table 2 Accent 6" w:uiPriority="47"/>
+    <w:lsdException w:name="Grid Table 3 Accent 6" w:uiPriority="48"/>
+    <w:lsdException w:name="Grid Table 4 Accent 6" w:uiPriority="49"/>
+    <w:lsdException w:name="Grid Table 5 Dark Accent 6" w:uiPriority="50"/>
+    <w:lsdException w:name="Grid Table 6 Colorful Accent 6" w:uiPriority="51"/>
+    <w:lsdException w:name="Grid Table 7 Colorful Accent 6" w:uiPriority="52"/>
+    <w:lsdException w:name="List Table 1 Light" w:uiPriority="46"/>
+    <w:lsdException w:name="List Table 2" w:uiPriority="47"/>
+    <w:lsdException w:name="List Table 3" w:uiPriority="48"/>
+    <w:lsdException w:name="List Table 4" w:uiPriority="49"/>
+    <w:lsdException w:name="List Table 5 Dark" w:uiPriority="50"/>
+    <w:lsdException w:name="List Table 6 Colorful" w:uiPriority="51"/>
+    <w:lsdException w:name="List Table 7 Colorful" w:uiPriority="52"/>
+    <w:lsdException w:name="List Table 1 Light Accent 1" w:uiPriority="46"/>
+    <w:lsdException w:name="List Table 2 Accent 1" w:uiPriority="47"/>
+    <w:lsdException w:name="List Table 3 Accent 1" w:uiPriority="48"/>
+    <w:lsdException w:name="List Table 4 Accent 1" w:uiPriority="49"/>
+    <w:lsdException w:name="List Table 5 Dark Accent 1" w:uiPriority="50"/>
+    <w:lsdException w:name="List Table 6 Colorful Accent 1" w:uiPriority="51"/>
+    <w:lsdException w:name="List Table 7 Colorful Accent 1" w:uiPriority="52"/>
+    <w:lsdException w:name="List Table 1 Light Accent 2" w:uiPriority="46"/>
+    <w:lsdException w:name="List Table 2 Accent 2" w:uiPriority="47"/>
+    <w:lsdException w:name="List Table 3 Accent 2" w:uiPriority="48"/>
+    <w:lsdException w:name="List Table 4 Accent 2" w:uiPriority="49"/>
+    <w:lsdException w:name="List Table 5 Dark Accent 2" w:uiPriority="50"/>
+    <w:lsdException w:name="List Table 6 Colorful Accent 2" w:uiPriority="51"/>
+    <w:lsdException w:name="List Table 7 Colorful Accent 2" w:uiPriority="52"/>
+    <w:lsdException w:name="List Table 1 Light Accent 3" w:uiPriority="46"/>
+    <w:lsdException w:name="List Table 2 Accent 3" w:uiPriority="47"/>
+    <w:lsdException w:name="List Table 3 Accent 3" w:uiPriority="48"/>
+    <w:lsdException w:name="List Table 4 Accent 3" w:uiPriority="49"/>
+    <w:lsdException w:name="List Table 5 Dark Accent 3" w:uiPriority="50"/>
+    <w:lsdException w:name="List Table 6 Colorful Accent 3" w:uiPriority="51"/>
+    <w:lsdException w:name="List Table 7 Colorful Accent 3" w:uiPriority="52"/>
+    <w:lsdException w:name="List Table 1 Light Accent 4" w:uiPriority="46"/>
+    <w:lsdException w:name="List Table 2 Accent 4" w:uiPriority="47"/>
+    <w:lsdException w:name="List Table 3 Accent 4" w:uiPriority="48"/>
+    <w:lsdException w:name="List Table 4 Accent 4" w:uiPriority="49"/>
+    <w:lsdException w:name="List Table 5 Dark Accent 4" w:uiPriority="50"/>
+    <w:lsdException w:name="List Table 6 Colorful Accent 4" w:uiPriority="51"/>
+    <w:lsdException w:name="List Table 7 Colorful Accent 4" w:uiPriority="52"/>
+    <w:lsdException w:name="List Table 1 Light Accent 5" w:uiPriority="46"/>
+    <w:lsdException w:name="List Table 2 Accent 5" w:uiPriority="47"/>
+    <w:lsdException w:name="List Table 3 Accent 5" w:uiPriority="48"/>
+    <w:lsdException w:name="List Table 4 Accent 5" w:uiPriority="49"/>
+    <w:lsdException w:name="List Table 5 Dark Accent 5" w:uiPriority="50"/>
+    <w:lsdException w:name="List Table 6 Colorful Accent 5" w:uiPriority="51"/>
+    <w:lsdException w:name="List Table 7 Colorful Accent 5" w:uiPriority="52"/>
+    <w:lsdException w:name="List Table 1 Light Accent 6" w:uiPriority="46"/>
+    <w:lsdException w:name="List Table 2 Accent 6" w:uiPriority="47"/>
+    <w:lsdException w:name="List Table 3 Accent 6" w:uiPriority="48"/>
+    <w:lsdException w:name="List Table 4 Accent 6" w:uiPriority="49"/>
+    <w:lsdException w:name="List Table 5 Dark Accent 6" w:uiPriority="50"/>
+    <w:lsdException w:name="List Table 6 Colorful Accent 6" w:uiPriority="51"/>
+    <w:lsdException w:name="List Table 7 Colorful Accent 6" w:uiPriority="52"/>
+    <w:lsdException w:name="Mention" w:semiHidden="1" w:uiPriority="99" w:unhideWhenUsed="1"/>
+    <w:lsdException w:name="Smart Hyperlink" w:semiHidden="1" w:uiPriority="99" w:unhideWhenUsed="1"/>
+    <w:lsdException w:name="Hashtag" w:semiHidden="1" w:uiPriority="99" w:unhideWhenUsed="1"/>
+    <w:lsdException w:name="Unresolved Mention" w:semiHidden="1" w:uiPriority="99" w:unhideWhenUsed="1"/>
+    <w:lsdException w:name="Smart Link" w:semiHidden="1" w:uiPriority="99" w:unhideWhenUsed="1"/>
   </w:latentStyles>
-  <w:style w:type="paragraph" w:default="1" w:styleId="1">
+  <w:style w:type="paragraph" w:default="1" w:styleId="Normal">
     <w:name w:val="Normal"/>
     <w:qFormat/>
-    <w:uiPriority w:val="0"/>
     <w:rPr>
-      <w:rFonts w:ascii="Times New Roman" w:hAnsi="Times New Roman" w:eastAsia="Times New Roman" w:cs="Times New Roman"/>
+      <w:rFonts w:eastAsia="Times New Roman"/>
       <w:sz w:val="24"/>
-      <w:lang w:val="en-US" w:eastAsia="en-US" w:bidi="ar-SA"/>
+      <w:lang w:val="en-US" w:eastAsia="en-US"/>
     </w:rPr>
   </w:style>
-  <w:style w:type="paragraph" w:styleId="2">
+  <w:style w:type="paragraph" w:styleId="Heading1">
     <w:name w:val="heading 1"/>
-    <w:basedOn w:val="1"/>
-    <w:next w:val="1"/>
-    <w:link w:val="30"/>
-    <w:qFormat/>
+    <w:basedOn w:val="Normal"/>
+    <w:next w:val="Normal"/>
+    <w:link w:val="Heading1Char"/>
     <w:uiPriority w:val="9"/>
+    <w:qFormat/>
     <w:pPr>
       <w:keepNext/>
       <w:jc w:val="center"/>
@@ -4051,13 +3949,13 @@
       <w:sz w:val="32"/>
     </w:rPr>
   </w:style>
-  <w:style w:type="paragraph" w:styleId="3">
+  <w:style w:type="paragraph" w:styleId="Heading2">
     <w:name w:val="heading 2"/>
-    <w:basedOn w:val="1"/>
-    <w:next w:val="1"/>
-    <w:link w:val="31"/>
-    <w:qFormat/>
+    <w:basedOn w:val="Normal"/>
+    <w:next w:val="Normal"/>
+    <w:link w:val="Heading2Char"/>
     <w:uiPriority w:val="9"/>
+    <w:qFormat/>
     <w:pPr>
       <w:keepNext/>
       <w:jc w:val="center"/>
@@ -4070,13 +3968,13 @@
       <w:sz w:val="28"/>
     </w:rPr>
   </w:style>
-  <w:style w:type="paragraph" w:styleId="4">
+  <w:style w:type="paragraph" w:styleId="Heading3">
     <w:name w:val="heading 3"/>
-    <w:basedOn w:val="1"/>
-    <w:next w:val="1"/>
-    <w:link w:val="32"/>
-    <w:qFormat/>
+    <w:basedOn w:val="Normal"/>
+    <w:next w:val="Normal"/>
+    <w:link w:val="Heading3Char"/>
     <w:uiPriority w:val="9"/>
+    <w:qFormat/>
     <w:pPr>
       <w:keepNext/>
       <w:jc w:val="both"/>
@@ -4088,13 +3986,13 @@
       <w:sz w:val="26"/>
     </w:rPr>
   </w:style>
-  <w:style w:type="paragraph" w:styleId="5">
+  <w:style w:type="paragraph" w:styleId="Heading4">
     <w:name w:val="heading 4"/>
-    <w:basedOn w:val="1"/>
-    <w:next w:val="1"/>
-    <w:link w:val="33"/>
-    <w:qFormat/>
+    <w:basedOn w:val="Normal"/>
+    <w:next w:val="Normal"/>
+    <w:link w:val="Heading4Char"/>
     <w:uiPriority w:val="9"/>
+    <w:qFormat/>
     <w:pPr>
       <w:keepNext/>
       <w:tabs>
@@ -4108,13 +4006,13 @@
       <w:sz w:val="28"/>
     </w:rPr>
   </w:style>
-  <w:style w:type="paragraph" w:styleId="6">
+  <w:style w:type="paragraph" w:styleId="Heading5">
     <w:name w:val="heading 5"/>
-    <w:basedOn w:val="1"/>
-    <w:next w:val="1"/>
-    <w:link w:val="34"/>
-    <w:qFormat/>
+    <w:basedOn w:val="Normal"/>
+    <w:next w:val="Normal"/>
+    <w:link w:val="Heading5Char"/>
     <w:uiPriority w:val="9"/>
+    <w:qFormat/>
     <w:pPr>
       <w:keepNext/>
       <w:tabs>
@@ -4131,13 +4029,13 @@
       <w:sz w:val="26"/>
     </w:rPr>
   </w:style>
-  <w:style w:type="paragraph" w:styleId="7">
+  <w:style w:type="paragraph" w:styleId="Heading6">
     <w:name w:val="heading 6"/>
-    <w:basedOn w:val="1"/>
-    <w:next w:val="1"/>
-    <w:link w:val="35"/>
-    <w:qFormat/>
+    <w:basedOn w:val="Normal"/>
+    <w:next w:val="Normal"/>
+    <w:link w:val="Heading6Char"/>
     <w:uiPriority w:val="9"/>
+    <w:qFormat/>
     <w:pPr>
       <w:keepNext/>
       <w:tabs>
@@ -4153,13 +4051,13 @@
       <w:sz w:val="22"/>
     </w:rPr>
   </w:style>
-  <w:style w:type="paragraph" w:styleId="8">
+  <w:style w:type="paragraph" w:styleId="Heading7">
     <w:name w:val="heading 7"/>
-    <w:basedOn w:val="1"/>
-    <w:next w:val="1"/>
-    <w:link w:val="36"/>
-    <w:qFormat/>
+    <w:basedOn w:val="Normal"/>
+    <w:next w:val="Normal"/>
+    <w:link w:val="Heading7Char"/>
     <w:uiPriority w:val="9"/>
+    <w:qFormat/>
     <w:pPr>
       <w:keepNext/>
       <w:jc w:val="center"/>
@@ -4169,13 +4067,13 @@
       <w:rFonts w:ascii="Calibri" w:hAnsi="Calibri"/>
     </w:rPr>
   </w:style>
-  <w:style w:type="paragraph" w:styleId="9">
+  <w:style w:type="paragraph" w:styleId="Heading8">
     <w:name w:val="heading 8"/>
-    <w:basedOn w:val="1"/>
-    <w:next w:val="1"/>
-    <w:link w:val="37"/>
-    <w:qFormat/>
+    <w:basedOn w:val="Normal"/>
+    <w:next w:val="Normal"/>
+    <w:link w:val="Heading8Char"/>
     <w:uiPriority w:val="9"/>
+    <w:qFormat/>
     <w:pPr>
       <w:keepNext/>
       <w:spacing w:before="120"/>
@@ -4187,13 +4085,13 @@
       <w:i/>
     </w:rPr>
   </w:style>
-  <w:style w:type="paragraph" w:styleId="10">
+  <w:style w:type="paragraph" w:styleId="Heading9">
     <w:name w:val="heading 9"/>
-    <w:basedOn w:val="1"/>
-    <w:next w:val="1"/>
-    <w:link w:val="38"/>
-    <w:qFormat/>
+    <w:basedOn w:val="Normal"/>
+    <w:next w:val="Normal"/>
+    <w:link w:val="Heading9Char"/>
     <w:uiPriority w:val="9"/>
+    <w:qFormat/>
     <w:pPr>
       <w:keepNext/>
       <w:spacing w:before="80" w:after="120"/>
@@ -4204,64 +4102,69 @@
       <w:sz w:val="22"/>
     </w:rPr>
   </w:style>
-  <w:style w:type="character" w:default="1" w:styleId="11">
+  <w:style w:type="character" w:default="1" w:styleId="DefaultParagraphFont">
     <w:name w:val="Default Paragraph Font"/>
-    <w:unhideWhenUsed/>
-    <w:qFormat/>
     <w:uiPriority w:val="1"/>
-  </w:style>
-  <w:style w:type="table" w:default="1" w:styleId="12">
-    <w:name w:val="Normal Table"/>
     <w:semiHidden/>
     <w:unhideWhenUsed/>
-    <w:qFormat/>
+  </w:style>
+  <w:style w:type="table" w:default="1" w:styleId="TableNormal">
+    <w:name w:val="Normal Table"/>
     <w:uiPriority w:val="99"/>
+    <w:semiHidden/>
+    <w:unhideWhenUsed/>
     <w:tblPr>
+      <w:tblInd w:w="0" w:type="dxa"/>
       <w:tblCellMar>
         <w:top w:w="0" w:type="dxa"/>
-        <w:left w:w="100" w:type="dxa"/>
+        <w:left w:w="108" w:type="dxa"/>
         <w:bottom w:w="0" w:type="dxa"/>
-        <w:right w:w="100" w:type="dxa"/>
+        <w:right w:w="108" w:type="dxa"/>
       </w:tblCellMar>
     </w:tblPr>
   </w:style>
-  <w:style w:type="paragraph" w:styleId="13">
+  <w:style w:type="numbering" w:default="1" w:styleId="NoList">
+    <w:name w:val="No List"/>
+    <w:uiPriority w:val="99"/>
+    <w:semiHidden/>
+    <w:unhideWhenUsed/>
+  </w:style>
+  <w:style w:type="paragraph" w:styleId="BalloonText">
     <w:name w:val="Balloon Text"/>
-    <w:basedOn w:val="1"/>
-    <w:link w:val="46"/>
+    <w:basedOn w:val="Normal"/>
+    <w:link w:val="BalloonTextChar"/>
+    <w:uiPriority w:val="99"/>
     <w:semiHidden/>
     <w:qFormat/>
-    <w:uiPriority w:val="99"/>
     <w:rPr>
       <w:rFonts w:ascii="Tahoma" w:hAnsi="Tahoma"/>
       <w:sz w:val="16"/>
     </w:rPr>
   </w:style>
-  <w:style w:type="paragraph" w:styleId="14">
+  <w:style w:type="paragraph" w:styleId="BodyText">
     <w:name w:val="Body Text"/>
-    <w:basedOn w:val="1"/>
-    <w:link w:val="40"/>
-    <w:qFormat/>
+    <w:basedOn w:val="Normal"/>
+    <w:link w:val="BodyTextChar"/>
     <w:uiPriority w:val="99"/>
-  </w:style>
-  <w:style w:type="paragraph" w:styleId="15">
+    <w:qFormat/>
+  </w:style>
+  <w:style w:type="paragraph" w:styleId="BodyText2">
     <w:name w:val="Body Text 2"/>
-    <w:basedOn w:val="1"/>
-    <w:link w:val="66"/>
+    <w:basedOn w:val="Normal"/>
+    <w:link w:val="BodyText2Char"/>
     <w:semiHidden/>
     <w:unhideWhenUsed/>
     <w:qFormat/>
-    <w:uiPriority w:val="0"/>
     <w:pPr>
       <w:spacing w:after="120" w:line="480" w:lineRule="auto"/>
     </w:pPr>
   </w:style>
-  <w:style w:type="paragraph" w:styleId="16">
+  <w:style w:type="paragraph" w:styleId="BodyTextIndent">
     <w:name w:val="Body Text Indent"/>
-    <w:basedOn w:val="1"/>
-    <w:link w:val="39"/>
-    <w:qFormat/>
+    <w:basedOn w:val="Normal"/>
+    <w:link w:val="BodyTextIndentChar"/>
     <w:uiPriority w:val="99"/>
+    <w:qFormat/>
     <w:pPr>
       <w:tabs>
         <w:tab w:val="left" w:pos="360"/>
@@ -4271,14 +4174,13 @@
       <w:ind w:left="360"/>
     </w:pPr>
   </w:style>
-  <w:style w:type="paragraph" w:styleId="17">
+  <w:style w:type="paragraph" w:styleId="BodyTextIndent3">
     <w:name w:val="Body Text Indent 3"/>
-    <w:basedOn w:val="1"/>
-    <w:link w:val="67"/>
+    <w:basedOn w:val="Normal"/>
+    <w:link w:val="BodyTextIndent3Char"/>
     <w:semiHidden/>
     <w:unhideWhenUsed/>
     <w:qFormat/>
-    <w:uiPriority w:val="0"/>
     <w:pPr>
       <w:spacing w:after="120"/>
       <w:ind w:left="283"/>
@@ -4288,12 +4190,12 @@
       <w:szCs w:val="16"/>
     </w:rPr>
   </w:style>
-  <w:style w:type="paragraph" w:styleId="18">
+  <w:style w:type="paragraph" w:styleId="Caption">
     <w:name w:val="caption"/>
-    <w:basedOn w:val="1"/>
-    <w:next w:val="1"/>
-    <w:qFormat/>
+    <w:basedOn w:val="Normal"/>
+    <w:next w:val="Normal"/>
     <w:uiPriority w:val="35"/>
+    <w:qFormat/>
     <w:pPr>
       <w:tabs>
         <w:tab w:val="left" w:pos="360"/>
@@ -4306,22 +4208,22 @@
       <w:sz w:val="22"/>
     </w:rPr>
   </w:style>
-  <w:style w:type="character" w:styleId="19">
+  <w:style w:type="character" w:styleId="Emphasis">
     <w:name w:val="Emphasis"/>
-    <w:basedOn w:val="11"/>
-    <w:qFormat/>
+    <w:basedOn w:val="DefaultParagraphFont"/>
     <w:uiPriority w:val="20"/>
+    <w:qFormat/>
     <w:rPr>
       <w:i/>
       <w:iCs/>
     </w:rPr>
   </w:style>
-  <w:style w:type="paragraph" w:styleId="20">
+  <w:style w:type="paragraph" w:styleId="Footer">
     <w:name w:val="footer"/>
-    <w:basedOn w:val="1"/>
-    <w:link w:val="44"/>
-    <w:qFormat/>
+    <w:basedOn w:val="Normal"/>
+    <w:link w:val="FooterChar"/>
     <w:uiPriority w:val="99"/>
+    <w:qFormat/>
     <w:pPr>
       <w:tabs>
         <w:tab w:val="center" w:pos="4320"/>
@@ -4329,12 +4231,11 @@
       </w:tabs>
     </w:pPr>
   </w:style>
-  <w:style w:type="paragraph" w:styleId="21">
+  <w:style w:type="paragraph" w:styleId="Header">
     <w:name w:val="header"/>
-    <w:basedOn w:val="1"/>
-    <w:link w:val="42"/>
-    <w:qFormat/>
-    <w:uiPriority w:val="0"/>
+    <w:basedOn w:val="Normal"/>
+    <w:link w:val="HeaderChar"/>
+    <w:qFormat/>
     <w:pPr>
       <w:tabs>
         <w:tab w:val="center" w:pos="4320"/>
@@ -4342,50 +4243,50 @@
       </w:tabs>
     </w:pPr>
   </w:style>
-  <w:style w:type="character" w:styleId="22">
+  <w:style w:type="character" w:styleId="Hyperlink">
     <w:name w:val="Hyperlink"/>
-    <w:basedOn w:val="11"/>
+    <w:basedOn w:val="DefaultParagraphFont"/>
+    <w:uiPriority w:val="99"/>
     <w:unhideWhenUsed/>
     <w:qFormat/>
-    <w:uiPriority w:val="99"/>
     <w:rPr>
       <w:color w:val="0000FF"/>
       <w:u w:val="single"/>
     </w:rPr>
   </w:style>
-  <w:style w:type="character" w:styleId="23">
+  <w:style w:type="character" w:styleId="PageNumber">
     <w:name w:val="page number"/>
-    <w:basedOn w:val="11"/>
-    <w:qFormat/>
+    <w:basedOn w:val="DefaultParagraphFont"/>
     <w:uiPriority w:val="99"/>
-  </w:style>
-  <w:style w:type="paragraph" w:styleId="24">
+    <w:qFormat/>
+  </w:style>
+  <w:style w:type="paragraph" w:styleId="PlainText">
     <w:name w:val="Plain Text"/>
-    <w:basedOn w:val="1"/>
-    <w:link w:val="43"/>
-    <w:qFormat/>
+    <w:basedOn w:val="Normal"/>
+    <w:link w:val="PlainTextChar"/>
     <w:uiPriority w:val="99"/>
+    <w:qFormat/>
     <w:rPr>
       <w:rFonts w:ascii="Courier New" w:hAnsi="Courier New"/>
       <w:sz w:val="20"/>
     </w:rPr>
   </w:style>
-  <w:style w:type="character" w:styleId="25">
+  <w:style w:type="character" w:styleId="Strong">
     <w:name w:val="Strong"/>
-    <w:basedOn w:val="11"/>
-    <w:qFormat/>
+    <w:basedOn w:val="DefaultParagraphFont"/>
     <w:uiPriority w:val="22"/>
+    <w:qFormat/>
     <w:rPr>
       <w:b/>
       <w:bCs/>
     </w:rPr>
   </w:style>
-  <w:style w:type="paragraph" w:styleId="26">
+  <w:style w:type="paragraph" w:styleId="Subtitle">
     <w:name w:val="Subtitle"/>
-    <w:basedOn w:val="1"/>
-    <w:link w:val="45"/>
-    <w:qFormat/>
+    <w:basedOn w:val="Normal"/>
+    <w:link w:val="SubtitleChar"/>
     <w:uiPriority w:val="11"/>
+    <w:qFormat/>
     <w:pPr>
       <w:spacing w:line="220" w:lineRule="exact"/>
       <w:jc w:val="center"/>
@@ -4394,28 +4295,27 @@
       <w:rFonts w:ascii="Cambria" w:hAnsi="Cambria"/>
     </w:rPr>
   </w:style>
-  <w:style w:type="table" w:styleId="27">
+  <w:style w:type="table" w:styleId="TableGrid">
     <w:name w:val="Table Grid"/>
-    <w:basedOn w:val="12"/>
-    <w:qFormat/>
-    <w:uiPriority w:val="0"/>
+    <w:basedOn w:val="TableNormal"/>
+    <w:qFormat/>
     <w:tblPr>
       <w:tblBorders>
-        <w:top w:val="single" w:color="000000" w:sz="4" w:space="0"/>
-        <w:left w:val="single" w:color="000000" w:sz="4" w:space="0"/>
-        <w:bottom w:val="single" w:color="000000" w:sz="4" w:space="0"/>
-        <w:right w:val="single" w:color="000000" w:sz="4" w:space="0"/>
-        <w:insideH w:val="single" w:color="000000" w:sz="4" w:space="0"/>
-        <w:insideV w:val="single" w:color="000000" w:sz="4" w:space="0"/>
+        <w:top w:val="single" w:sz="4" w:space="0" w:color="000000"/>
+        <w:left w:val="single" w:sz="4" w:space="0" w:color="000000"/>
+        <w:bottom w:val="single" w:sz="4" w:space="0" w:color="000000"/>
+        <w:right w:val="single" w:sz="4" w:space="0" w:color="000000"/>
+        <w:insideH w:val="single" w:sz="4" w:space="0" w:color="000000"/>
+        <w:insideV w:val="single" w:sz="4" w:space="0" w:color="000000"/>
       </w:tblBorders>
     </w:tblPr>
   </w:style>
-  <w:style w:type="paragraph" w:styleId="28">
+  <w:style w:type="paragraph" w:styleId="Title">
     <w:name w:val="Title"/>
-    <w:basedOn w:val="1"/>
-    <w:link w:val="41"/>
-    <w:qFormat/>
+    <w:basedOn w:val="Normal"/>
+    <w:link w:val="TitleChar"/>
     <w:uiPriority w:val="10"/>
+    <w:qFormat/>
     <w:pPr>
       <w:jc w:val="center"/>
     </w:pPr>
@@ -4426,13 +4326,12 @@
       <w:sz w:val="32"/>
     </w:rPr>
   </w:style>
-  <w:style w:type="paragraph" w:styleId="29">
+  <w:style w:type="paragraph" w:styleId="TOC3">
     <w:name w:val="toc 3"/>
-    <w:basedOn w:val="1"/>
-    <w:next w:val="1"/>
+    <w:basedOn w:val="Normal"/>
+    <w:next w:val="Normal"/>
     <w:semiHidden/>
     <w:qFormat/>
-    <w:uiPriority w:val="0"/>
     <w:pPr>
       <w:widowControl w:val="0"/>
       <w:tabs>
@@ -4452,13 +4351,13 @@
       <w:lang w:eastAsia="en-ZA"/>
     </w:rPr>
   </w:style>
-  <w:style w:type="character" w:customStyle="1" w:styleId="30">
+  <w:style w:type="character" w:customStyle="1" w:styleId="Heading1Char">
     <w:name w:val="Heading 1 Char"/>
-    <w:basedOn w:val="11"/>
-    <w:link w:val="2"/>
+    <w:basedOn w:val="DefaultParagraphFont"/>
+    <w:link w:val="Heading1"/>
+    <w:uiPriority w:val="9"/>
     <w:qFormat/>
     <w:locked/>
-    <w:uiPriority w:val="9"/>
     <w:rPr>
       <w:rFonts w:ascii="Cambria" w:hAnsi="Cambria"/>
       <w:b/>
@@ -4467,14 +4366,14 @@
       <w:lang w:val="en-US" w:eastAsia="en-US"/>
     </w:rPr>
   </w:style>
-  <w:style w:type="character" w:customStyle="1" w:styleId="31">
+  <w:style w:type="character" w:customStyle="1" w:styleId="Heading2Char">
     <w:name w:val="Heading 2 Char"/>
-    <w:basedOn w:val="11"/>
-    <w:link w:val="3"/>
+    <w:basedOn w:val="DefaultParagraphFont"/>
+    <w:link w:val="Heading2"/>
+    <w:uiPriority w:val="9"/>
     <w:semiHidden/>
     <w:qFormat/>
     <w:locked/>
-    <w:uiPriority w:val="9"/>
     <w:rPr>
       <w:rFonts w:ascii="Cambria" w:hAnsi="Cambria"/>
       <w:b/>
@@ -4483,14 +4382,14 @@
       <w:lang w:val="en-US" w:eastAsia="en-US"/>
     </w:rPr>
   </w:style>
-  <w:style w:type="character" w:customStyle="1" w:styleId="32">
+  <w:style w:type="character" w:customStyle="1" w:styleId="Heading3Char">
     <w:name w:val="Heading 3 Char"/>
-    <w:basedOn w:val="11"/>
-    <w:link w:val="4"/>
+    <w:basedOn w:val="DefaultParagraphFont"/>
+    <w:link w:val="Heading3"/>
+    <w:uiPriority w:val="9"/>
     <w:semiHidden/>
     <w:qFormat/>
     <w:locked/>
-    <w:uiPriority w:val="9"/>
     <w:rPr>
       <w:rFonts w:ascii="Cambria" w:hAnsi="Cambria"/>
       <w:b/>
@@ -4498,14 +4397,14 @@
       <w:lang w:val="en-US" w:eastAsia="en-US"/>
     </w:rPr>
   </w:style>
-  <w:style w:type="character" w:customStyle="1" w:styleId="33">
+  <w:style w:type="character" w:customStyle="1" w:styleId="Heading4Char">
     <w:name w:val="Heading 4 Char"/>
-    <w:basedOn w:val="11"/>
-    <w:link w:val="5"/>
+    <w:basedOn w:val="DefaultParagraphFont"/>
+    <w:link w:val="Heading4"/>
+    <w:uiPriority w:val="9"/>
     <w:semiHidden/>
     <w:qFormat/>
     <w:locked/>
-    <w:uiPriority w:val="9"/>
     <w:rPr>
       <w:rFonts w:ascii="Calibri" w:hAnsi="Calibri"/>
       <w:b/>
@@ -4513,14 +4412,14 @@
       <w:lang w:val="en-US" w:eastAsia="en-US"/>
     </w:rPr>
   </w:style>
-  <w:style w:type="character" w:customStyle="1" w:styleId="34">
+  <w:style w:type="character" w:customStyle="1" w:styleId="Heading5Char">
     <w:name w:val="Heading 5 Char"/>
-    <w:basedOn w:val="11"/>
-    <w:link w:val="6"/>
+    <w:basedOn w:val="DefaultParagraphFont"/>
+    <w:link w:val="Heading5"/>
+    <w:uiPriority w:val="9"/>
     <w:semiHidden/>
     <w:qFormat/>
     <w:locked/>
-    <w:uiPriority w:val="9"/>
     <w:rPr>
       <w:rFonts w:ascii="Calibri" w:hAnsi="Calibri"/>
       <w:b/>
@@ -4529,14 +4428,14 @@
       <w:lang w:val="en-US" w:eastAsia="en-US"/>
     </w:rPr>
   </w:style>
-  <w:style w:type="character" w:customStyle="1" w:styleId="35">
+  <w:style w:type="character" w:customStyle="1" w:styleId="Heading6Char">
     <w:name w:val="Heading 6 Char"/>
-    <w:basedOn w:val="11"/>
-    <w:link w:val="7"/>
+    <w:basedOn w:val="DefaultParagraphFont"/>
+    <w:link w:val="Heading6"/>
+    <w:uiPriority w:val="9"/>
     <w:semiHidden/>
     <w:qFormat/>
     <w:locked/>
-    <w:uiPriority w:val="9"/>
     <w:rPr>
       <w:rFonts w:ascii="Calibri" w:hAnsi="Calibri"/>
       <w:b/>
@@ -4544,28 +4443,28 @@
       <w:lang w:val="en-US" w:eastAsia="en-US"/>
     </w:rPr>
   </w:style>
-  <w:style w:type="character" w:customStyle="1" w:styleId="36">
+  <w:style w:type="character" w:customStyle="1" w:styleId="Heading7Char">
     <w:name w:val="Heading 7 Char"/>
-    <w:basedOn w:val="11"/>
-    <w:link w:val="8"/>
+    <w:basedOn w:val="DefaultParagraphFont"/>
+    <w:link w:val="Heading7"/>
+    <w:uiPriority w:val="9"/>
     <w:semiHidden/>
     <w:qFormat/>
     <w:locked/>
-    <w:uiPriority w:val="9"/>
     <w:rPr>
       <w:rFonts w:ascii="Calibri" w:hAnsi="Calibri"/>
       <w:sz w:val="24"/>
       <w:lang w:val="en-US" w:eastAsia="en-US"/>
     </w:rPr>
   </w:style>
-  <w:style w:type="character" w:customStyle="1" w:styleId="37">
+  <w:style w:type="character" w:customStyle="1" w:styleId="Heading8Char">
     <w:name w:val="Heading 8 Char"/>
-    <w:basedOn w:val="11"/>
-    <w:link w:val="9"/>
+    <w:basedOn w:val="DefaultParagraphFont"/>
+    <w:link w:val="Heading8"/>
+    <w:uiPriority w:val="9"/>
     <w:semiHidden/>
     <w:qFormat/>
     <w:locked/>
-    <w:uiPriority w:val="9"/>
     <w:rPr>
       <w:rFonts w:ascii="Calibri" w:hAnsi="Calibri"/>
       <w:i/>
@@ -4573,53 +4472,53 @@
       <w:lang w:val="en-US" w:eastAsia="en-US"/>
     </w:rPr>
   </w:style>
-  <w:style w:type="character" w:customStyle="1" w:styleId="38">
+  <w:style w:type="character" w:customStyle="1" w:styleId="Heading9Char">
     <w:name w:val="Heading 9 Char"/>
-    <w:basedOn w:val="11"/>
-    <w:link w:val="10"/>
+    <w:basedOn w:val="DefaultParagraphFont"/>
+    <w:link w:val="Heading9"/>
+    <w:uiPriority w:val="9"/>
     <w:semiHidden/>
     <w:qFormat/>
     <w:locked/>
-    <w:uiPriority w:val="9"/>
     <w:rPr>
       <w:rFonts w:ascii="Cambria" w:hAnsi="Cambria"/>
       <w:sz w:val="22"/>
       <w:lang w:val="en-US" w:eastAsia="en-US"/>
     </w:rPr>
   </w:style>
-  <w:style w:type="character" w:customStyle="1" w:styleId="39">
+  <w:style w:type="character" w:customStyle="1" w:styleId="BodyTextIndentChar">
     <w:name w:val="Body Text Indent Char"/>
-    <w:basedOn w:val="11"/>
-    <w:link w:val="16"/>
+    <w:basedOn w:val="DefaultParagraphFont"/>
+    <w:link w:val="BodyTextIndent"/>
+    <w:uiPriority w:val="99"/>
     <w:semiHidden/>
     <w:qFormat/>
     <w:locked/>
-    <w:uiPriority w:val="99"/>
     <w:rPr>
       <w:sz w:val="24"/>
       <w:lang w:val="en-US" w:eastAsia="en-US"/>
     </w:rPr>
   </w:style>
-  <w:style w:type="character" w:customStyle="1" w:styleId="40">
+  <w:style w:type="character" w:customStyle="1" w:styleId="BodyTextChar">
     <w:name w:val="Body Text Char"/>
-    <w:basedOn w:val="11"/>
-    <w:link w:val="14"/>
+    <w:basedOn w:val="DefaultParagraphFont"/>
+    <w:link w:val="BodyText"/>
+    <w:uiPriority w:val="99"/>
     <w:semiHidden/>
     <w:qFormat/>
     <w:locked/>
-    <w:uiPriority w:val="99"/>
     <w:rPr>
       <w:sz w:val="24"/>
       <w:lang w:val="en-US" w:eastAsia="en-US"/>
     </w:rPr>
   </w:style>
-  <w:style w:type="character" w:customStyle="1" w:styleId="41">
+  <w:style w:type="character" w:customStyle="1" w:styleId="TitleChar">
     <w:name w:val="Title Char"/>
-    <w:basedOn w:val="11"/>
-    <w:link w:val="28"/>
+    <w:basedOn w:val="DefaultParagraphFont"/>
+    <w:link w:val="Title"/>
+    <w:uiPriority w:val="10"/>
     <w:qFormat/>
     <w:locked/>
-    <w:uiPriority w:val="10"/>
     <w:rPr>
       <w:rFonts w:ascii="Cambria" w:hAnsi="Cambria"/>
       <w:b/>
@@ -4628,89 +4527,88 @@
       <w:lang w:val="en-US" w:eastAsia="en-US"/>
     </w:rPr>
   </w:style>
-  <w:style w:type="character" w:customStyle="1" w:styleId="42">
+  <w:style w:type="character" w:customStyle="1" w:styleId="HeaderChar">
     <w:name w:val="Header Char"/>
-    <w:basedOn w:val="11"/>
-    <w:link w:val="21"/>
+    <w:basedOn w:val="DefaultParagraphFont"/>
+    <w:link w:val="Header"/>
+    <w:uiPriority w:val="99"/>
     <w:qFormat/>
     <w:locked/>
-    <w:uiPriority w:val="99"/>
     <w:rPr>
       <w:sz w:val="24"/>
       <w:lang w:val="en-US" w:eastAsia="en-US"/>
     </w:rPr>
   </w:style>
-  <w:style w:type="character" w:customStyle="1" w:styleId="43">
+  <w:style w:type="character" w:customStyle="1" w:styleId="PlainTextChar">
     <w:name w:val="Plain Text Char"/>
-    <w:basedOn w:val="11"/>
-    <w:link w:val="24"/>
+    <w:basedOn w:val="DefaultParagraphFont"/>
+    <w:link w:val="PlainText"/>
+    <w:uiPriority w:val="99"/>
     <w:qFormat/>
     <w:locked/>
-    <w:uiPriority w:val="99"/>
     <w:rPr>
       <w:rFonts w:ascii="Courier New" w:hAnsi="Courier New"/>
       <w:lang w:val="en-US" w:eastAsia="en-US"/>
     </w:rPr>
   </w:style>
-  <w:style w:type="character" w:customStyle="1" w:styleId="44">
+  <w:style w:type="character" w:customStyle="1" w:styleId="FooterChar">
     <w:name w:val="Footer Char"/>
-    <w:basedOn w:val="11"/>
-    <w:link w:val="20"/>
+    <w:basedOn w:val="DefaultParagraphFont"/>
+    <w:link w:val="Footer"/>
+    <w:uiPriority w:val="99"/>
     <w:qFormat/>
     <w:locked/>
-    <w:uiPriority w:val="99"/>
     <w:rPr>
       <w:sz w:val="24"/>
       <w:lang w:val="en-US" w:eastAsia="en-US"/>
     </w:rPr>
   </w:style>
-  <w:style w:type="character" w:customStyle="1" w:styleId="45">
+  <w:style w:type="character" w:customStyle="1" w:styleId="SubtitleChar">
     <w:name w:val="Subtitle Char"/>
-    <w:basedOn w:val="11"/>
-    <w:link w:val="26"/>
+    <w:basedOn w:val="DefaultParagraphFont"/>
+    <w:link w:val="Subtitle"/>
+    <w:uiPriority w:val="11"/>
     <w:qFormat/>
     <w:locked/>
-    <w:uiPriority w:val="11"/>
     <w:rPr>
       <w:rFonts w:ascii="Cambria" w:hAnsi="Cambria"/>
       <w:sz w:val="24"/>
       <w:lang w:val="en-US" w:eastAsia="en-US"/>
     </w:rPr>
   </w:style>
-  <w:style w:type="character" w:customStyle="1" w:styleId="46">
+  <w:style w:type="character" w:customStyle="1" w:styleId="BalloonTextChar">
     <w:name w:val="Balloon Text Char"/>
-    <w:basedOn w:val="11"/>
-    <w:link w:val="13"/>
+    <w:basedOn w:val="DefaultParagraphFont"/>
+    <w:link w:val="BalloonText"/>
+    <w:uiPriority w:val="99"/>
     <w:semiHidden/>
     <w:qFormat/>
     <w:locked/>
-    <w:uiPriority w:val="99"/>
     <w:rPr>
       <w:rFonts w:ascii="Tahoma" w:hAnsi="Tahoma"/>
       <w:sz w:val="16"/>
       <w:lang w:val="en-US" w:eastAsia="en-US"/>
     </w:rPr>
   </w:style>
-  <w:style w:type="paragraph" w:customStyle="1" w:styleId="47">
+  <w:style w:type="paragraph" w:customStyle="1" w:styleId="Textosinformato1">
     <w:name w:val="Texto sin formato1"/>
-    <w:basedOn w:val="1"/>
-    <w:qFormat/>
-    <w:uiPriority w:val="0"/>
+    <w:basedOn w:val="Normal"/>
+    <w:qFormat/>
     <w:pPr>
       <w:suppressAutoHyphens/>
     </w:pPr>
     <w:rPr>
-      <w:rFonts w:ascii="Courier New" w:hAnsi="Courier New" w:eastAsia="SimSun" w:cs="Courier New"/>
+      <w:rFonts w:ascii="Courier New" w:eastAsia="SimSun" w:hAnsi="Courier New" w:cs="Courier New"/>
       <w:sz w:val="20"/>
       <w:lang w:eastAsia="ar-SA"/>
     </w:rPr>
   </w:style>
-  <w:style w:type="paragraph" w:styleId="48">
+  <w:style w:type="paragraph" w:styleId="ListParagraph">
     <w:name w:val="List Paragraph"/>
-    <w:basedOn w:val="1"/>
-    <w:link w:val="52"/>
-    <w:qFormat/>
+    <w:basedOn w:val="Normal"/>
+    <w:link w:val="ListParagraphChar"/>
     <w:uiPriority w:val="34"/>
+    <w:qFormat/>
     <w:pPr>
       <w:ind w:left="720"/>
       <w:contextualSpacing/>
@@ -4721,31 +4619,29 @@
       <w:lang w:val="en-ZA"/>
     </w:rPr>
   </w:style>
-  <w:style w:type="character" w:customStyle="1" w:styleId="49">
+  <w:style w:type="character" w:customStyle="1" w:styleId="go">
     <w:name w:val="go"/>
-    <w:basedOn w:val="11"/>
-    <w:qFormat/>
-    <w:uiPriority w:val="0"/>
-  </w:style>
-  <w:style w:type="paragraph" w:styleId="50">
+    <w:basedOn w:val="DefaultParagraphFont"/>
+    <w:qFormat/>
+  </w:style>
+  <w:style w:type="paragraph" w:styleId="NoSpacing">
     <w:name w:val="No Spacing"/>
-    <w:qFormat/>
     <w:uiPriority w:val="1"/>
+    <w:qFormat/>
     <w:pPr>
       <w:jc w:val="center"/>
     </w:pPr>
     <w:rPr>
-      <w:rFonts w:asciiTheme="minorHAnsi" w:hAnsiTheme="minorHAnsi" w:eastAsiaTheme="minorHAnsi" w:cstheme="minorBidi"/>
+      <w:rFonts w:asciiTheme="minorHAnsi" w:eastAsiaTheme="minorHAnsi" w:hAnsiTheme="minorHAnsi" w:cstheme="minorBidi"/>
       <w:sz w:val="22"/>
       <w:szCs w:val="22"/>
-      <w:lang w:val="en-US" w:eastAsia="en-US" w:bidi="ar-SA"/>
+      <w:lang w:val="en-US" w:eastAsia="en-US"/>
     </w:rPr>
   </w:style>
-  <w:style w:type="paragraph" w:customStyle="1" w:styleId="51">
+  <w:style w:type="paragraph" w:customStyle="1" w:styleId="Italic">
     <w:name w:val="Italic"/>
-    <w:basedOn w:val="1"/>
-    <w:qFormat/>
-    <w:uiPriority w:val="0"/>
+    <w:basedOn w:val="Normal"/>
+    <w:qFormat/>
     <w:pPr>
       <w:widowControl w:val="0"/>
     </w:pPr>
@@ -4756,44 +4652,42 @@
       <w:lang w:val="en-GB"/>
     </w:rPr>
   </w:style>
-  <w:style w:type="character" w:customStyle="1" w:styleId="52">
+  <w:style w:type="character" w:customStyle="1" w:styleId="ListParagraphChar">
     <w:name w:val="List Paragraph Char"/>
-    <w:link w:val="48"/>
-    <w:qFormat/>
+    <w:link w:val="ListParagraph"/>
     <w:uiPriority w:val="34"/>
+    <w:qFormat/>
     <w:rPr>
       <w:rFonts w:eastAsiaTheme="minorEastAsia"/>
       <w:lang w:val="en-ZA"/>
     </w:rPr>
   </w:style>
-  <w:style w:type="table" w:customStyle="1" w:styleId="53">
-    <w:name w:val="Grid Table Light"/>
-    <w:basedOn w:val="12"/>
-    <w:qFormat/>
+  <w:style w:type="table" w:customStyle="1" w:styleId="TableGridLight1">
+    <w:name w:val="Table Grid Light1"/>
+    <w:basedOn w:val="TableNormal"/>
     <w:uiPriority w:val="40"/>
+    <w:qFormat/>
     <w:rPr>
-      <w:rFonts w:asciiTheme="minorHAnsi" w:hAnsiTheme="minorHAnsi" w:eastAsiaTheme="minorHAnsi" w:cstheme="minorBidi"/>
+      <w:rFonts w:asciiTheme="minorHAnsi" w:eastAsiaTheme="minorHAnsi" w:hAnsiTheme="minorHAnsi" w:cstheme="minorBidi"/>
       <w:sz w:val="22"/>
       <w:szCs w:val="22"/>
-      <w:lang w:val="en-ZA"/>
     </w:rPr>
     <w:tblPr>
       <w:tblBorders>
-        <w:top w:val="single" w:color="BEBEBE" w:themeColor="background1" w:themeShade="BF" w:sz="4" w:space="0"/>
-        <w:left w:val="single" w:color="BEBEBE" w:themeColor="background1" w:themeShade="BF" w:sz="4" w:space="0"/>
-        <w:bottom w:val="single" w:color="BEBEBE" w:themeColor="background1" w:themeShade="BF" w:sz="4" w:space="0"/>
-        <w:right w:val="single" w:color="BEBEBE" w:themeColor="background1" w:themeShade="BF" w:sz="4" w:space="0"/>
-        <w:insideH w:val="single" w:color="BEBEBE" w:themeColor="background1" w:themeShade="BF" w:sz="4" w:space="0"/>
-        <w:insideV w:val="single" w:color="BEBEBE" w:themeColor="background1" w:themeShade="BF" w:sz="4" w:space="0"/>
+        <w:top w:val="single" w:sz="4" w:space="0" w:color="BFBFBF" w:themeColor="background1" w:themeShade="BF"/>
+        <w:left w:val="single" w:sz="4" w:space="0" w:color="BFBFBF" w:themeColor="background1" w:themeShade="BF"/>
+        <w:bottom w:val="single" w:sz="4" w:space="0" w:color="BFBFBF" w:themeColor="background1" w:themeShade="BF"/>
+        <w:right w:val="single" w:sz="4" w:space="0" w:color="BFBFBF" w:themeColor="background1" w:themeShade="BF"/>
+        <w:insideH w:val="single" w:sz="4" w:space="0" w:color="BFBFBF" w:themeColor="background1" w:themeShade="BF"/>
+        <w:insideV w:val="single" w:sz="4" w:space="0" w:color="BFBFBF" w:themeColor="background1" w:themeShade="BF"/>
       </w:tblBorders>
     </w:tblPr>
   </w:style>
-  <w:style w:type="paragraph" w:customStyle="1" w:styleId="54">
+  <w:style w:type="paragraph" w:customStyle="1" w:styleId="CompanyName">
     <w:name w:val="Company Name"/>
-    <w:basedOn w:val="1"/>
-    <w:next w:val="1"/>
-    <w:qFormat/>
-    <w:uiPriority w:val="0"/>
+    <w:basedOn w:val="Normal"/>
+    <w:next w:val="Normal"/>
+    <w:qFormat/>
     <w:pPr>
       <w:tabs>
         <w:tab w:val="left" w:pos="1440"/>
@@ -4807,14 +4701,13 @@
       <w:lang w:val="en-AU"/>
     </w:rPr>
   </w:style>
-  <w:style w:type="paragraph" w:customStyle="1" w:styleId="55">
+  <w:style w:type="paragraph" w:customStyle="1" w:styleId="Achievement">
     <w:name w:val="Achievement"/>
-    <w:basedOn w:val="1"/>
-    <w:qFormat/>
-    <w:uiPriority w:val="0"/>
+    <w:basedOn w:val="Normal"/>
+    <w:qFormat/>
     <w:pPr>
       <w:pBdr>
-        <w:left w:val="single" w:color="auto" w:sz="6" w:space="5"/>
+        <w:left w:val="single" w:sz="6" w:space="5" w:color="auto"/>
       </w:pBdr>
       <w:spacing w:after="80"/>
     </w:pPr>
@@ -4822,12 +4715,11 @@
       <w:sz w:val="20"/>
     </w:rPr>
   </w:style>
-  <w:style w:type="paragraph" w:customStyle="1" w:styleId="56">
+  <w:style w:type="paragraph" w:customStyle="1" w:styleId="Subhead">
     <w:name w:val="Sub head"/>
-    <w:basedOn w:val="1"/>
-    <w:link w:val="57"/>
-    <w:qFormat/>
-    <w:uiPriority w:val="0"/>
+    <w:basedOn w:val="Normal"/>
+    <w:link w:val="SubheadChar"/>
+    <w:qFormat/>
     <w:pPr>
       <w:spacing w:line="360" w:lineRule="auto"/>
     </w:pPr>
@@ -4836,85 +4728,68 @@
       <w:b/>
       <w:color w:val="1F497D" w:themeColor="text2"/>
       <w:lang w:val="en-GB"/>
-      <w14:textFill>
-        <w14:solidFill>
-          <w14:schemeClr w14:val="tx2"/>
-        </w14:solidFill>
-      </w14:textFill>
     </w:rPr>
   </w:style>
-  <w:style w:type="character" w:customStyle="1" w:styleId="57">
+  <w:style w:type="character" w:customStyle="1" w:styleId="SubheadChar">
     <w:name w:val="Sub head Char"/>
-    <w:basedOn w:val="11"/>
-    <w:link w:val="56"/>
-    <w:qFormat/>
-    <w:uiPriority w:val="0"/>
+    <w:basedOn w:val="DefaultParagraphFont"/>
+    <w:link w:val="Subhead"/>
+    <w:qFormat/>
     <w:rPr>
       <w:rFonts w:asciiTheme="majorHAnsi" w:hAnsiTheme="majorHAnsi"/>
       <w:b/>
       <w:color w:val="1F497D" w:themeColor="text2"/>
       <w:sz w:val="24"/>
       <w:lang w:val="en-GB"/>
-      <w14:textFill>
-        <w14:solidFill>
-          <w14:schemeClr w14:val="tx2"/>
-        </w14:solidFill>
-      </w14:textFill>
     </w:rPr>
   </w:style>
-  <w:style w:type="paragraph" w:customStyle="1" w:styleId="58">
+  <w:style w:type="paragraph" w:customStyle="1" w:styleId="body">
     <w:name w:val="body"/>
-    <w:basedOn w:val="1"/>
-    <w:link w:val="59"/>
-    <w:qFormat/>
-    <w:uiPriority w:val="0"/>
+    <w:basedOn w:val="Normal"/>
+    <w:link w:val="bodyChar"/>
+    <w:qFormat/>
     <w:rPr>
       <w:rFonts w:asciiTheme="majorHAnsi" w:hAnsiTheme="majorHAnsi"/>
       <w:sz w:val="20"/>
       <w:lang w:val="de-DE"/>
     </w:rPr>
   </w:style>
-  <w:style w:type="character" w:customStyle="1" w:styleId="59">
+  <w:style w:type="character" w:customStyle="1" w:styleId="bodyChar">
     <w:name w:val="body Char"/>
-    <w:basedOn w:val="11"/>
-    <w:link w:val="58"/>
-    <w:qFormat/>
-    <w:uiPriority w:val="0"/>
+    <w:basedOn w:val="DefaultParagraphFont"/>
+    <w:link w:val="body"/>
+    <w:qFormat/>
     <w:rPr>
       <w:rFonts w:asciiTheme="majorHAnsi" w:hAnsiTheme="majorHAnsi"/>
       <w:lang w:val="de-DE"/>
     </w:rPr>
   </w:style>
-  <w:style w:type="character" w:customStyle="1" w:styleId="60">
+  <w:style w:type="character" w:customStyle="1" w:styleId="e24kjd">
     <w:name w:val="e24kjd"/>
-    <w:basedOn w:val="11"/>
-    <w:qFormat/>
-    <w:uiPriority w:val="0"/>
-  </w:style>
-  <w:style w:type="character" w:customStyle="1" w:styleId="61">
+    <w:basedOn w:val="DefaultParagraphFont"/>
+    <w:qFormat/>
+  </w:style>
+  <w:style w:type="character" w:customStyle="1" w:styleId="divdocumentleft-box">
     <w:name w:val="div_document_left-box"/>
-    <w:basedOn w:val="11"/>
-    <w:qFormat/>
-    <w:uiPriority w:val="0"/>
+    <w:basedOn w:val="DefaultParagraphFont"/>
+    <w:qFormat/>
     <w:rPr>
       <w:color w:val="FFFFFF"/>
       <w:shd w:val="clear" w:color="auto" w:fill="003D74"/>
     </w:rPr>
   </w:style>
-  <w:style w:type="character" w:customStyle="1" w:styleId="62">
+  <w:style w:type="character" w:customStyle="1" w:styleId="singlecolumnspanpaddedlinenth-child1">
     <w:name w:val="singlecolumn_span_paddedline_nth-child(1)"/>
-    <w:basedOn w:val="11"/>
-    <w:qFormat/>
-    <w:uiPriority w:val="0"/>
-  </w:style>
-  <w:style w:type="paragraph" w:customStyle="1" w:styleId="63">
+    <w:basedOn w:val="DefaultParagraphFont"/>
+    <w:qFormat/>
+  </w:style>
+  <w:style w:type="paragraph" w:customStyle="1" w:styleId="divdocumentli">
     <w:name w:val="div_document_li"/>
-    <w:basedOn w:val="1"/>
-    <w:qFormat/>
-    <w:uiPriority w:val="0"/>
+    <w:basedOn w:val="Normal"/>
+    <w:qFormat/>
     <w:pPr>
       <w:pBdr>
-        <w:left w:val="none" w:color="auto" w:sz="0" w:space="5"/>
+        <w:left w:val="none" w:sz="0" w:space="5" w:color="auto"/>
       </w:pBdr>
     </w:pPr>
     <w:rPr>
@@ -4922,40 +4797,36 @@
       <w:lang w:val="en-ZA" w:eastAsia="en-ZA"/>
     </w:rPr>
   </w:style>
-  <w:style w:type="character" w:customStyle="1" w:styleId="64">
+  <w:style w:type="character" w:customStyle="1" w:styleId="divdocumentright-box">
     <w:name w:val="div_document_right-box"/>
-    <w:basedOn w:val="11"/>
-    <w:qFormat/>
-    <w:uiPriority w:val="0"/>
+    <w:basedOn w:val="DefaultParagraphFont"/>
+    <w:qFormat/>
     <w:rPr>
       <w:color w:val="343434"/>
       <w:spacing w:val="4"/>
     </w:rPr>
   </w:style>
-  <w:style w:type="character" w:customStyle="1" w:styleId="65">
+  <w:style w:type="character" w:customStyle="1" w:styleId="divdocumentright-boxdatetablesinglecolumn">
     <w:name w:val="div_document_right-box_datetable_singlecolumn"/>
-    <w:basedOn w:val="11"/>
-    <w:qFormat/>
-    <w:uiPriority w:val="0"/>
-  </w:style>
-  <w:style w:type="character" w:customStyle="1" w:styleId="66">
+    <w:basedOn w:val="DefaultParagraphFont"/>
+    <w:qFormat/>
+  </w:style>
+  <w:style w:type="character" w:customStyle="1" w:styleId="BodyText2Char">
     <w:name w:val="Body Text 2 Char"/>
-    <w:basedOn w:val="11"/>
-    <w:link w:val="15"/>
+    <w:basedOn w:val="DefaultParagraphFont"/>
+    <w:link w:val="BodyText2"/>
     <w:semiHidden/>
     <w:qFormat/>
-    <w:uiPriority w:val="0"/>
     <w:rPr>
       <w:sz w:val="24"/>
     </w:rPr>
   </w:style>
-  <w:style w:type="character" w:customStyle="1" w:styleId="67">
+  <w:style w:type="character" w:customStyle="1" w:styleId="BodyTextIndent3Char">
     <w:name w:val="Body Text Indent 3 Char"/>
-    <w:basedOn w:val="11"/>
-    <w:link w:val="17"/>
+    <w:basedOn w:val="DefaultParagraphFont"/>
+    <w:link w:val="BodyTextIndent3"/>
     <w:semiHidden/>
     <w:qFormat/>
-    <w:uiPriority w:val="0"/>
     <w:rPr>
       <w:sz w:val="16"/>
       <w:szCs w:val="16"/>
@@ -4965,12 +4836,11 @@
 </file>
 
 <file path=word/glossary/document.xml><?xml version="1.0" encoding="utf-8"?>
-<w:glossaryDocument xmlns:wpc="http://schemas.microsoft.com/office/word/2010/wordprocessingCanvas" xmlns:cx="http://schemas.microsoft.com/office/drawing/2014/chartex" xmlns:cx1="http://schemas.microsoft.com/office/drawing/2015/9/8/chartex" xmlns:cx2="http://schemas.microsoft.com/office/drawing/2015/10/21/chartex" xmlns:cx3="http://schemas.microsoft.com/office/drawing/2016/5/9/chartex" xmlns:cx4="http://schemas.microsoft.com/office/drawing/2016/5/10/chartex" xmlns:cx5="http://schemas.microsoft.com/office/drawing/2016/5/11/chartex" xmlns:cx6="http://schemas.microsoft.com/office/drawing/2016/5/12/chartex" xmlns:cx7="http://schemas.microsoft.com/office/drawing/2016/5/13/chartex" xmlns:cx8="http://schemas.microsoft.com/office/drawing/2016/5/14/chartex" xmlns:mc="http://schemas.openxmlformats.org/markup-compatibility/2006" xmlns:o="urn:schemas-microsoft-com:office:office" xmlns:r="http://schemas.openxmlformats.org/officeDocument/2006/relationships" xmlns:m="http://schemas.openxmlformats.org/officeDocument/2006/math" xmlns:v="urn:schemas-microsoft-com:vml" xmlns:wp14="http://schemas.microsoft.com/office/word/2010/wordprocessingDrawing" xmlns:wp="http://schemas.openxmlformats.org/drawingml/2006/wordprocessingDrawing" xmlns:w="http://schemas.openxmlformats.org/wordprocessingml/2006/main" xmlns:w14="http://schemas.microsoft.com/office/word/2010/wordml" xmlns:w10="urn:schemas-microsoft-com:office:word" xmlns:w15="http://schemas.microsoft.com/office/word/2012/wordml" xmlns:wpg="http://schemas.microsoft.com/office/word/2010/wordprocessingGroup" xmlns:wpi="http://schemas.microsoft.com/office/word/2010/wordprocessingInk" xmlns:wne="http://schemas.microsoft.com/office/word/2006/wordml" xmlns:wps="http://schemas.microsoft.com/office/word/2010/wordprocessingShape" xmlns:wpsCustomData="http://www.wps.cn/officeDocument/2013/wpsCustomData" mc:Ignorable="w14 w15 wp14">
+<w:glossaryDocument xmlns:wpc="http://schemas.microsoft.com/office/word/2010/wordprocessingCanvas" xmlns:cx="http://schemas.microsoft.com/office/drawing/2014/chartex" xmlns:cx1="http://schemas.microsoft.com/office/drawing/2015/9/8/chartex" xmlns:cx2="http://schemas.microsoft.com/office/drawing/2015/10/21/chartex" xmlns:cx3="http://schemas.microsoft.com/office/drawing/2016/5/9/chartex" xmlns:cx4="http://schemas.microsoft.com/office/drawing/2016/5/10/chartex" xmlns:cx5="http://schemas.microsoft.com/office/drawing/2016/5/11/chartex" xmlns:cx6="http://schemas.microsoft.com/office/drawing/2016/5/12/chartex" xmlns:cx7="http://schemas.microsoft.com/office/drawing/2016/5/13/chartex" xmlns:cx8="http://schemas.microsoft.com/office/drawing/2016/5/14/chartex" xmlns:mc="http://schemas.openxmlformats.org/markup-compatibility/2006" xmlns:aink="http://schemas.microsoft.com/office/drawing/2016/ink" xmlns:am3d="http://schemas.microsoft.com/office/drawing/2017/model3d" xmlns:o="urn:schemas-microsoft-com:office:office" xmlns:oel="http://schemas.microsoft.com/office/2019/extlst" xmlns:r="http://schemas.openxmlformats.org/officeDocument/2006/relationships" xmlns:m="http://schemas.openxmlformats.org/officeDocument/2006/math" xmlns:v="urn:schemas-microsoft-com:vml" xmlns:wp14="http://schemas.microsoft.com/office/word/2010/wordprocessingDrawing" xmlns:wp="http://schemas.openxmlformats.org/drawingml/2006/wordprocessingDrawing" xmlns:w10="urn:schemas-microsoft-com:office:word" xmlns:w="http://schemas.openxmlformats.org/wordprocessingml/2006/main" xmlns:w14="http://schemas.microsoft.com/office/word/2010/wordml" xmlns:w15="http://schemas.microsoft.com/office/word/2012/wordml" xmlns:w16cei="http://schemas.microsoft.com/office/word/2026/wordml/cei" xmlns:w16cex="http://schemas.microsoft.com/office/word/2018/wordml/cex" xmlns:w16cid="http://schemas.microsoft.com/office/word/2016/wordml/cid" xmlns:w16="http://schemas.microsoft.com/office/word/2018/wordml" xmlns:w16du="http://schemas.microsoft.com/office/word/2023/wordml/word16du" xmlns:w16sdtdh="http://schemas.microsoft.com/office/word/2020/wordml/sdtdatahash" xmlns:w16sdtfl="http://schemas.microsoft.com/office/word/2024/wordml/sdtformatlock" xmlns:w16se="http://schemas.microsoft.com/office/word/2015/wordml/symex" xmlns:wpg="http://schemas.microsoft.com/office/word/2010/wordprocessingGroup" xmlns:wpi="http://schemas.microsoft.com/office/word/2010/wordprocessingInk" xmlns:wne="http://schemas.microsoft.com/office/word/2006/wordml" xmlns:wps="http://schemas.microsoft.com/office/word/2010/wordprocessingShape" mc:Ignorable="w14 w15 w16se w16cid w16 w16cex w16sdtdh w16sdtfl w16du wp14">
   <w:docParts>
     <w:docPart>
       <w:docPartPr>
         <w:name w:val="B55B6F5CFC0C45458A0A55B181F18B51"/>
-        <w:style w:val=""/>
         <w:category>
           <w:name w:val="General"/>
           <w:gallery w:val="placeholder"/>
@@ -4981,13 +4851,12 @@
         <w:behaviors>
           <w:behavior w:val="content"/>
         </w:behaviors>
-        <w:description w:val=""/>
         <w:guid w:val="{19C9499A-9064-4F6F-80D8-8CAD74FCBC4F}"/>
       </w:docPartPr>
       <w:docPartBody>
         <w:p>
           <w:pPr>
-            <w:pStyle w:val="4"/>
+            <w:pStyle w:val="B55B6F5CFC0C45458A0A55B181F18B51"/>
           </w:pPr>
           <w:r>
             <w:t>[Type here]</w:t>
@@ -5000,8 +4869,8 @@
 </file>
 
 <file path=word/glossary/endnotes.xml><?xml version="1.0" encoding="utf-8"?>
-<w:endnotes xmlns:wpc="http://schemas.microsoft.com/office/word/2010/wordprocessingCanvas" xmlns:mc="http://schemas.openxmlformats.org/markup-compatibility/2006" xmlns:o="urn:schemas-microsoft-com:office:office" xmlns:r="http://schemas.openxmlformats.org/officeDocument/2006/relationships" xmlns:m="http://schemas.openxmlformats.org/officeDocument/2006/math" xmlns:v="urn:schemas-microsoft-com:vml" xmlns:wp14="http://schemas.microsoft.com/office/word/2010/wordprocessingDrawing" xmlns:wp="http://schemas.openxmlformats.org/drawingml/2006/wordprocessingDrawing" xmlns:w="http://schemas.openxmlformats.org/wordprocessingml/2006/main" xmlns:w14="http://schemas.microsoft.com/office/word/2010/wordml" xmlns:w15="http://schemas.microsoft.com/office/word/2012/wordml" xmlns:w10="urn:schemas-microsoft-com:office:word" xmlns:wpg="http://schemas.microsoft.com/office/word/2010/wordprocessingGroup" xmlns:wpi="http://schemas.microsoft.com/office/word/2010/wordprocessingInk" xmlns:wne="http://schemas.microsoft.com/office/word/2006/wordml" xmlns:wps="http://schemas.microsoft.com/office/word/2010/wordprocessingShape" xmlns:wpsCustomData="http://www.wps.cn/officeDocument/2013/wpsCustomData" mc:Ignorable="w14 w15 wp14">
-  <w:endnote w:type="separator" w:id="0">
+<w:endnotes xmlns:wpc="http://schemas.microsoft.com/office/word/2010/wordprocessingCanvas" xmlns:cx="http://schemas.microsoft.com/office/drawing/2014/chartex" xmlns:cx1="http://schemas.microsoft.com/office/drawing/2015/9/8/chartex" xmlns:cx2="http://schemas.microsoft.com/office/drawing/2015/10/21/chartex" xmlns:cx3="http://schemas.microsoft.com/office/drawing/2016/5/9/chartex" xmlns:cx4="http://schemas.microsoft.com/office/drawing/2016/5/10/chartex" xmlns:cx5="http://schemas.microsoft.com/office/drawing/2016/5/11/chartex" xmlns:cx6="http://schemas.microsoft.com/office/drawing/2016/5/12/chartex" xmlns:cx7="http://schemas.microsoft.com/office/drawing/2016/5/13/chartex" xmlns:cx8="http://schemas.microsoft.com/office/drawing/2016/5/14/chartex" xmlns:mc="http://schemas.openxmlformats.org/markup-compatibility/2006" xmlns:aink="http://schemas.microsoft.com/office/drawing/2016/ink" xmlns:am3d="http://schemas.microsoft.com/office/drawing/2017/model3d" xmlns:o="urn:schemas-microsoft-com:office:office" xmlns:oel="http://schemas.microsoft.com/office/2019/extlst" xmlns:r="http://schemas.openxmlformats.org/officeDocument/2006/relationships" xmlns:m="http://schemas.openxmlformats.org/officeDocument/2006/math" xmlns:v="urn:schemas-microsoft-com:vml" xmlns:wp14="http://schemas.microsoft.com/office/word/2010/wordprocessingDrawing" xmlns:wp="http://schemas.openxmlformats.org/drawingml/2006/wordprocessingDrawing" xmlns:w10="urn:schemas-microsoft-com:office:word" xmlns:w="http://schemas.openxmlformats.org/wordprocessingml/2006/main" xmlns:w14="http://schemas.microsoft.com/office/word/2010/wordml" xmlns:w15="http://schemas.microsoft.com/office/word/2012/wordml" xmlns:w16cei="http://schemas.microsoft.com/office/word/2026/wordml/cei" xmlns:w16cex="http://schemas.microsoft.com/office/word/2018/wordml/cex" xmlns:w16cid="http://schemas.microsoft.com/office/word/2016/wordml/cid" xmlns:w16="http://schemas.microsoft.com/office/word/2018/wordml" xmlns:w16du="http://schemas.microsoft.com/office/word/2023/wordml/word16du" xmlns:w16sdtdh="http://schemas.microsoft.com/office/word/2020/wordml/sdtdatahash" xmlns:w16sdtfl="http://schemas.microsoft.com/office/word/2024/wordml/sdtformatlock" xmlns:w16se="http://schemas.microsoft.com/office/word/2015/wordml/symex" xmlns:wpg="http://schemas.microsoft.com/office/word/2010/wordprocessingGroup" xmlns:wpi="http://schemas.microsoft.com/office/word/2010/wordprocessingInk" xmlns:wne="http://schemas.microsoft.com/office/word/2006/wordml" xmlns:wps="http://schemas.microsoft.com/office/word/2010/wordprocessingShape" mc:Ignorable="w14 w15 w16se w16cid w16 w16cex w16sdtdh w16sdtfl w16du wp14">
+  <w:endnote w:type="separator" w:id="-1">
     <w:p>
       <w:pPr>
         <w:spacing w:line="240" w:lineRule="auto"/>
@@ -5011,7 +4880,7 @@
       </w:r>
     </w:p>
   </w:endnote>
-  <w:endnote w:type="continuationSeparator" w:id="1">
+  <w:endnote w:type="continuationSeparator" w:id="0">
     <w:p>
       <w:pPr>
         <w:spacing w:line="240" w:lineRule="auto"/>
@@ -5025,99 +4894,129 @@
 </file>
 
 <file path=word/glossary/fontTable.xml><?xml version="1.0" encoding="utf-8"?>
-<w:fonts xmlns:mc="http://schemas.openxmlformats.org/markup-compatibility/2006" xmlns:r="http://schemas.openxmlformats.org/officeDocument/2006/relationships" xmlns:w="http://schemas.openxmlformats.org/wordprocessingml/2006/main" xmlns:w14="http://schemas.microsoft.com/office/word/2010/wordml" mc:Ignorable="w14">
+<w:fonts xmlns:mc="http://schemas.openxmlformats.org/markup-compatibility/2006" xmlns:r="http://schemas.openxmlformats.org/officeDocument/2006/relationships" xmlns:w="http://schemas.openxmlformats.org/wordprocessingml/2006/main" xmlns:w14="http://schemas.microsoft.com/office/word/2010/wordml" xmlns:w15="http://schemas.microsoft.com/office/word/2012/wordml" xmlns:w16cex="http://schemas.microsoft.com/office/word/2018/wordml/cex" xmlns:w16cid="http://schemas.microsoft.com/office/word/2016/wordml/cid" xmlns:w16="http://schemas.microsoft.com/office/word/2018/wordml" xmlns:w16du="http://schemas.microsoft.com/office/word/2023/wordml/word16du" xmlns:w16sdtdh="http://schemas.microsoft.com/office/word/2020/wordml/sdtdatahash" xmlns:w16sdtfl="http://schemas.microsoft.com/office/word/2024/wordml/sdtformatlock" xmlns:w16se="http://schemas.microsoft.com/office/word/2015/wordml/symex" mc:Ignorable="w14 w15 w16se w16cid w16 w16cex w16sdtdh w16sdtfl w16du">
+  <w:font w:name="Symbol">
+    <w:panose1 w:val="05050102010706020507"/>
+    <w:charset w:val="02"/>
+    <w:family w:val="roman"/>
+    <w:pitch w:val="variable"/>
+    <w:sig w:usb0="00000000" w:usb1="10000000" w:usb2="00000000" w:usb3="00000000" w:csb0="80000000" w:csb1="00000000"/>
+  </w:font>
   <w:font w:name="Times New Roman">
     <w:panose1 w:val="02020603050405020304"/>
     <w:charset w:val="00"/>
     <w:family w:val="roman"/>
     <w:pitch w:val="variable"/>
-    <w:sig w:usb0="20007A87" w:usb1="80000000" w:usb2="00000008" w:usb3="00000000" w:csb0="000001FF" w:csb1="00000000"/>
+    <w:sig w:usb0="E0002EFF" w:usb1="C000785B" w:usb2="00000009" w:usb3="00000000" w:csb0="000001FF" w:csb1="00000000"/>
   </w:font>
-  <w:font w:name="宋体">
-    <w:altName w:val="SimSun"/>
+  <w:font w:name="Courier New">
+    <w:panose1 w:val="02070309020205020404"/>
+    <w:charset w:val="00"/>
+    <w:family w:val="modern"/>
+    <w:pitch w:val="fixed"/>
+    <w:sig w:usb0="E0002EFF" w:usb1="C0007843" w:usb2="00000009" w:usb3="00000000" w:csb0="000001FF" w:csb1="00000000"/>
+  </w:font>
+  <w:font w:name="Wingdings">
+    <w:panose1 w:val="05000000000000000000"/>
+    <w:charset w:val="02"/>
+    <w:family w:val="auto"/>
+    <w:pitch w:val="variable"/>
+    <w:sig w:usb0="00000000" w:usb1="10000000" w:usb2="00000000" w:usb3="00000000" w:csb0="80000000" w:csb1="00000000"/>
+  </w:font>
+  <w:font w:name="SimSun">
+    <w:altName w:val="宋体"/>
     <w:panose1 w:val="02010600030101010101"/>
     <w:charset w:val="86"/>
     <w:family w:val="auto"/>
     <w:pitch w:val="variable"/>
-    <w:sig w:usb0="00000003" w:usb1="080E0000" w:usb2="00000010" w:usb3="00000000" w:csb0="00040001" w:csb1="00000000"/>
+    <w:sig w:usb0="00000203" w:usb1="288F0000" w:usb2="00000016" w:usb3="00000000" w:csb0="00040001" w:csb1="00000000"/>
   </w:font>
-  <w:font w:name="SimSun">
-    <w:panose1 w:val="02010600030101010101"/>
-    <w:charset w:val="86"/>
-    <w:family w:val="auto"/>
+  <w:font w:name="Cambria">
+    <w:panose1 w:val="02040503050406030204"/>
+    <w:charset w:val="00"/>
+    <w:family w:val="roman"/>
+    <w:pitch w:val="variable"/>
+    <w:sig w:usb0="E00006FF" w:usb1="420024FF" w:usb2="02000000" w:usb3="00000000" w:csb0="0000019F" w:csb1="00000000"/>
+  </w:font>
+  <w:font w:name="Calibri">
+    <w:panose1 w:val="020F0502020204030204"/>
+    <w:charset w:val="00"/>
+    <w:family w:val="swiss"/>
+    <w:pitch w:val="variable"/>
+    <w:sig w:usb0="E4002EFF" w:usb1="C200247B" w:usb2="00000009" w:usb3="00000000" w:csb0="000001FF" w:csb1="00000000"/>
+  </w:font>
+  <w:font w:name="Tahoma">
+    <w:panose1 w:val="020B0604030504040204"/>
+    <w:charset w:val="00"/>
+    <w:family w:val="swiss"/>
     <w:pitch w:val="default"/>
-    <w:sig w:usb0="00000203" w:usb1="288F0000" w:usb2="00000006" w:usb3="00000000" w:csb0="00040001" w:csb1="00000000"/>
+    <w:sig w:usb0="E1002EFF" w:usb1="C000605B" w:usb2="00000029" w:usb3="00000000" w:csb0="200101FF" w:csb1="20280000"/>
+  </w:font>
+  <w:font w:name="Courier">
+    <w:panose1 w:val="02070409020205020404"/>
+    <w:charset w:val="00"/>
+    <w:family w:val="modern"/>
+    <w:pitch w:val="default"/>
+    <w:sig w:usb0="00000000" w:usb1="00000000" w:usb2="00000000" w:usb3="00000000" w:csb0="00000001" w:csb1="00000000"/>
   </w:font>
   <w:font w:name="Arial">
     <w:panose1 w:val="020B0604020202020204"/>
     <w:charset w:val="00"/>
     <w:family w:val="swiss"/>
-    <w:pitch w:val="default"/>
-    <w:sig w:usb0="E0002EFF" w:usb1="C000785B" w:usb2="00000009" w:usb3="00000000" w:csb0="400001FF" w:csb1="FFFF0000"/>
+    <w:pitch w:val="variable"/>
+    <w:sig w:usb0="E0002EFF" w:usb1="C000785B" w:usb2="00000009" w:usb3="00000000" w:csb0="000001FF" w:csb1="00000000"/>
   </w:font>
-  <w:font w:name="黑体">
-    <w:altName w:val="SimSun"/>
+  <w:font w:name="Garamond">
+    <w:panose1 w:val="02020404030301010803"/>
+    <w:charset w:val="00"/>
+    <w:family w:val="roman"/>
+    <w:pitch w:val="variable"/>
+    <w:sig w:usb0="00000287" w:usb1="00000000" w:usb2="00000000" w:usb3="00000000" w:csb0="0000009F" w:csb1="00000000"/>
+  </w:font>
+  <w:font w:name="Aptos">
+    <w:charset w:val="00"/>
+    <w:family w:val="swiss"/>
+    <w:pitch w:val="variable"/>
+    <w:sig w:usb0="20000287" w:usb1="00000003" w:usb2="00000000" w:usb3="00000000" w:csb0="0000019F" w:csb1="00000000"/>
+  </w:font>
+  <w:font w:name="DengXian">
     <w:panose1 w:val="02010600030101010101"/>
     <w:charset w:val="86"/>
     <w:family w:val="auto"/>
-    <w:pitch w:val="default"/>
-    <w:sig w:usb0="00000001" w:usb1="080E0000" w:usb2="00000010" w:usb3="00000000" w:csb0="00040000" w:csb1="00000000"/>
+    <w:pitch w:val="variable"/>
+    <w:sig w:usb0="A00002BF" w:usb1="38CF7CFA" w:usb2="00000016" w:usb3="00000000" w:csb0="0004000F" w:csb1="00000000"/>
   </w:font>
-  <w:font w:name="Courier New">
-    <w:panose1 w:val="02070309020205020404"/>
-    <w:charset w:val="00"/>
-    <w:family w:val="modern"/>
-    <w:pitch w:val="default"/>
-    <w:sig w:usb0="E0002EFF" w:usb1="C0007843" w:usb2="00000009" w:usb3="00000000" w:csb0="400001FF" w:csb1="FFFF0000"/>
+  <w:font w:name="DengXian Light">
+    <w:charset w:val="86"/>
+    <w:family w:val="auto"/>
+    <w:pitch w:val="variable"/>
+    <w:sig w:usb0="A00002BF" w:usb1="38CF7CFA" w:usb2="00000016" w:usb3="00000000" w:csb0="0004000F" w:csb1="00000000"/>
   </w:font>
-  <w:font w:name="Wingdings">
-    <w:panose1 w:val="05000000000000000000"/>
-    <w:charset w:val="02"/>
-    <w:family w:val="auto"/>
-    <w:pitch w:val="default"/>
-    <w:sig w:usb0="00000000" w:usb1="00000000" w:usb2="00000000" w:usb3="00000000" w:csb0="80000000" w:csb1="00000000"/>
-  </w:font>
-  <w:font w:name="Calibri">
-    <w:panose1 w:val="020F0502020204030204"/>
+  <w:font w:name="Aptos Display">
     <w:charset w:val="00"/>
     <w:family w:val="swiss"/>
-    <w:pitch w:val="default"/>
-    <w:sig w:usb0="E4002EFF" w:usb1="C200247B" w:usb2="00000009" w:usb3="00000000" w:csb0="200001FF" w:csb1="00000000"/>
-  </w:font>
-  <w:font w:name="等线">
-    <w:altName w:val="Microsoft YaHei"/>
-    <w:panose1 w:val="00000000000000000000"/>
-    <w:charset w:val="86"/>
-    <w:family w:val="auto"/>
-    <w:pitch w:val="default"/>
-    <w:sig w:usb0="00000000" w:usb1="00000000" w:usb2="00000000" w:usb3="00000000" w:csb0="00000000" w:csb1="00000000"/>
-  </w:font>
-  <w:font w:name="Microsoft YaHei">
-    <w:panose1 w:val="020B0503020204020204"/>
-    <w:charset w:val="86"/>
-    <w:family w:val="auto"/>
-    <w:pitch w:val="default"/>
-    <w:sig w:usb0="80000287" w:usb1="2ACF3C50" w:usb2="00000016" w:usb3="00000000" w:csb0="0004001F" w:csb1="00000000"/>
+    <w:pitch w:val="variable"/>
+    <w:sig w:usb0="20000287" w:usb1="00000003" w:usb2="00000000" w:usb3="00000000" w:csb0="0000019F" w:csb1="00000000"/>
   </w:font>
 </w:fonts>
 </file>
 
 <file path=word/glossary/footnotes.xml><?xml version="1.0" encoding="utf-8"?>
-<w:footnotes xmlns:wpc="http://schemas.microsoft.com/office/word/2010/wordprocessingCanvas" xmlns:mc="http://schemas.openxmlformats.org/markup-compatibility/2006" xmlns:o="urn:schemas-microsoft-com:office:office" xmlns:r="http://schemas.openxmlformats.org/officeDocument/2006/relationships" xmlns:m="http://schemas.openxmlformats.org/officeDocument/2006/math" xmlns:v="urn:schemas-microsoft-com:vml" xmlns:wp14="http://schemas.microsoft.com/office/word/2010/wordprocessingDrawing" xmlns:wp="http://schemas.openxmlformats.org/drawingml/2006/wordprocessingDrawing" xmlns:w="http://schemas.openxmlformats.org/wordprocessingml/2006/main" xmlns:w14="http://schemas.microsoft.com/office/word/2010/wordml" xmlns:w15="http://schemas.microsoft.com/office/word/2012/wordml" xmlns:w10="urn:schemas-microsoft-com:office:word" xmlns:wpg="http://schemas.microsoft.com/office/word/2010/wordprocessingGroup" xmlns:wpi="http://schemas.microsoft.com/office/word/2010/wordprocessingInk" xmlns:wne="http://schemas.microsoft.com/office/word/2006/wordml" xmlns:wps="http://schemas.microsoft.com/office/word/2010/wordprocessingShape" xmlns:wpsCustomData="http://www.wps.cn/officeDocument/2013/wpsCustomData" mc:Ignorable="w14 w15 wp14">
-  <w:footnote w:type="separator" w:id="0">
+<w:footnotes xmlns:wpc="http://schemas.microsoft.com/office/word/2010/wordprocessingCanvas" xmlns:cx="http://schemas.microsoft.com/office/drawing/2014/chartex" xmlns:cx1="http://schemas.microsoft.com/office/drawing/2015/9/8/chartex" xmlns:cx2="http://schemas.microsoft.com/office/drawing/2015/10/21/chartex" xmlns:cx3="http://schemas.microsoft.com/office/drawing/2016/5/9/chartex" xmlns:cx4="http://schemas.microsoft.com/office/drawing/2016/5/10/chartex" xmlns:cx5="http://schemas.microsoft.com/office/drawing/2016/5/11/chartex" xmlns:cx6="http://schemas.microsoft.com/office/drawing/2016/5/12/chartex" xmlns:cx7="http://schemas.microsoft.com/office/drawing/2016/5/13/chartex" xmlns:cx8="http://schemas.microsoft.com/office/drawing/2016/5/14/chartex" xmlns:mc="http://schemas.openxmlformats.org/markup-compatibility/2006" xmlns:aink="http://schemas.microsoft.com/office/drawing/2016/ink" xmlns:am3d="http://schemas.microsoft.com/office/drawing/2017/model3d" xmlns:o="urn:schemas-microsoft-com:office:office" xmlns:oel="http://schemas.microsoft.com/office/2019/extlst" xmlns:r="http://schemas.openxmlformats.org/officeDocument/2006/relationships" xmlns:m="http://schemas.openxmlformats.org/officeDocument/2006/math" xmlns:v="urn:schemas-microsoft-com:vml" xmlns:wp14="http://schemas.microsoft.com/office/word/2010/wordprocessingDrawing" xmlns:wp="http://schemas.openxmlformats.org/drawingml/2006/wordprocessingDrawing" xmlns:w10="urn:schemas-microsoft-com:office:word" xmlns:w="http://schemas.openxmlformats.org/wordprocessingml/2006/main" xmlns:w14="http://schemas.microsoft.com/office/word/2010/wordml" xmlns:w15="http://schemas.microsoft.com/office/word/2012/wordml" xmlns:w16cei="http://schemas.microsoft.com/office/word/2026/wordml/cei" xmlns:w16cex="http://schemas.microsoft.com/office/word/2018/wordml/cex" xmlns:w16cid="http://schemas.microsoft.com/office/word/2016/wordml/cid" xmlns:w16="http://schemas.microsoft.com/office/word/2018/wordml" xmlns:w16du="http://schemas.microsoft.com/office/word/2023/wordml/word16du" xmlns:w16sdtdh="http://schemas.microsoft.com/office/word/2020/wordml/sdtdatahash" xmlns:w16sdtfl="http://schemas.microsoft.com/office/word/2024/wordml/sdtformatlock" xmlns:w16se="http://schemas.microsoft.com/office/word/2015/wordml/symex" xmlns:wpg="http://schemas.microsoft.com/office/word/2010/wordprocessingGroup" xmlns:wpi="http://schemas.microsoft.com/office/word/2010/wordprocessingInk" xmlns:wne="http://schemas.microsoft.com/office/word/2006/wordml" xmlns:wps="http://schemas.microsoft.com/office/word/2010/wordprocessingShape" mc:Ignorable="w14 w15 w16se w16cid w16 w16cex w16sdtdh w16sdtfl w16du wp14">
+  <w:footnote w:type="separator" w:id="-1">
     <w:p>
       <w:pPr>
-        <w:spacing w:before="0" w:after="0" w:line="259" w:lineRule="auto"/>
+        <w:spacing w:after="0"/>
       </w:pPr>
       <w:r>
         <w:separator/>
       </w:r>
     </w:p>
   </w:footnote>
-  <w:footnote w:type="continuationSeparator" w:id="1">
+  <w:footnote w:type="continuationSeparator" w:id="0">
     <w:p>
       <w:pPr>
-        <w:spacing w:before="0" w:after="0" w:line="259" w:lineRule="auto"/>
+        <w:spacing w:after="0"/>
       </w:pPr>
       <w:r>
         <w:continuationSeparator/>
@@ -5128,19 +5027,25 @@
 </file>
 
 <file path=word/glossary/settings.xml><?xml version="1.0" encoding="utf-8"?>
-<w:settings xmlns:mc="http://schemas.openxmlformats.org/markup-compatibility/2006" xmlns:o="urn:schemas-microsoft-com:office:office" xmlns:r="http://schemas.openxmlformats.org/officeDocument/2006/relationships" xmlns:m="http://schemas.openxmlformats.org/officeDocument/2006/math" xmlns:v="urn:schemas-microsoft-com:vml" xmlns:w10="urn:schemas-microsoft-com:office:word" xmlns:w="http://schemas.openxmlformats.org/wordprocessingml/2006/main" xmlns:w14="http://schemas.microsoft.com/office/word/2010/wordml" xmlns:sl="http://schemas.openxmlformats.org/schemaLibrary/2006/main" xmlns:wpsCustomData="http://www.wps.cn/officeDocument/2013/wpsCustomData" mc:Ignorable="w14">
+<w:settings xmlns:mc="http://schemas.openxmlformats.org/markup-compatibility/2006" xmlns:o="urn:schemas-microsoft-com:office:office" xmlns:r="http://schemas.openxmlformats.org/officeDocument/2006/relationships" xmlns:m="http://schemas.openxmlformats.org/officeDocument/2006/math" xmlns:v="urn:schemas-microsoft-com:vml" xmlns:w10="urn:schemas-microsoft-com:office:word" xmlns:w="http://schemas.openxmlformats.org/wordprocessingml/2006/main" xmlns:w14="http://schemas.microsoft.com/office/word/2010/wordml" xmlns:w15="http://schemas.microsoft.com/office/word/2012/wordml" xmlns:w16cex="http://schemas.microsoft.com/office/word/2018/wordml/cex" xmlns:w16cid="http://schemas.microsoft.com/office/word/2016/wordml/cid" xmlns:w16="http://schemas.microsoft.com/office/word/2018/wordml" xmlns:w16du="http://schemas.microsoft.com/office/word/2023/wordml/word16du" xmlns:w16sdtdh="http://schemas.microsoft.com/office/word/2020/wordml/sdtdatahash" xmlns:w16sdtfl="http://schemas.microsoft.com/office/word/2024/wordml/sdtformatlock" xmlns:w16se="http://schemas.microsoft.com/office/word/2015/wordml/symex" xmlns:sl="http://schemas.openxmlformats.org/schemaLibrary/2006/main" mc:Ignorable="w14 w15 w16se w16cid w16 w16cex w16sdtdh w16sdtfl w16du">
   <w:defaultTabStop w:val="720"/>
   <w:characterSpacingControl w:val="doNotCompress"/>
   <w:footnotePr>
+    <w:footnote w:id="-1"/>
     <w:footnote w:id="0"/>
-    <w:footnote w:id="1"/>
   </w:footnotePr>
   <w:endnotePr>
+    <w:endnote w:id="-1"/>
     <w:endnote w:id="0"/>
-    <w:endnote w:id="1"/>
   </w:endnotePr>
   <w:compat>
+    <w:useFELayout/>
     <w:compatSetting w:name="compatibilityMode" w:uri="http://schemas.microsoft.com/office/word" w:val="15"/>
+    <w:compatSetting w:name="overrideTableStyleFontSizeAndJustification" w:uri="http://schemas.microsoft.com/office/word" w:val="1"/>
+    <w:compatSetting w:name="enableOpenTypeFeatures" w:uri="http://schemas.microsoft.com/office/word" w:val="1"/>
+    <w:compatSetting w:name="doNotFlipMirrorIndents" w:uri="http://schemas.microsoft.com/office/word" w:val="1"/>
+    <w:compatSetting w:name="differentiateMultirowTableHeaders" w:uri="http://schemas.microsoft.com/office/word" w:val="1"/>
+    <w:compatSetting w:name="useWord2013TrackBottomHyphenation" w:uri="http://schemas.microsoft.com/office/word" w:val="1"/>
   </w:compat>
   <w:rsids>
     <w:rsidRoot w:val="00C1682E"/>
@@ -5170,6 +5075,7 @@
     <w:rsid w:val="002F2F91"/>
     <w:rsid w:val="00311DF5"/>
     <w:rsid w:val="003625CF"/>
+    <w:rsid w:val="00365AE3"/>
     <w:rsid w:val="00367F6F"/>
     <w:rsid w:val="003762B2"/>
     <w:rsid w:val="003A7138"/>
@@ -5221,12 +5127,14 @@
     <w:rsid w:val="009A2787"/>
     <w:rsid w:val="009A452A"/>
     <w:rsid w:val="009B0BCE"/>
+    <w:rsid w:val="009C21B6"/>
     <w:rsid w:val="009F3E64"/>
     <w:rsid w:val="009F70BD"/>
     <w:rsid w:val="00A1597C"/>
     <w:rsid w:val="00A3597D"/>
     <w:rsid w:val="00A416CB"/>
     <w:rsid w:val="00A85A15"/>
+    <w:rsid w:val="00AD7790"/>
     <w:rsid w:val="00B00097"/>
     <w:rsid w:val="00B01F37"/>
     <w:rsid w:val="00B72624"/>
@@ -5272,52 +5180,423 @@
   </m:mathPr>
   <w:themeFontLang w:val="en-US" w:eastAsia="zh-CN"/>
   <w:clrSchemeMapping w:bg1="light1" w:t1="dark1" w:bg2="light2" w:t2="dark2" w:accent1="accent1" w:accent2="accent2" w:accent3="accent3" w:accent4="accent4" w:accent5="accent5" w:accent6="accent6" w:hyperlink="hyperlink" w:followedHyperlink="followedHyperlink"/>
+  <w:decimalSymbol w:val=","/>
+  <w:listSeparator w:val=","/>
 </w:settings>
 </file>
 
 <file path=word/glossary/styles.xml><?xml version="1.0" encoding="utf-8"?>
-<w:styles xmlns:mc="http://schemas.openxmlformats.org/markup-compatibility/2006" xmlns:o="urn:schemas-microsoft-com:office:office" xmlns:r="http://schemas.openxmlformats.org/officeDocument/2006/relationships" xmlns:m="http://schemas.openxmlformats.org/officeDocument/2006/math" xmlns:v="urn:schemas-microsoft-com:vml" xmlns:w="http://schemas.openxmlformats.org/wordprocessingml/2006/main" xmlns:w14="http://schemas.microsoft.com/office/word/2010/wordml" xmlns:w10="urn:schemas-microsoft-com:office:word" xmlns:sl="http://schemas.openxmlformats.org/schemaLibrary/2006/main" xmlns:wpsCustomData="http://www.wps.cn/officeDocument/2013/wpsCustomData" mc:Ignorable="w14">
+<w:styles xmlns:mc="http://schemas.openxmlformats.org/markup-compatibility/2006" xmlns:r="http://schemas.openxmlformats.org/officeDocument/2006/relationships" xmlns:w="http://schemas.openxmlformats.org/wordprocessingml/2006/main" xmlns:w14="http://schemas.microsoft.com/office/word/2010/wordml" xmlns:w15="http://schemas.microsoft.com/office/word/2012/wordml" xmlns:w16cex="http://schemas.microsoft.com/office/word/2018/wordml/cex" xmlns:w16cid="http://schemas.microsoft.com/office/word/2016/wordml/cid" xmlns:w16="http://schemas.microsoft.com/office/word/2018/wordml" xmlns:w16du="http://schemas.microsoft.com/office/word/2023/wordml/word16du" xmlns:w16sdtdh="http://schemas.microsoft.com/office/word/2020/wordml/sdtdatahash" xmlns:w16sdtfl="http://schemas.microsoft.com/office/word/2024/wordml/sdtformatlock" xmlns:w16se="http://schemas.microsoft.com/office/word/2015/wordml/symex" mc:Ignorable="w14 w15 w16se w16cid w16 w16cex w16sdtdh w16sdtfl w16du">
   <w:docDefaults>
     <w:rPrDefault>
       <w:rPr>
-        <w:rFonts w:asciiTheme="minorHAnsi" w:hAnsiTheme="minorHAnsi" w:eastAsiaTheme="minorEastAsia" w:cstheme="minorBidi"/>
+        <w:rFonts w:asciiTheme="minorHAnsi" w:eastAsiaTheme="minorEastAsia" w:hAnsiTheme="minorHAnsi" w:cstheme="minorBidi"/>
+        <w:lang w:val="en-ZA" w:eastAsia="en-ZA" w:bidi="ar-SA"/>
       </w:rPr>
     </w:rPrDefault>
     <w:pPrDefault/>
   </w:docDefaults>
-  <w:latentStyles w:count="260" w:defQFormat="0" w:defUnhideWhenUsed="1" w:defSemiHidden="1" w:defUIPriority="99" w:defLockedState="0">
-    <w:lsdException w:qFormat="1" w:unhideWhenUsed="0" w:uiPriority="0" w:semiHidden="0" w:name="Normal"/>
-    <w:lsdException w:qFormat="1" w:uiPriority="1" w:name="Default Paragraph Font"/>
-    <w:lsdException w:qFormat="1" w:uiPriority="99" w:name="Normal Table"/>
+  <w:latentStyles w:defLockedState="0" w:defUIPriority="99" w:defSemiHidden="0" w:defUnhideWhenUsed="0" w:defQFormat="0" w:count="376">
+    <w:lsdException w:name="Normal" w:uiPriority="0" w:qFormat="1"/>
+    <w:lsdException w:name="heading 1" w:semiHidden="1" w:unhideWhenUsed="1"/>
+    <w:lsdException w:name="heading 2" w:semiHidden="1" w:unhideWhenUsed="1"/>
+    <w:lsdException w:name="heading 3" w:semiHidden="1" w:unhideWhenUsed="1"/>
+    <w:lsdException w:name="heading 4" w:semiHidden="1" w:unhideWhenUsed="1"/>
+    <w:lsdException w:name="heading 5" w:semiHidden="1" w:unhideWhenUsed="1"/>
+    <w:lsdException w:name="heading 6" w:semiHidden="1" w:unhideWhenUsed="1"/>
+    <w:lsdException w:name="heading 7" w:semiHidden="1" w:unhideWhenUsed="1"/>
+    <w:lsdException w:name="heading 8" w:semiHidden="1" w:unhideWhenUsed="1"/>
+    <w:lsdException w:name="heading 9" w:semiHidden="1" w:unhideWhenUsed="1"/>
+    <w:lsdException w:name="index 1" w:semiHidden="1" w:unhideWhenUsed="1"/>
+    <w:lsdException w:name="index 2" w:semiHidden="1" w:unhideWhenUsed="1"/>
+    <w:lsdException w:name="index 3" w:semiHidden="1" w:unhideWhenUsed="1"/>
+    <w:lsdException w:name="index 4" w:semiHidden="1" w:unhideWhenUsed="1"/>
+    <w:lsdException w:name="index 5" w:semiHidden="1" w:unhideWhenUsed="1"/>
+    <w:lsdException w:name="index 6" w:semiHidden="1" w:unhideWhenUsed="1"/>
+    <w:lsdException w:name="index 7" w:semiHidden="1" w:unhideWhenUsed="1"/>
+    <w:lsdException w:name="index 8" w:semiHidden="1" w:unhideWhenUsed="1"/>
+    <w:lsdException w:name="index 9" w:semiHidden="1" w:unhideWhenUsed="1"/>
+    <w:lsdException w:name="toc 1" w:semiHidden="1" w:unhideWhenUsed="1"/>
+    <w:lsdException w:name="toc 2" w:semiHidden="1" w:unhideWhenUsed="1"/>
+    <w:lsdException w:name="toc 3" w:semiHidden="1" w:unhideWhenUsed="1"/>
+    <w:lsdException w:name="toc 4" w:semiHidden="1" w:unhideWhenUsed="1"/>
+    <w:lsdException w:name="toc 5" w:semiHidden="1" w:unhideWhenUsed="1"/>
+    <w:lsdException w:name="toc 6" w:semiHidden="1" w:unhideWhenUsed="1"/>
+    <w:lsdException w:name="toc 7" w:semiHidden="1" w:unhideWhenUsed="1"/>
+    <w:lsdException w:name="toc 8" w:semiHidden="1" w:unhideWhenUsed="1"/>
+    <w:lsdException w:name="toc 9" w:semiHidden="1" w:unhideWhenUsed="1"/>
+    <w:lsdException w:name="Normal Indent" w:semiHidden="1" w:unhideWhenUsed="1"/>
+    <w:lsdException w:name="footnote text" w:semiHidden="1" w:unhideWhenUsed="1"/>
+    <w:lsdException w:name="annotation text" w:semiHidden="1" w:unhideWhenUsed="1"/>
+    <w:lsdException w:name="header" w:semiHidden="1" w:unhideWhenUsed="1"/>
+    <w:lsdException w:name="footer" w:semiHidden="1" w:unhideWhenUsed="1"/>
+    <w:lsdException w:name="index heading" w:semiHidden="1" w:unhideWhenUsed="1"/>
+    <w:lsdException w:name="caption" w:semiHidden="1" w:unhideWhenUsed="1"/>
+    <w:lsdException w:name="table of figures" w:semiHidden="1" w:unhideWhenUsed="1"/>
+    <w:lsdException w:name="envelope address" w:semiHidden="1" w:unhideWhenUsed="1"/>
+    <w:lsdException w:name="envelope return" w:semiHidden="1" w:unhideWhenUsed="1"/>
+    <w:lsdException w:name="footnote reference" w:semiHidden="1" w:unhideWhenUsed="1"/>
+    <w:lsdException w:name="annotation reference" w:semiHidden="1" w:unhideWhenUsed="1"/>
+    <w:lsdException w:name="line number" w:semiHidden="1" w:unhideWhenUsed="1"/>
+    <w:lsdException w:name="page number" w:semiHidden="1" w:unhideWhenUsed="1"/>
+    <w:lsdException w:name="endnote reference" w:semiHidden="1" w:unhideWhenUsed="1"/>
+    <w:lsdException w:name="endnote text" w:semiHidden="1" w:unhideWhenUsed="1"/>
+    <w:lsdException w:name="table of authorities" w:semiHidden="1" w:unhideWhenUsed="1"/>
+    <w:lsdException w:name="macro" w:semiHidden="1" w:unhideWhenUsed="1"/>
+    <w:lsdException w:name="toa heading" w:semiHidden="1" w:unhideWhenUsed="1"/>
+    <w:lsdException w:name="List" w:semiHidden="1" w:unhideWhenUsed="1"/>
+    <w:lsdException w:name="List Bullet" w:semiHidden="1" w:unhideWhenUsed="1"/>
+    <w:lsdException w:name="List Number" w:semiHidden="1" w:unhideWhenUsed="1"/>
+    <w:lsdException w:name="List 2" w:semiHidden="1" w:unhideWhenUsed="1"/>
+    <w:lsdException w:name="List 3" w:semiHidden="1" w:unhideWhenUsed="1"/>
+    <w:lsdException w:name="List 4" w:semiHidden="1" w:unhideWhenUsed="1"/>
+    <w:lsdException w:name="List 5" w:semiHidden="1" w:unhideWhenUsed="1"/>
+    <w:lsdException w:name="List Bullet 2" w:semiHidden="1" w:unhideWhenUsed="1"/>
+    <w:lsdException w:name="List Bullet 3" w:semiHidden="1" w:unhideWhenUsed="1"/>
+    <w:lsdException w:name="List Bullet 4" w:semiHidden="1" w:unhideWhenUsed="1"/>
+    <w:lsdException w:name="List Bullet 5" w:semiHidden="1" w:unhideWhenUsed="1"/>
+    <w:lsdException w:name="List Number 2" w:semiHidden="1" w:unhideWhenUsed="1"/>
+    <w:lsdException w:name="List Number 3" w:semiHidden="1" w:unhideWhenUsed="1"/>
+    <w:lsdException w:name="List Number 4" w:semiHidden="1" w:unhideWhenUsed="1"/>
+    <w:lsdException w:name="List Number 5" w:semiHidden="1" w:unhideWhenUsed="1"/>
+    <w:lsdException w:name="Title" w:semiHidden="1" w:unhideWhenUsed="1"/>
+    <w:lsdException w:name="Closing" w:semiHidden="1" w:unhideWhenUsed="1"/>
+    <w:lsdException w:name="Signature" w:semiHidden="1" w:unhideWhenUsed="1"/>
+    <w:lsdException w:name="Default Paragraph Font" w:semiHidden="1" w:uiPriority="1" w:unhideWhenUsed="1" w:qFormat="1"/>
+    <w:lsdException w:name="Body Text" w:semiHidden="1" w:unhideWhenUsed="1"/>
+    <w:lsdException w:name="Body Text Indent" w:semiHidden="1" w:unhideWhenUsed="1"/>
+    <w:lsdException w:name="List Continue" w:semiHidden="1" w:unhideWhenUsed="1"/>
+    <w:lsdException w:name="List Continue 2" w:semiHidden="1" w:unhideWhenUsed="1"/>
+    <w:lsdException w:name="List Continue 3" w:semiHidden="1" w:unhideWhenUsed="1"/>
+    <w:lsdException w:name="List Continue 4" w:semiHidden="1" w:unhideWhenUsed="1"/>
+    <w:lsdException w:name="List Continue 5" w:semiHidden="1" w:unhideWhenUsed="1"/>
+    <w:lsdException w:name="Message Header" w:semiHidden="1" w:unhideWhenUsed="1"/>
+    <w:lsdException w:name="Subtitle" w:semiHidden="1" w:unhideWhenUsed="1"/>
+    <w:lsdException w:name="Salutation" w:semiHidden="1" w:unhideWhenUsed="1"/>
+    <w:lsdException w:name="Date" w:semiHidden="1" w:unhideWhenUsed="1"/>
+    <w:lsdException w:name="Body Text First Indent" w:semiHidden="1" w:unhideWhenUsed="1"/>
+    <w:lsdException w:name="Body Text First Indent 2" w:semiHidden="1" w:unhideWhenUsed="1"/>
+    <w:lsdException w:name="Note Heading" w:semiHidden="1" w:unhideWhenUsed="1"/>
+    <w:lsdException w:name="Body Text 2" w:semiHidden="1" w:unhideWhenUsed="1"/>
+    <w:lsdException w:name="Body Text 3" w:semiHidden="1" w:unhideWhenUsed="1"/>
+    <w:lsdException w:name="Body Text Indent 2" w:semiHidden="1" w:unhideWhenUsed="1"/>
+    <w:lsdException w:name="Body Text Indent 3" w:semiHidden="1" w:unhideWhenUsed="1"/>
+    <w:lsdException w:name="Block Text" w:semiHidden="1" w:unhideWhenUsed="1"/>
+    <w:lsdException w:name="Hyperlink" w:semiHidden="1" w:unhideWhenUsed="1"/>
+    <w:lsdException w:name="FollowedHyperlink" w:semiHidden="1" w:unhideWhenUsed="1"/>
+    <w:lsdException w:name="Strong" w:semiHidden="1" w:unhideWhenUsed="1"/>
+    <w:lsdException w:name="Emphasis" w:semiHidden="1" w:unhideWhenUsed="1"/>
+    <w:lsdException w:name="Document Map" w:semiHidden="1" w:unhideWhenUsed="1"/>
+    <w:lsdException w:name="Plain Text" w:semiHidden="1" w:unhideWhenUsed="1"/>
+    <w:lsdException w:name="E-mail Signature" w:semiHidden="1" w:unhideWhenUsed="1"/>
+    <w:lsdException w:name="HTML Top of Form" w:semiHidden="1" w:unhideWhenUsed="1"/>
+    <w:lsdException w:name="HTML Bottom of Form" w:semiHidden="1" w:unhideWhenUsed="1"/>
+    <w:lsdException w:name="Normal (Web)" w:semiHidden="1" w:unhideWhenUsed="1"/>
+    <w:lsdException w:name="HTML Acronym" w:semiHidden="1" w:unhideWhenUsed="1"/>
+    <w:lsdException w:name="HTML Address" w:semiHidden="1" w:unhideWhenUsed="1"/>
+    <w:lsdException w:name="HTML Cite" w:semiHidden="1" w:unhideWhenUsed="1"/>
+    <w:lsdException w:name="HTML Code" w:semiHidden="1" w:unhideWhenUsed="1"/>
+    <w:lsdException w:name="HTML Definition" w:semiHidden="1" w:unhideWhenUsed="1"/>
+    <w:lsdException w:name="HTML Keyboard" w:semiHidden="1" w:unhideWhenUsed="1"/>
+    <w:lsdException w:name="HTML Preformatted" w:semiHidden="1" w:unhideWhenUsed="1"/>
+    <w:lsdException w:name="HTML Sample" w:semiHidden="1" w:unhideWhenUsed="1"/>
+    <w:lsdException w:name="HTML Typewriter" w:semiHidden="1" w:unhideWhenUsed="1"/>
+    <w:lsdException w:name="HTML Variable" w:semiHidden="1" w:unhideWhenUsed="1"/>
+    <w:lsdException w:name="Normal Table" w:semiHidden="1" w:unhideWhenUsed="1" w:qFormat="1"/>
+    <w:lsdException w:name="annotation subject" w:semiHidden="1" w:unhideWhenUsed="1"/>
+    <w:lsdException w:name="No List" w:semiHidden="1" w:unhideWhenUsed="1"/>
+    <w:lsdException w:name="Outline List 1" w:semiHidden="1" w:unhideWhenUsed="1"/>
+    <w:lsdException w:name="Outline List 2" w:semiHidden="1" w:unhideWhenUsed="1"/>
+    <w:lsdException w:name="Outline List 3" w:semiHidden="1" w:unhideWhenUsed="1"/>
+    <w:lsdException w:name="Table Simple 1" w:semiHidden="1" w:unhideWhenUsed="1"/>
+    <w:lsdException w:name="Table Simple 2" w:semiHidden="1" w:unhideWhenUsed="1"/>
+    <w:lsdException w:name="Table Simple 3" w:semiHidden="1" w:unhideWhenUsed="1"/>
+    <w:lsdException w:name="Table Classic 1" w:semiHidden="1" w:unhideWhenUsed="1"/>
+    <w:lsdException w:name="Table Classic 2" w:semiHidden="1" w:unhideWhenUsed="1"/>
+    <w:lsdException w:name="Table Classic 3" w:semiHidden="1" w:unhideWhenUsed="1"/>
+    <w:lsdException w:name="Table Classic 4" w:semiHidden="1" w:unhideWhenUsed="1"/>
+    <w:lsdException w:name="Table Colorful 1" w:semiHidden="1" w:unhideWhenUsed="1"/>
+    <w:lsdException w:name="Table Colorful 2" w:semiHidden="1" w:unhideWhenUsed="1"/>
+    <w:lsdException w:name="Table Colorful 3" w:semiHidden="1" w:unhideWhenUsed="1"/>
+    <w:lsdException w:name="Table Columns 1" w:semiHidden="1" w:unhideWhenUsed="1"/>
+    <w:lsdException w:name="Table Columns 2" w:semiHidden="1" w:unhideWhenUsed="1"/>
+    <w:lsdException w:name="Table Columns 3" w:semiHidden="1" w:unhideWhenUsed="1"/>
+    <w:lsdException w:name="Table Columns 4" w:semiHidden="1" w:unhideWhenUsed="1"/>
+    <w:lsdException w:name="Table Columns 5" w:semiHidden="1" w:unhideWhenUsed="1"/>
+    <w:lsdException w:name="Table Grid 1" w:semiHidden="1" w:unhideWhenUsed="1"/>
+    <w:lsdException w:name="Table Grid 2" w:semiHidden="1" w:unhideWhenUsed="1"/>
+    <w:lsdException w:name="Table Grid 3" w:semiHidden="1" w:unhideWhenUsed="1"/>
+    <w:lsdException w:name="Table Grid 4" w:semiHidden="1" w:unhideWhenUsed="1"/>
+    <w:lsdException w:name="Table Grid 5" w:semiHidden="1" w:unhideWhenUsed="1"/>
+    <w:lsdException w:name="Table Grid 6" w:semiHidden="1" w:unhideWhenUsed="1"/>
+    <w:lsdException w:name="Table Grid 7" w:semiHidden="1" w:unhideWhenUsed="1"/>
+    <w:lsdException w:name="Table Grid 8" w:semiHidden="1" w:unhideWhenUsed="1"/>
+    <w:lsdException w:name="Table List 1" w:semiHidden="1" w:unhideWhenUsed="1"/>
+    <w:lsdException w:name="Table List 2" w:semiHidden="1" w:unhideWhenUsed="1"/>
+    <w:lsdException w:name="Table List 3" w:semiHidden="1" w:unhideWhenUsed="1"/>
+    <w:lsdException w:name="Table List 4" w:semiHidden="1" w:unhideWhenUsed="1"/>
+    <w:lsdException w:name="Table List 5" w:semiHidden="1" w:unhideWhenUsed="1"/>
+    <w:lsdException w:name="Table List 6" w:semiHidden="1" w:unhideWhenUsed="1"/>
+    <w:lsdException w:name="Table List 7" w:semiHidden="1" w:unhideWhenUsed="1"/>
+    <w:lsdException w:name="Table List 8" w:semiHidden="1" w:unhideWhenUsed="1"/>
+    <w:lsdException w:name="Table 3D effects 1" w:semiHidden="1" w:unhideWhenUsed="1"/>
+    <w:lsdException w:name="Table 3D effects 2" w:semiHidden="1" w:unhideWhenUsed="1"/>
+    <w:lsdException w:name="Table 3D effects 3" w:semiHidden="1" w:unhideWhenUsed="1"/>
+    <w:lsdException w:name="Table Contemporary" w:semiHidden="1" w:unhideWhenUsed="1"/>
+    <w:lsdException w:name="Table Elegant" w:semiHidden="1" w:unhideWhenUsed="1"/>
+    <w:lsdException w:name="Table Professional" w:semiHidden="1" w:unhideWhenUsed="1"/>
+    <w:lsdException w:name="Table Subtle 1" w:semiHidden="1" w:unhideWhenUsed="1"/>
+    <w:lsdException w:name="Table Subtle 2" w:semiHidden="1" w:unhideWhenUsed="1"/>
+    <w:lsdException w:name="Table Web 1" w:semiHidden="1" w:unhideWhenUsed="1"/>
+    <w:lsdException w:name="Table Web 2" w:semiHidden="1" w:unhideWhenUsed="1"/>
+    <w:lsdException w:name="Table Web 3" w:semiHidden="1" w:unhideWhenUsed="1"/>
+    <w:lsdException w:name="Balloon Text" w:semiHidden="1" w:unhideWhenUsed="1"/>
+    <w:lsdException w:name="Table Theme" w:semiHidden="1" w:unhideWhenUsed="1"/>
+    <w:lsdException w:name="Placeholder Text" w:semiHidden="1" w:unhideWhenUsed="1"/>
+    <w:lsdException w:name="No Spacing" w:semiHidden="1" w:unhideWhenUsed="1"/>
+    <w:lsdException w:name="Light Shading"/>
+    <w:lsdException w:name="Light List"/>
+    <w:lsdException w:name="Light Grid"/>
+    <w:lsdException w:name="Medium Shading 1"/>
+    <w:lsdException w:name="Medium Shading 2"/>
+    <w:lsdException w:name="Medium List 1"/>
+    <w:lsdException w:name="Medium List 2"/>
+    <w:lsdException w:name="Medium Grid 1"/>
+    <w:lsdException w:name="Medium Grid 2"/>
+    <w:lsdException w:name="Medium Grid 3"/>
+    <w:lsdException w:name="Dark List"/>
+    <w:lsdException w:name="Colorful Shading"/>
+    <w:lsdException w:name="Colorful List"/>
+    <w:lsdException w:name="Colorful Grid"/>
+    <w:lsdException w:name="Light Shading Accent 1"/>
+    <w:lsdException w:name="Light List Accent 1"/>
+    <w:lsdException w:name="Light Grid Accent 1"/>
+    <w:lsdException w:name="Medium Shading 1 Accent 1"/>
+    <w:lsdException w:name="Medium Shading 2 Accent 1"/>
+    <w:lsdException w:name="Medium List 1 Accent 1"/>
+    <w:lsdException w:name="Revision" w:semiHidden="1" w:unhideWhenUsed="1"/>
+    <w:lsdException w:name="List Paragraph" w:semiHidden="1" w:unhideWhenUsed="1"/>
+    <w:lsdException w:name="Quote" w:semiHidden="1" w:unhideWhenUsed="1"/>
+    <w:lsdException w:name="Intense Quote" w:semiHidden="1" w:unhideWhenUsed="1"/>
+    <w:lsdException w:name="Medium List 2 Accent 1"/>
+    <w:lsdException w:name="Medium Grid 1 Accent 1"/>
+    <w:lsdException w:name="Medium Grid 2 Accent 1"/>
+    <w:lsdException w:name="Medium Grid 3 Accent 1"/>
+    <w:lsdException w:name="Dark List Accent 1"/>
+    <w:lsdException w:name="Colorful Shading Accent 1"/>
+    <w:lsdException w:name="Colorful List Accent 1"/>
+    <w:lsdException w:name="Colorful Grid Accent 1"/>
+    <w:lsdException w:name="Light Shading Accent 2"/>
+    <w:lsdException w:name="Light List Accent 2"/>
+    <w:lsdException w:name="Light Grid Accent 2"/>
+    <w:lsdException w:name="Medium Shading 1 Accent 2"/>
+    <w:lsdException w:name="Medium Shading 2 Accent 2"/>
+    <w:lsdException w:name="Medium List 1 Accent 2"/>
+    <w:lsdException w:name="Medium List 2 Accent 2"/>
+    <w:lsdException w:name="Medium Grid 1 Accent 2"/>
+    <w:lsdException w:name="Medium Grid 2 Accent 2"/>
+    <w:lsdException w:name="Medium Grid 3 Accent 2"/>
+    <w:lsdException w:name="Dark List Accent 2"/>
+    <w:lsdException w:name="Colorful Shading Accent 2"/>
+    <w:lsdException w:name="Colorful List Accent 2"/>
+    <w:lsdException w:name="Colorful Grid Accent 2"/>
+    <w:lsdException w:name="Light Shading Accent 3"/>
+    <w:lsdException w:name="Light List Accent 3"/>
+    <w:lsdException w:name="Light Grid Accent 3"/>
+    <w:lsdException w:name="Medium Shading 1 Accent 3"/>
+    <w:lsdException w:name="Medium Shading 2 Accent 3"/>
+    <w:lsdException w:name="Medium List 1 Accent 3"/>
+    <w:lsdException w:name="Medium List 2 Accent 3"/>
+    <w:lsdException w:name="Medium Grid 1 Accent 3"/>
+    <w:lsdException w:name="Medium Grid 2 Accent 3"/>
+    <w:lsdException w:name="Medium Grid 3 Accent 3"/>
+    <w:lsdException w:name="Dark List Accent 3"/>
+    <w:lsdException w:name="Colorful Shading Accent 3"/>
+    <w:lsdException w:name="Colorful List Accent 3"/>
+    <w:lsdException w:name="Colorful Grid Accent 3"/>
+    <w:lsdException w:name="Light Shading Accent 4"/>
+    <w:lsdException w:name="Light List Accent 4"/>
+    <w:lsdException w:name="Light Grid Accent 4"/>
+    <w:lsdException w:name="Medium Shading 1 Accent 4"/>
+    <w:lsdException w:name="Medium Shading 2 Accent 4"/>
+    <w:lsdException w:name="Medium List 1 Accent 4"/>
+    <w:lsdException w:name="Medium List 2 Accent 4"/>
+    <w:lsdException w:name="Medium Grid 1 Accent 4"/>
+    <w:lsdException w:name="Medium Grid 2 Accent 4"/>
+    <w:lsdException w:name="Medium Grid 3 Accent 4"/>
+    <w:lsdException w:name="Dark List Accent 4"/>
+    <w:lsdException w:name="Colorful Shading Accent 4"/>
+    <w:lsdException w:name="Colorful List Accent 4"/>
+    <w:lsdException w:name="Colorful Grid Accent 4"/>
+    <w:lsdException w:name="Light Shading Accent 5"/>
+    <w:lsdException w:name="Light List Accent 5"/>
+    <w:lsdException w:name="Light Grid Accent 5"/>
+    <w:lsdException w:name="Medium Shading 1 Accent 5"/>
+    <w:lsdException w:name="Medium Shading 2 Accent 5"/>
+    <w:lsdException w:name="Medium List 1 Accent 5"/>
+    <w:lsdException w:name="Medium List 2 Accent 5"/>
+    <w:lsdException w:name="Medium Grid 1 Accent 5"/>
+    <w:lsdException w:name="Medium Grid 2 Accent 5"/>
+    <w:lsdException w:name="Medium Grid 3 Accent 5"/>
+    <w:lsdException w:name="Dark List Accent 5"/>
+    <w:lsdException w:name="Colorful Shading Accent 5"/>
+    <w:lsdException w:name="Colorful List Accent 5"/>
+    <w:lsdException w:name="Colorful Grid Accent 5"/>
+    <w:lsdException w:name="Light Shading Accent 6"/>
+    <w:lsdException w:name="Light List Accent 6"/>
+    <w:lsdException w:name="Light Grid Accent 6"/>
+    <w:lsdException w:name="Medium Shading 1 Accent 6"/>
+    <w:lsdException w:name="Medium Shading 2 Accent 6"/>
+    <w:lsdException w:name="Medium List 1 Accent 6"/>
+    <w:lsdException w:name="Medium List 2 Accent 6"/>
+    <w:lsdException w:name="Medium Grid 1 Accent 6"/>
+    <w:lsdException w:name="Medium Grid 2 Accent 6"/>
+    <w:lsdException w:name="Medium Grid 3 Accent 6"/>
+    <w:lsdException w:name="Dark List Accent 6"/>
+    <w:lsdException w:name="Colorful Shading Accent 6"/>
+    <w:lsdException w:name="Colorful List Accent 6"/>
+    <w:lsdException w:name="Colorful Grid Accent 6"/>
+    <w:lsdException w:name="Subtle Emphasis" w:uiPriority="19" w:qFormat="1"/>
+    <w:lsdException w:name="Intense Emphasis" w:uiPriority="21" w:qFormat="1"/>
+    <w:lsdException w:name="Subtle Reference" w:uiPriority="31" w:qFormat="1"/>
+    <w:lsdException w:name="Intense Reference" w:uiPriority="32" w:qFormat="1"/>
+    <w:lsdException w:name="Book Title" w:uiPriority="33" w:qFormat="1"/>
+    <w:lsdException w:name="Bibliography" w:semiHidden="1" w:uiPriority="37" w:unhideWhenUsed="1"/>
+    <w:lsdException w:name="TOC Heading" w:semiHidden="1" w:uiPriority="39" w:unhideWhenUsed="1" w:qFormat="1"/>
+    <w:lsdException w:name="Plain Table 1" w:uiPriority="41"/>
+    <w:lsdException w:name="Plain Table 2" w:uiPriority="42"/>
+    <w:lsdException w:name="Plain Table 3" w:uiPriority="43"/>
+    <w:lsdException w:name="Plain Table 4" w:uiPriority="44"/>
+    <w:lsdException w:name="Plain Table 5" w:uiPriority="45"/>
+    <w:lsdException w:name="Grid Table Light" w:uiPriority="40"/>
+    <w:lsdException w:name="Grid Table 1 Light" w:uiPriority="46"/>
+    <w:lsdException w:name="Grid Table 2" w:uiPriority="47"/>
+    <w:lsdException w:name="Grid Table 3" w:uiPriority="48"/>
+    <w:lsdException w:name="Grid Table 4" w:uiPriority="49"/>
+    <w:lsdException w:name="Grid Table 5 Dark" w:uiPriority="50"/>
+    <w:lsdException w:name="Grid Table 6 Colorful" w:uiPriority="51"/>
+    <w:lsdException w:name="Grid Table 7 Colorful" w:uiPriority="52"/>
+    <w:lsdException w:name="Grid Table 1 Light Accent 1" w:uiPriority="46"/>
+    <w:lsdException w:name="Grid Table 2 Accent 1" w:uiPriority="47"/>
+    <w:lsdException w:name="Grid Table 3 Accent 1" w:uiPriority="48"/>
+    <w:lsdException w:name="Grid Table 4 Accent 1" w:uiPriority="49"/>
+    <w:lsdException w:name="Grid Table 5 Dark Accent 1" w:uiPriority="50"/>
+    <w:lsdException w:name="Grid Table 6 Colorful Accent 1" w:uiPriority="51"/>
+    <w:lsdException w:name="Grid Table 7 Colorful Accent 1" w:uiPriority="52"/>
+    <w:lsdException w:name="Grid Table 1 Light Accent 2" w:uiPriority="46"/>
+    <w:lsdException w:name="Grid Table 2 Accent 2" w:uiPriority="47"/>
+    <w:lsdException w:name="Grid Table 3 Accent 2" w:uiPriority="48"/>
+    <w:lsdException w:name="Grid Table 4 Accent 2" w:uiPriority="49"/>
+    <w:lsdException w:name="Grid Table 5 Dark Accent 2" w:uiPriority="50"/>
+    <w:lsdException w:name="Grid Table 6 Colorful Accent 2" w:uiPriority="51"/>
+    <w:lsdException w:name="Grid Table 7 Colorful Accent 2" w:uiPriority="52"/>
+    <w:lsdException w:name="Grid Table 1 Light Accent 3" w:uiPriority="46"/>
+    <w:lsdException w:name="Grid Table 2 Accent 3" w:uiPriority="47"/>
+    <w:lsdException w:name="Grid Table 3 Accent 3" w:uiPriority="48"/>
+    <w:lsdException w:name="Grid Table 4 Accent 3" w:uiPriority="49"/>
+    <w:lsdException w:name="Grid Table 5 Dark Accent 3" w:uiPriority="50"/>
+    <w:lsdException w:name="Grid Table 6 Colorful Accent 3" w:uiPriority="51"/>
+    <w:lsdException w:name="Grid Table 7 Colorful Accent 3" w:uiPriority="52"/>
+    <w:lsdException w:name="Grid Table 1 Light Accent 4" w:uiPriority="46"/>
+    <w:lsdException w:name="Grid Table 2 Accent 4" w:uiPriority="47"/>
+    <w:lsdException w:name="Grid Table 3 Accent 4" w:uiPriority="48"/>
+    <w:lsdException w:name="Grid Table 4 Accent 4" w:uiPriority="49"/>
+    <w:lsdException w:name="Grid Table 5 Dark Accent 4" w:uiPriority="50"/>
+    <w:lsdException w:name="Grid Table 6 Colorful Accent 4" w:uiPriority="51"/>
+    <w:lsdException w:name="Grid Table 7 Colorful Accent 4" w:uiPriority="52"/>
+    <w:lsdException w:name="Grid Table 1 Light Accent 5" w:uiPriority="46"/>
+    <w:lsdException w:name="Grid Table 2 Accent 5" w:uiPriority="47"/>
+    <w:lsdException w:name="Grid Table 3 Accent 5" w:uiPriority="48"/>
+    <w:lsdException w:name="Grid Table 4 Accent 5" w:uiPriority="49"/>
+    <w:lsdException w:name="Grid Table 5 Dark Accent 5" w:uiPriority="50"/>
+    <w:lsdException w:name="Grid Table 6 Colorful Accent 5" w:uiPriority="51"/>
+    <w:lsdException w:name="Grid Table 7 Colorful Accent 5" w:uiPriority="52"/>
+    <w:lsdException w:name="Grid Table 1 Light Accent 6" w:uiPriority="46"/>
+    <w:lsdException w:name="Grid Table 2 Accent 6" w:uiPriority="47"/>
+    <w:lsdException w:name="Grid Table 3 Accent 6" w:uiPriority="48"/>
+    <w:lsdException w:name="Grid Table 4 Accent 6" w:uiPriority="49"/>
+    <w:lsdException w:name="Grid Table 5 Dark Accent 6" w:uiPriority="50"/>
+    <w:lsdException w:name="Grid Table 6 Colorful Accent 6" w:uiPriority="51"/>
+    <w:lsdException w:name="Grid Table 7 Colorful Accent 6" w:uiPriority="52"/>
+    <w:lsdException w:name="List Table 1 Light" w:uiPriority="46"/>
+    <w:lsdException w:name="List Table 2" w:uiPriority="47"/>
+    <w:lsdException w:name="List Table 3" w:uiPriority="48"/>
+    <w:lsdException w:name="List Table 4" w:uiPriority="49"/>
+    <w:lsdException w:name="List Table 5 Dark" w:uiPriority="50"/>
+    <w:lsdException w:name="List Table 6 Colorful" w:uiPriority="51"/>
+    <w:lsdException w:name="List Table 7 Colorful" w:uiPriority="52"/>
+    <w:lsdException w:name="List Table 1 Light Accent 1" w:uiPriority="46"/>
+    <w:lsdException w:name="List Table 2 Accent 1" w:uiPriority="47"/>
+    <w:lsdException w:name="List Table 3 Accent 1" w:uiPriority="48"/>
+    <w:lsdException w:name="List Table 4 Accent 1" w:uiPriority="49"/>
+    <w:lsdException w:name="List Table 5 Dark Accent 1" w:uiPriority="50"/>
+    <w:lsdException w:name="List Table 6 Colorful Accent 1" w:uiPriority="51"/>
+    <w:lsdException w:name="List Table 7 Colorful Accent 1" w:uiPriority="52"/>
+    <w:lsdException w:name="List Table 1 Light Accent 2" w:uiPriority="46"/>
+    <w:lsdException w:name="List Table 2 Accent 2" w:uiPriority="47"/>
+    <w:lsdException w:name="List Table 3 Accent 2" w:uiPriority="48"/>
+    <w:lsdException w:name="List Table 4 Accent 2" w:uiPriority="49"/>
+    <w:lsdException w:name="List Table 5 Dark Accent 2" w:uiPriority="50"/>
+    <w:lsdException w:name="List Table 6 Colorful Accent 2" w:uiPriority="51"/>
+    <w:lsdException w:name="List Table 7 Colorful Accent 2" w:uiPriority="52"/>
+    <w:lsdException w:name="List Table 1 Light Accent 3" w:uiPriority="46"/>
+    <w:lsdException w:name="List Table 2 Accent 3" w:uiPriority="47"/>
+    <w:lsdException w:name="List Table 3 Accent 3" w:uiPriority="48"/>
+    <w:lsdException w:name="List Table 4 Accent 3" w:uiPriority="49"/>
+    <w:lsdException w:name="List Table 5 Dark Accent 3" w:uiPriority="50"/>
+    <w:lsdException w:name="List Table 6 Colorful Accent 3" w:uiPriority="51"/>
+    <w:lsdException w:name="List Table 7 Colorful Accent 3" w:uiPriority="52"/>
+    <w:lsdException w:name="List Table 1 Light Accent 4" w:uiPriority="46"/>
+    <w:lsdException w:name="List Table 2 Accent 4" w:uiPriority="47"/>
+    <w:lsdException w:name="List Table 3 Accent 4" w:uiPriority="48"/>
+    <w:lsdException w:name="List Table 4 Accent 4" w:uiPriority="49"/>
+    <w:lsdException w:name="List Table 5 Dark Accent 4" w:uiPriority="50"/>
+    <w:lsdException w:name="List Table 6 Colorful Accent 4" w:uiPriority="51"/>
+    <w:lsdException w:name="List Table 7 Colorful Accent 4" w:uiPriority="52"/>
+    <w:lsdException w:name="List Table 1 Light Accent 5" w:uiPriority="46"/>
+    <w:lsdException w:name="List Table 2 Accent 5" w:uiPriority="47"/>
+    <w:lsdException w:name="List Table 3 Accent 5" w:uiPriority="48"/>
+    <w:lsdException w:name="List Table 4 Accent 5" w:uiPriority="49"/>
+    <w:lsdException w:name="List Table 5 Dark Accent 5" w:uiPriority="50"/>
+    <w:lsdException w:name="List Table 6 Colorful Accent 5" w:uiPriority="51"/>
+    <w:lsdException w:name="List Table 7 Colorful Accent 5" w:uiPriority="52"/>
+    <w:lsdException w:name="List Table 1 Light Accent 6" w:uiPriority="46"/>
+    <w:lsdException w:name="List Table 2 Accent 6" w:uiPriority="47"/>
+    <w:lsdException w:name="List Table 3 Accent 6" w:uiPriority="48"/>
+    <w:lsdException w:name="List Table 4 Accent 6" w:uiPriority="49"/>
+    <w:lsdException w:name="List Table 5 Dark Accent 6" w:uiPriority="50"/>
+    <w:lsdException w:name="List Table 6 Colorful Accent 6" w:uiPriority="51"/>
+    <w:lsdException w:name="List Table 7 Colorful Accent 6" w:uiPriority="52"/>
+    <w:lsdException w:name="Mention" w:semiHidden="1" w:unhideWhenUsed="1"/>
+    <w:lsdException w:name="Smart Hyperlink" w:semiHidden="1" w:unhideWhenUsed="1"/>
+    <w:lsdException w:name="Hashtag" w:semiHidden="1" w:unhideWhenUsed="1"/>
+    <w:lsdException w:name="Unresolved Mention" w:semiHidden="1" w:unhideWhenUsed="1"/>
+    <w:lsdException w:name="Smart Link" w:semiHidden="1" w:unhideWhenUsed="1"/>
   </w:latentStyles>
-  <w:style w:type="paragraph" w:default="1" w:styleId="1">
+  <w:style w:type="paragraph" w:default="1" w:styleId="Normal">
     <w:name w:val="Normal"/>
     <w:qFormat/>
-    <w:uiPriority w:val="0"/>
     <w:pPr>
       <w:spacing w:after="160" w:line="259" w:lineRule="auto"/>
     </w:pPr>
     <w:rPr>
-      <w:rFonts w:asciiTheme="minorHAnsi" w:hAnsiTheme="minorHAnsi" w:eastAsiaTheme="minorEastAsia" w:cstheme="minorBidi"/>
       <w:sz w:val="22"/>
       <w:szCs w:val="22"/>
-      <w:lang w:val="en-ZA" w:eastAsia="en-ZA" w:bidi="ar-SA"/>
     </w:rPr>
   </w:style>
-  <w:style w:type="character" w:default="1" w:styleId="2">
+  <w:style w:type="character" w:default="1" w:styleId="DefaultParagraphFont">
     <w:name w:val="Default Paragraph Font"/>
+    <w:uiPriority w:val="1"/>
     <w:semiHidden/>
     <w:unhideWhenUsed/>
-    <w:qFormat/>
-    <w:uiPriority w:val="1"/>
-  </w:style>
-  <w:style w:type="table" w:default="1" w:styleId="3">
+  </w:style>
+  <w:style w:type="table" w:default="1" w:styleId="TableNormal">
     <w:name w:val="Normal Table"/>
+    <w:uiPriority w:val="99"/>
     <w:semiHidden/>
     <w:unhideWhenUsed/>
-    <w:qFormat/>
-    <w:uiPriority w:val="99"/>
     <w:tblPr>
+      <w:tblInd w:w="0" w:type="dxa"/>
       <w:tblCellMar>
         <w:top w:w="0" w:type="dxa"/>
         <w:left w:w="108" w:type="dxa"/>
@@ -5326,21 +5605,28 @@
       </w:tblCellMar>
     </w:tblPr>
   </w:style>
-  <w:style w:type="paragraph" w:customStyle="1" w:styleId="4">
+  <w:style w:type="numbering" w:default="1" w:styleId="NoList">
+    <w:name w:val="No List"/>
+    <w:uiPriority w:val="99"/>
+    <w:semiHidden/>
+    <w:unhideWhenUsed/>
+  </w:style>
+  <w:style w:type="paragraph" w:customStyle="1" w:styleId="B55B6F5CFC0C45458A0A55B181F18B51">
     <w:name w:val="B55B6F5CFC0C45458A0A55B181F18B51"/>
     <w:qFormat/>
-    <w:uiPriority w:val="0"/>
     <w:pPr>
       <w:spacing w:after="160" w:line="259" w:lineRule="auto"/>
     </w:pPr>
     <w:rPr>
-      <w:rFonts w:asciiTheme="minorHAnsi" w:hAnsiTheme="minorHAnsi" w:eastAsiaTheme="minorEastAsia" w:cstheme="minorBidi"/>
       <w:sz w:val="22"/>
       <w:szCs w:val="22"/>
-      <w:lang w:val="en-ZA" w:eastAsia="en-ZA" w:bidi="ar-SA"/>
     </w:rPr>
   </w:style>
 </w:styles>
+</file>
+
+<file path=word/glossary/webSettings.xml><?xml version="1.0" encoding="utf-8"?>
+<w:webSettings xmlns:mc="http://schemas.openxmlformats.org/markup-compatibility/2006" xmlns:r="http://schemas.openxmlformats.org/officeDocument/2006/relationships" xmlns:w="http://schemas.openxmlformats.org/wordprocessingml/2006/main" xmlns:w14="http://schemas.microsoft.com/office/word/2010/wordml" xmlns:w15="http://schemas.microsoft.com/office/word/2012/wordml" xmlns:w16cex="http://schemas.microsoft.com/office/word/2018/wordml/cex" xmlns:w16cid="http://schemas.microsoft.com/office/word/2016/wordml/cid" xmlns:w16="http://schemas.microsoft.com/office/word/2018/wordml" xmlns:w16du="http://schemas.microsoft.com/office/word/2023/wordml/word16du" xmlns:w16sdtdh="http://schemas.microsoft.com/office/word/2020/wordml/sdtdatahash" xmlns:w16sdtfl="http://schemas.microsoft.com/office/word/2024/wordml/sdtformatlock" xmlns:w16se="http://schemas.microsoft.com/office/word/2015/wordml/symex" mc:Ignorable="w14 w15 w16se w16cid w16 w16cex w16sdtdh w16sdtfl w16du"/>
 </file>
 
 <file path=word/theme/theme1.xml><?xml version="1.0" encoding="utf-8"?>
@@ -5622,23 +5908,11 @@
     </a:fmtScheme>
   </a:themeElements>
   <a:objectDefaults/>
+  <a:extraClrSchemeLst/>
 </a:theme>
 </file>
 
 <file path=customXml/item1.xml><?xml version="1.0" encoding="utf-8"?>
-<s:customData xmlns="http://www.wps.cn/officeDocument/2013/wpsCustomData" xmlns:s="http://www.wps.cn/officeDocument/2013/wpsCustomData">
-  <customSectProps/>
-  <customShpExts>
-    <customShpInfo spid="_x0000_s1026" textRotate="1"/>
-  </customShpExts>
-</s:customData>
-</file>
-
-<file path=customXml/item2.xml><?xml version="1.0" encoding="utf-8"?>
-<b:Sources xmlns:b="http://schemas.openxmlformats.org/officeDocument/2006/bibliography" xmlns="http://schemas.openxmlformats.org/officeDocument/2006/bibliography" SelectedStyle="\APASixthEditionOfficeOnline.xsl" StyleName="APA" Version="6"/>
-</file>
-
-<file path=customXml/item3.xml><?xml version="1.0" encoding="utf-8"?>
 <ct:contentTypeSchema xmlns:ct="http://schemas.microsoft.com/office/2006/metadata/contentType" xmlns:ma="http://schemas.microsoft.com/office/2006/metadata/properties/metaAttributes" ct:_="" ma:_="" ma:contentTypeName="Document" ma:contentTypeID="0x0101004ABD8CA2A7629F4AABE885A504C13D2A" ma:contentTypeVersion="0" ma:contentTypeDescription="Create a new document." ma:contentTypeScope="" ma:versionID="2ee14a1a2a0efe6e313d29fab6d96ab0">
   <xsd:schema xmlns:xsd="http://www.w3.org/2001/XMLSchema" xmlns:xs="http://www.w3.org/2001/XMLSchema" xmlns:p="http://schemas.microsoft.com/office/2006/metadata/properties" targetNamespace="http://schemas.microsoft.com/office/2006/metadata/properties" ma:root="true" ma:fieldsID="c64490b4aec6201516c3a874156f37b2">
     <xsd:element name="properties">
@@ -5752,7 +6026,26 @@
 </ct:contentTypeSchema>
 </file>
 
+<file path=customXml/item2.xml><?xml version="1.0" encoding="utf-8"?>
+<b:Sources xmlns:b="http://schemas.openxmlformats.org/officeDocument/2006/bibliography" xmlns="http://schemas.openxmlformats.org/officeDocument/2006/bibliography" SelectedStyle="\APASixthEditionOfficeOnline.xsl" StyleName="APA" Version="6"/>
+</file>
+
+<file path=customXml/item3.xml><?xml version="1.0" encoding="utf-8"?>
+<p:properties xmlns:p="http://schemas.microsoft.com/office/2006/metadata/properties" xmlns:xsi="http://www.w3.org/2001/XMLSchema-instance" xmlns:pc="http://schemas.microsoft.com/office/infopath/2007/PartnerControls">
+  <documentManagement/>
+</p:properties>
+</file>
+
 <file path=customXml/item4.xml><?xml version="1.0" encoding="utf-8"?>
+<s:customData xmlns="http://www.wps.cn/officeDocument/2013/wpsCustomData" xmlns:s="http://www.wps.cn/officeDocument/2013/wpsCustomData">
+  <customSectProps/>
+  <customShpExts>
+    <customShpInfo spid="_x0000_s1026" textRotate="1"/>
+  </customShpExts>
+</s:customData>
+</file>
+
+<file path=customXml/item5.xml><?xml version="1.0" encoding="utf-8"?>
 <?mso-contentType ?>
 <FormTemplates xmlns="http://schemas.microsoft.com/sharepoint/v3/contenttype/forms">
   <Display>DocumentLibraryForm</Display>
@@ -5761,13 +6054,40 @@
 </FormTemplates>
 </file>
 
-<file path=customXml/item5.xml><?xml version="1.0" encoding="utf-8"?>
-<p:properties xmlns:p="http://schemas.microsoft.com/office/2006/metadata/properties" xmlns:xsi="http://www.w3.org/2001/XMLSchema-instance" xmlns:pc="http://schemas.microsoft.com/office/infopath/2007/PartnerControls">
-  <documentManagement/>
-</p:properties>
+<file path=customXml/itemProps1.xml><?xml version="1.0" encoding="utf-8"?>
+<ds:datastoreItem xmlns:ds="http://schemas.openxmlformats.org/officeDocument/2006/customXml" ds:itemID="{56B15A16-955E-497A-844B-A4D7F73DFE23}">
+  <ds:schemaRefs>
+    <ds:schemaRef ds:uri="http://schemas.microsoft.com/office/2006/metadata/contentType"/>
+    <ds:schemaRef ds:uri="http://schemas.microsoft.com/office/2006/metadata/properties/metaAttributes"/>
+    <ds:schemaRef ds:uri="http://www.w3.org/2001/XMLSchema"/>
+    <ds:schemaRef ds:uri="http://schemas.microsoft.com/office/2006/metadata/properties"/>
+    <ds:schemaRef ds:uri="http://schemas.openxmlformats.org/package/2006/metadata/core-properties"/>
+    <ds:schemaRef ds:uri="http://purl.org/dc/elements/1.1/"/>
+    <ds:schemaRef ds:uri="http://purl.org/dc/terms/"/>
+    <ds:schemaRef ds:uri="http://schemas.microsoft.com/internal/obd"/>
+    <ds:schemaRef ds:uri="http://schemas.microsoft.com/office/infopath/2007/PartnerControls"/>
+  </ds:schemaRefs>
+</ds:datastoreItem>
 </file>
 
-<file path=customXml/itemProps1.xml><?xml version="1.0" encoding="utf-8"?>
+<file path=customXml/itemProps2.xml><?xml version="1.0" encoding="utf-8"?>
+<ds:datastoreItem xmlns:ds="http://schemas.openxmlformats.org/officeDocument/2006/customXml" ds:itemID="{96BA48D7-2345-4EB5-ADF8-8DC2C145BD41}">
+  <ds:schemaRefs>
+    <ds:schemaRef ds:uri="http://schemas.openxmlformats.org/officeDocument/2006/bibliography"/>
+  </ds:schemaRefs>
+</ds:datastoreItem>
+</file>
+
+<file path=customXml/itemProps3.xml><?xml version="1.0" encoding="utf-8"?>
+<ds:datastoreItem xmlns:ds="http://schemas.openxmlformats.org/officeDocument/2006/customXml" ds:itemID="{C95BE3CC-062C-4A69-942E-4E590213A216}">
+  <ds:schemaRefs>
+    <ds:schemaRef ds:uri="http://schemas.microsoft.com/office/2006/metadata/properties"/>
+    <ds:schemaRef ds:uri="http://schemas.microsoft.com/office/infopath/2007/PartnerControls"/>
+  </ds:schemaRefs>
+</ds:datastoreItem>
+</file>
+
+<file path=customXml/itemProps4.xml><?xml version="1.0" encoding="utf-8"?>
 <ds:datastoreItem xmlns:ds="http://schemas.openxmlformats.org/officeDocument/2006/customXml" ds:itemID="{B1977F7D-205B-4081-913C-38D41E755F92}">
   <ds:schemaRefs>
     <ds:schemaRef ds:uri="http://www.wps.cn/officeDocument/2013/wpsCustomData"/>
@@ -5775,26 +6095,10 @@
 </ds:datastoreItem>
 </file>
 
-<file path=customXml/itemProps2.xml><?xml version="1.0" encoding="utf-8"?>
-<ds:datastoreItem xmlns:ds="http://schemas.openxmlformats.org/officeDocument/2006/customXml" ds:itemID="{96BA48D7-2345-4EB5-ADF8-8DC2C145BD41}">
-  <ds:schemaRefs/>
-</ds:datastoreItem>
-</file>
-
-<file path=customXml/itemProps3.xml><?xml version="1.0" encoding="utf-8"?>
-<ds:datastoreItem xmlns:ds="http://schemas.openxmlformats.org/officeDocument/2006/customXml" ds:itemID="{56B15A16-955E-497A-844B-A4D7F73DFE23}">
-  <ds:schemaRefs/>
-</ds:datastoreItem>
-</file>
-
-<file path=customXml/itemProps4.xml><?xml version="1.0" encoding="utf-8"?>
+<file path=customXml/itemProps5.xml><?xml version="1.0" encoding="utf-8"?>
 <ds:datastoreItem xmlns:ds="http://schemas.openxmlformats.org/officeDocument/2006/customXml" ds:itemID="{42C116F8-3839-44AD-A6E6-F37A0FD89E6C}">
-  <ds:schemaRefs/>
-</ds:datastoreItem>
-</file>
-
-<file path=customXml/itemProps5.xml><?xml version="1.0" encoding="utf-8"?>
-<ds:datastoreItem xmlns:ds="http://schemas.openxmlformats.org/officeDocument/2006/customXml" ds:itemID="{C95BE3CC-062C-4A69-942E-4E590213A216}">
-  <ds:schemaRefs/>
+  <ds:schemaRefs>
+    <ds:schemaRef ds:uri="http://schemas.microsoft.com/sharepoint/v3/contenttype/forms"/>
+  </ds:schemaRefs>
 </ds:datastoreItem>
 </file>
</xml_diff>